<commit_message>
cargue de documentos en pdf
</commit_message>
<xml_diff>
--- a/documents/HU01/GU.HU1.UC1.docx
+++ b/documents/HU01/GU.HU1.UC1.docx
@@ -4,13 +4,13 @@
   <w:body>
     <w:p>
       <w:pPr>
-        <w:pStyle w:val="Heading2"/>
-        <w:ind w:left="0" w:firstLine="0"/>
+        <w:pStyle w:val="Ttulo2"/>
+        <w:ind w:left="0"/>
         <w:rPr>
           <w:color w:val="auto"/>
         </w:rPr>
       </w:pPr>
-      <w:bookmarkStart w:name="_hh93rzmqjzt6" w:id="0"/>
+      <w:bookmarkStart w:id="0" w:name="_hh93rzmqjzt6"/>
       <w:bookmarkEnd w:id="0"/>
       <w:r>
         <w:rPr>
@@ -36,12 +36,12 @@
         <w:tblW w:w="9810" w:type="dxa"/>
         <w:tblInd w:w="-540" w:type="dxa"/>
         <w:tblBorders>
-          <w:top w:val="single" w:color="000000" w:sz="6" w:space="0"/>
-          <w:left w:val="single" w:color="000000" w:sz="6" w:space="0"/>
-          <w:bottom w:val="single" w:color="000000" w:sz="6" w:space="0"/>
-          <w:right w:val="single" w:color="000000" w:sz="6" w:space="0"/>
-          <w:insideH w:val="single" w:color="000000" w:sz="6" w:space="0"/>
-          <w:insideV w:val="single" w:color="000000" w:sz="6" w:space="0"/>
+          <w:top w:val="single" w:sz="6" w:space="0" w:color="000000"/>
+          <w:left w:val="single" w:sz="6" w:space="0" w:color="000000"/>
+          <w:bottom w:val="single" w:sz="6" w:space="0" w:color="000000"/>
+          <w:right w:val="single" w:sz="6" w:space="0" w:color="000000"/>
+          <w:insideH w:val="single" w:sz="6" w:space="0" w:color="000000"/>
+          <w:insideV w:val="single" w:sz="6" w:space="0" w:color="000000"/>
         </w:tblBorders>
         <w:tblLayout w:type="fixed"/>
         <w:tblLook w:val="0000" w:firstRow="0" w:lastRow="0" w:firstColumn="0" w:lastColumn="0" w:noHBand="0" w:noVBand="0"/>
@@ -58,7 +58,6 @@
             <w:tcW w:w="9810" w:type="dxa"/>
             <w:gridSpan w:val="4"/>
             <w:shd w:val="clear" w:color="auto" w:fill="D9D9D9" w:themeFill="background1" w:themeFillShade="D9"/>
-            <w:tcMar/>
           </w:tcPr>
           <w:p>
             <w:pPr>
@@ -97,7 +96,6 @@
           <w:tcPr>
             <w:tcW w:w="2250" w:type="dxa"/>
             <w:shd w:val="clear" w:color="auto" w:fill="D9D9D9" w:themeFill="background1" w:themeFillShade="D9"/>
-            <w:tcMar/>
           </w:tcPr>
           <w:p>
             <w:pPr>
@@ -107,7 +105,7 @@
                 <w:bCs/>
               </w:rPr>
             </w:pPr>
-            <w:bookmarkStart w:name="_86bshax6i96l" w:id="1"/>
+            <w:bookmarkStart w:id="1" w:name="_86bshax6i96l"/>
             <w:bookmarkEnd w:id="1"/>
             <w:r>
               <w:rPr>
@@ -122,7 +120,6 @@
           <w:tcPr>
             <w:tcW w:w="7560" w:type="dxa"/>
             <w:gridSpan w:val="3"/>
-            <w:tcMar/>
           </w:tcPr>
           <w:p>
             <w:r>
@@ -136,7 +133,6 @@
           <w:tcPr>
             <w:tcW w:w="2250" w:type="dxa"/>
             <w:shd w:val="clear" w:color="auto" w:fill="D9D9D9" w:themeFill="background1" w:themeFillShade="D9"/>
-            <w:tcMar/>
           </w:tcPr>
           <w:p>
             <w:pPr>
@@ -158,14 +154,12 @@
         <w:tc>
           <w:tcPr>
             <w:tcW w:w="3780" w:type="dxa"/>
-            <w:tcMar/>
           </w:tcPr>
           <w:p>
             <w:pPr>
               <w:spacing w:before="240" w:after="240"/>
             </w:pPr>
             <w:r>
-              <w:rPr/>
               <w:t>Publicar datos a intermediario de mensajería</w:t>
             </w:r>
           </w:p>
@@ -174,7 +168,6 @@
           <w:tcPr>
             <w:tcW w:w="1530" w:type="dxa"/>
             <w:shd w:val="clear" w:color="auto" w:fill="D9D9D9" w:themeFill="background1" w:themeFillShade="D9"/>
-            <w:tcMar/>
           </w:tcPr>
           <w:p>
             <w:pPr>
@@ -196,7 +189,6 @@
         <w:tc>
           <w:tcPr>
             <w:tcW w:w="2250" w:type="dxa"/>
-            <w:tcMar/>
           </w:tcPr>
           <w:p/>
         </w:tc>
@@ -209,7 +201,6 @@
           <w:tcPr>
             <w:tcW w:w="2250" w:type="dxa"/>
             <w:shd w:val="clear" w:color="auto" w:fill="D9D9D9" w:themeFill="background1" w:themeFillShade="D9"/>
-            <w:tcMar/>
           </w:tcPr>
           <w:p>
             <w:pPr>
@@ -232,20 +223,18 @@
           <w:tcPr>
             <w:tcW w:w="7560" w:type="dxa"/>
             <w:gridSpan w:val="3"/>
-            <w:tcMar/>
           </w:tcPr>
           <w:p>
             <w:pPr>
               <w:pBdr>
-                <w:top w:val="nil" w:color="FF000000" w:sz="0" w:space="0"/>
-                <w:left w:val="nil" w:color="FF000000" w:sz="0" w:space="0"/>
-                <w:bottom w:val="nil" w:color="FF000000" w:sz="0" w:space="0"/>
-                <w:right w:val="nil" w:color="FF000000" w:sz="0" w:space="0"/>
-                <w:between w:val="nil" w:color="FF000000" w:sz="0" w:space="0"/>
+                <w:top w:val="nil"/>
+                <w:left w:val="nil"/>
+                <w:bottom w:val="nil"/>
+                <w:right w:val="nil"/>
+                <w:between w:val="nil"/>
               </w:pBdr>
             </w:pPr>
             <w:r>
-              <w:rPr/>
               <w:t>Permitir que un cliente publicador envíe mensajes con información hacia el intermediario de mensajería, garantizando la entrega exitosa antes de continuar con el proceso</w:t>
             </w:r>
           </w:p>
@@ -256,7 +245,6 @@
           <w:tcPr>
             <w:tcW w:w="2250" w:type="dxa"/>
             <w:shd w:val="clear" w:color="auto" w:fill="D9D9D9" w:themeFill="background1" w:themeFillShade="D9"/>
-            <w:tcMar/>
           </w:tcPr>
           <w:p>
             <w:pPr>
@@ -278,7 +266,6 @@
         <w:tc>
           <w:tcPr>
             <w:tcW w:w="3780" w:type="dxa"/>
-            <w:tcMar/>
           </w:tcPr>
           <w:p>
             <w:pPr>
@@ -293,7 +280,6 @@
           <w:tcPr>
             <w:tcW w:w="1530" w:type="dxa"/>
             <w:shd w:val="clear" w:color="auto" w:fill="D9D9D9" w:themeFill="background1" w:themeFillShade="D9"/>
-            <w:tcMar/>
           </w:tcPr>
           <w:p>
             <w:pPr>
@@ -315,19 +301,15 @@
         <w:tc>
           <w:tcPr>
             <w:tcW w:w="2250" w:type="dxa"/>
-            <w:tcMar/>
-          </w:tcPr>
-          <w:p>
-            <w:r>
-              <w:rPr/>
+          </w:tcPr>
+          <w:p>
+            <w:r>
               <w:t>17/</w:t>
             </w:r>
             <w:r>
-              <w:rPr/>
               <w:t>4</w:t>
             </w:r>
             <w:r>
-              <w:rPr/>
               <w:t>/2026</w:t>
             </w:r>
           </w:p>
@@ -338,7 +320,6 @@
           <w:tcPr>
             <w:tcW w:w="2250" w:type="dxa"/>
             <w:shd w:val="clear" w:color="auto" w:fill="D9D9D9" w:themeFill="background1" w:themeFillShade="D9"/>
-            <w:tcMar/>
           </w:tcPr>
           <w:p>
             <w:pPr>
@@ -360,7 +341,6 @@
         <w:tc>
           <w:tcPr>
             <w:tcW w:w="3780" w:type="dxa"/>
-            <w:tcMar/>
           </w:tcPr>
           <w:p>
             <w:pPr>
@@ -375,7 +355,6 @@
           <w:tcPr>
             <w:tcW w:w="1530" w:type="dxa"/>
             <w:shd w:val="clear" w:color="auto" w:fill="D9D9D9" w:themeFill="background1" w:themeFillShade="D9"/>
-            <w:tcMar/>
           </w:tcPr>
           <w:p>
             <w:pPr>
@@ -397,23 +376,18 @@
         <w:tc>
           <w:tcPr>
             <w:tcW w:w="2250" w:type="dxa"/>
-            <w:tcMar/>
-          </w:tcPr>
-          <w:p>
-            <w:r>
-              <w:rPr/>
+          </w:tcPr>
+          <w:p>
+            <w:r>
               <w:t>17</w:t>
             </w:r>
             <w:r>
-              <w:rPr/>
               <w:t>/</w:t>
             </w:r>
             <w:r>
-              <w:rPr/>
               <w:t>4</w:t>
             </w:r>
             <w:r>
-              <w:rPr/>
               <w:t>/2026</w:t>
             </w:r>
           </w:p>
@@ -424,7 +398,6 @@
           <w:tcPr>
             <w:tcW w:w="2250" w:type="dxa"/>
             <w:shd w:val="clear" w:color="auto" w:fill="D9D9D9" w:themeFill="background1" w:themeFillShade="D9"/>
-            <w:tcMar/>
           </w:tcPr>
           <w:p>
             <w:pPr>
@@ -446,7 +419,6 @@
         <w:tc>
           <w:tcPr>
             <w:tcW w:w="3780" w:type="dxa"/>
-            <w:tcMar/>
           </w:tcPr>
           <w:p/>
         </w:tc>
@@ -454,7 +426,6 @@
           <w:tcPr>
             <w:tcW w:w="1530" w:type="dxa"/>
             <w:shd w:val="clear" w:color="auto" w:fill="D9D9D9" w:themeFill="background1" w:themeFillShade="D9"/>
-            <w:tcMar/>
           </w:tcPr>
           <w:p>
             <w:pPr>
@@ -476,7 +447,6 @@
         <w:tc>
           <w:tcPr>
             <w:tcW w:w="2250" w:type="dxa"/>
-            <w:tcMar/>
           </w:tcPr>
           <w:p/>
         </w:tc>
@@ -486,7 +456,6 @@
           <w:tcPr>
             <w:tcW w:w="2250" w:type="dxa"/>
             <w:shd w:val="clear" w:color="auto" w:fill="D9D9D9" w:themeFill="background1" w:themeFillShade="D9"/>
-            <w:tcMar/>
           </w:tcPr>
           <w:p>
             <w:pPr>
@@ -509,7 +478,6 @@
           <w:tcPr>
             <w:tcW w:w="7560" w:type="dxa"/>
             <w:gridSpan w:val="3"/>
-            <w:tcMar/>
           </w:tcPr>
           <w:p>
             <w:pPr>
@@ -533,7 +501,6 @@
           <w:tcPr>
             <w:tcW w:w="2250" w:type="dxa"/>
             <w:shd w:val="clear" w:color="auto" w:fill="D9D9D9" w:themeFill="background1" w:themeFillShade="D9"/>
-            <w:tcMar/>
           </w:tcPr>
           <w:p>
             <w:pPr>
@@ -555,7 +522,6 @@
         <w:tc>
           <w:tcPr>
             <w:tcW w:w="3780" w:type="dxa"/>
-            <w:tcMar/>
           </w:tcPr>
           <w:p/>
         </w:tc>
@@ -563,7 +529,6 @@
           <w:tcPr>
             <w:tcW w:w="1530" w:type="dxa"/>
             <w:shd w:val="clear" w:color="auto" w:fill="D9D9D9" w:themeFill="background1" w:themeFillShade="D9"/>
-            <w:tcMar/>
           </w:tcPr>
           <w:p>
             <w:pPr>
@@ -585,7 +550,6 @@
         <w:tc>
           <w:tcPr>
             <w:tcW w:w="2250" w:type="dxa"/>
-            <w:tcMar/>
           </w:tcPr>
           <w:p/>
         </w:tc>
@@ -595,7 +559,6 @@
           <w:tcPr>
             <w:tcW w:w="2250" w:type="dxa"/>
             <w:shd w:val="clear" w:color="auto" w:fill="D9D9D9" w:themeFill="background1" w:themeFillShade="D9"/>
-            <w:tcMar/>
           </w:tcPr>
           <w:p>
             <w:pPr>
@@ -618,25 +581,19 @@
           <w:tcPr>
             <w:tcW w:w="7560" w:type="dxa"/>
             <w:gridSpan w:val="3"/>
-            <w:tcMar/>
-          </w:tcPr>
-          <w:p>
-            <w:pPr>
-              <w:pStyle w:val="Normal"/>
+          </w:tcPr>
+          <w:p>
+            <w:pPr>
               <w:pBdr>
-                <w:top w:val="nil" w:color="FF000000" w:sz="0" w:space="0"/>
-                <w:left w:val="nil" w:color="FF000000" w:sz="0" w:space="0"/>
-                <w:bottom w:val="nil" w:color="FF000000" w:sz="0" w:space="0"/>
-                <w:right w:val="nil" w:color="FF000000" w:sz="0" w:space="0"/>
-                <w:between w:val="nil" w:color="FF000000" w:sz="0" w:space="0"/>
+                <w:top w:val="nil"/>
+                <w:left w:val="nil"/>
+                <w:bottom w:val="nil"/>
+                <w:right w:val="nil"/>
+                <w:between w:val="nil"/>
               </w:pBdr>
             </w:pPr>
             <w:r>
               <w:rPr>
-                <w:rFonts w:ascii="Times New Roman" w:hAnsi="Times New Roman" w:eastAsia="Times New Roman" w:cs="Times New Roman"/>
-                <w:noProof w:val="0"/>
-                <w:sz w:val="24"/>
-                <w:szCs w:val="24"/>
                 <w:lang w:val="es-ES"/>
               </w:rPr>
               <w:t>El cliente publicador genera nueva información y realiza una solicitud al intermediario de mensajería para distribuirla</w:t>
@@ -649,7 +606,6 @@
           <w:tcPr>
             <w:tcW w:w="2250" w:type="dxa"/>
             <w:shd w:val="clear" w:color="auto" w:fill="D9D9D9" w:themeFill="background1" w:themeFillShade="D9"/>
-            <w:tcMar/>
           </w:tcPr>
           <w:p>
             <w:pPr>
@@ -672,27 +628,18 @@
           <w:tcPr>
             <w:tcW w:w="7560" w:type="dxa"/>
             <w:gridSpan w:val="3"/>
-            <w:tcMar/>
-          </w:tcPr>
-          <w:p>
-            <w:pPr>
-              <w:pStyle w:val="Normal"/>
+          </w:tcPr>
+          <w:p>
+            <w:pPr>
               <w:pBdr>
-                <w:top w:val="nil" w:color="FF000000" w:sz="0" w:space="0"/>
-                <w:left w:val="nil" w:color="FF000000" w:sz="0" w:space="0"/>
-                <w:bottom w:val="nil" w:color="FF000000" w:sz="0" w:space="0"/>
-                <w:right w:val="nil" w:color="FF000000" w:sz="0" w:space="0"/>
-                <w:between w:val="nil" w:color="FF000000" w:sz="0" w:space="0"/>
+                <w:top w:val="nil"/>
+                <w:left w:val="nil"/>
+                <w:bottom w:val="nil"/>
+                <w:right w:val="nil"/>
+                <w:between w:val="nil"/>
               </w:pBdr>
             </w:pPr>
             <w:r>
-              <w:rPr>
-                <w:rFonts w:ascii="Times New Roman" w:hAnsi="Times New Roman" w:eastAsia="Times New Roman" w:cs="Times New Roman"/>
-                <w:noProof w:val="0"/>
-                <w:sz w:val="24"/>
-                <w:szCs w:val="24"/>
-                <w:lang w:val="es"/>
-              </w:rPr>
               <w:t>Bajo demanda (cada vez que se genera nueva información para publicar)</w:t>
             </w:r>
           </w:p>
@@ -706,12 +653,12 @@
         <w:tblW w:w="9900" w:type="dxa"/>
         <w:tblInd w:w="-540" w:type="dxa"/>
         <w:tblBorders>
-          <w:top w:val="single" w:color="000000" w:sz="6" w:space="0"/>
-          <w:left w:val="single" w:color="000000" w:sz="6" w:space="0"/>
-          <w:bottom w:val="single" w:color="000000" w:sz="6" w:space="0"/>
-          <w:right w:val="single" w:color="000000" w:sz="6" w:space="0"/>
-          <w:insideH w:val="single" w:color="000000" w:sz="6" w:space="0"/>
-          <w:insideV w:val="single" w:color="000000" w:sz="6" w:space="0"/>
+          <w:top w:val="single" w:sz="6" w:space="0" w:color="000000"/>
+          <w:left w:val="single" w:sz="6" w:space="0" w:color="000000"/>
+          <w:bottom w:val="single" w:sz="6" w:space="0" w:color="000000"/>
+          <w:right w:val="single" w:sz="6" w:space="0" w:color="000000"/>
+          <w:insideH w:val="single" w:sz="6" w:space="0" w:color="000000"/>
+          <w:insideV w:val="single" w:sz="6" w:space="0" w:color="000000"/>
         </w:tblBorders>
         <w:tblLayout w:type="fixed"/>
         <w:tblLook w:val="0000" w:firstRow="0" w:lastRow="0" w:firstColumn="0" w:lastColumn="0" w:noHBand="0" w:noVBand="0"/>
@@ -724,7 +671,6 @@
           <w:tcPr>
             <w:tcW w:w="9900" w:type="dxa"/>
             <w:shd w:val="clear" w:color="auto" w:fill="D9D9D9" w:themeFill="background1" w:themeFillShade="D9"/>
-            <w:tcMar/>
           </w:tcPr>
           <w:p>
             <w:pPr>
@@ -759,70 +705,41 @@
         <w:tc>
           <w:tcPr>
             <w:tcW w:w="9900" w:type="dxa"/>
-            <w:tcMar/>
-          </w:tcPr>
-          <w:p>
-            <w:pPr>
-              <w:pStyle w:val="ListParagraph"/>
+          </w:tcPr>
+          <w:p>
+            <w:pPr>
+              <w:pStyle w:val="Prrafodelista"/>
               <w:numPr>
                 <w:ilvl w:val="0"/>
-                <w:numId w:val="13"/>
+                <w:numId w:val="1"/>
               </w:numPr>
-              <w:spacing w:before="0" w:beforeAutospacing="off" w:after="0" w:afterAutospacing="off"/>
-              <w:rPr>
-                <w:rFonts w:ascii="Times New Roman" w:hAnsi="Times New Roman" w:eastAsia="Times New Roman" w:cs="Times New Roman"/>
-                <w:noProof w:val="0"/>
-                <w:sz w:val="24"/>
-                <w:szCs w:val="24"/>
-                <w:lang w:val="es"/>
-              </w:rPr>
-            </w:pPr>
-            <w:r>
-              <w:rPr>
-                <w:rFonts w:ascii="Times New Roman" w:hAnsi="Times New Roman" w:eastAsia="Times New Roman" w:cs="Times New Roman"/>
-                <w:noProof w:val="0"/>
-                <w:sz w:val="24"/>
-                <w:szCs w:val="24"/>
-                <w:lang w:val="es"/>
-              </w:rPr>
+              <w:spacing w:before="0" w:after="0"/>
+            </w:pPr>
+            <w:r>
               <w:t>El cliente publicador está conectado al intermediario de mensajería.</w:t>
             </w:r>
           </w:p>
           <w:p>
             <w:pPr>
-              <w:pStyle w:val="ListParagraph"/>
+              <w:pStyle w:val="Prrafodelista"/>
               <w:numPr>
                 <w:ilvl w:val="0"/>
-                <w:numId w:val="13"/>
+                <w:numId w:val="1"/>
               </w:numPr>
-              <w:spacing w:before="0" w:beforeAutospacing="off" w:after="0" w:afterAutospacing="off"/>
-              <w:rPr>
-                <w:rFonts w:ascii="Times New Roman" w:hAnsi="Times New Roman" w:eastAsia="Times New Roman" w:cs="Times New Roman"/>
-                <w:noProof w:val="0"/>
-                <w:sz w:val="24"/>
-                <w:szCs w:val="24"/>
-                <w:lang w:val="es"/>
-              </w:rPr>
-            </w:pPr>
-            <w:r>
-              <w:rPr>
-                <w:rFonts w:ascii="Times New Roman" w:hAnsi="Times New Roman" w:eastAsia="Times New Roman" w:cs="Times New Roman"/>
-                <w:noProof w:val="0"/>
-                <w:sz w:val="24"/>
-                <w:szCs w:val="24"/>
-                <w:lang w:val="es"/>
-              </w:rPr>
+              <w:spacing w:before="0" w:after="0"/>
+            </w:pPr>
+            <w:r>
               <w:t>El intermediario de mensajería se encuentra disponible y operativo.</w:t>
             </w:r>
           </w:p>
           <w:p>
             <w:pPr>
               <w:pBdr>
-                <w:top w:val="nil" w:color="FF000000" w:sz="0" w:space="0"/>
-                <w:left w:val="nil" w:color="FF000000" w:sz="0" w:space="0"/>
-                <w:bottom w:val="nil" w:color="FF000000" w:sz="0" w:space="0"/>
-                <w:right w:val="nil" w:color="FF000000" w:sz="0" w:space="0"/>
-                <w:between w:val="nil" w:color="FF000000" w:sz="0" w:space="0"/>
+                <w:top w:val="nil"/>
+                <w:left w:val="nil"/>
+                <w:bottom w:val="nil"/>
+                <w:right w:val="nil"/>
+                <w:between w:val="nil"/>
               </w:pBdr>
             </w:pPr>
           </w:p>
@@ -846,12 +763,12 @@
         <w:tblW w:w="9900" w:type="dxa"/>
         <w:tblInd w:w="-540" w:type="dxa"/>
         <w:tblBorders>
-          <w:top w:val="single" w:color="000000" w:themeColor="text1" w:sz="6" w:space="0"/>
-          <w:left w:val="single" w:color="000000" w:themeColor="text1" w:sz="6" w:space="0"/>
-          <w:bottom w:val="single" w:color="000000" w:themeColor="text1" w:sz="6" w:space="0"/>
-          <w:right w:val="single" w:color="000000" w:themeColor="text1" w:sz="6" w:space="0"/>
-          <w:insideH w:val="single" w:color="000000" w:themeColor="text1" w:sz="6" w:space="0"/>
-          <w:insideV w:val="single" w:color="000000" w:themeColor="text1" w:sz="6" w:space="0"/>
+          <w:top w:val="single" w:sz="6" w:space="0" w:color="000000" w:themeColor="text1"/>
+          <w:left w:val="single" w:sz="6" w:space="0" w:color="000000" w:themeColor="text1"/>
+          <w:bottom w:val="single" w:sz="6" w:space="0" w:color="000000" w:themeColor="text1"/>
+          <w:right w:val="single" w:sz="6" w:space="0" w:color="000000" w:themeColor="text1"/>
+          <w:insideH w:val="single" w:sz="6" w:space="0" w:color="000000" w:themeColor="text1"/>
+          <w:insideV w:val="single" w:sz="6" w:space="0" w:color="000000" w:themeColor="text1"/>
         </w:tblBorders>
         <w:tblLayout w:type="fixed"/>
         <w:tblLook w:val="0000" w:firstRow="0" w:lastRow="0" w:firstColumn="0" w:lastColumn="0" w:noHBand="0" w:noVBand="0"/>
@@ -875,7 +792,6 @@
               <w:bottom w:val="nil"/>
             </w:tcBorders>
             <w:shd w:val="clear" w:color="auto" w:fill="D9D9D9" w:themeFill="background1" w:themeFillShade="D9"/>
-            <w:tcMar/>
           </w:tcPr>
           <w:p>
             <w:r>
@@ -901,7 +817,6 @@
               <w:bottom w:val="nil"/>
             </w:tcBorders>
             <w:shd w:val="clear" w:color="auto" w:fill="D9D9D9" w:themeFill="background1" w:themeFillShade="D9"/>
-            <w:tcMar/>
           </w:tcPr>
           <w:p>
             <w:pPr>
@@ -927,7 +842,6 @@
               <w:bottom w:val="nil"/>
             </w:tcBorders>
             <w:shd w:val="clear" w:color="auto" w:fill="D9D9D9" w:themeFill="background1" w:themeFillShade="D9"/>
-            <w:tcMar/>
           </w:tcPr>
           <w:p>
             <w:pPr>
@@ -950,7 +864,6 @@
           <w:tcPr>
             <w:tcW w:w="4980" w:type="dxa"/>
             <w:shd w:val="clear" w:color="auto" w:fill="D9D9D9" w:themeFill="background1" w:themeFillShade="D9"/>
-            <w:tcMar/>
           </w:tcPr>
           <w:p>
             <w:pPr>
@@ -978,7 +891,6 @@
         <w:tc>
           <w:tcPr>
             <w:tcW w:w="1350" w:type="dxa"/>
-            <w:tcMar/>
             <w:vAlign w:val="center"/>
           </w:tcPr>
           <w:p>
@@ -1001,7 +913,6 @@
         <w:tc>
           <w:tcPr>
             <w:tcW w:w="3570" w:type="dxa"/>
-            <w:tcMar/>
           </w:tcPr>
           <w:tbl>
             <w:tblPr>
@@ -1021,7 +932,6 @@
               <w:tc>
                 <w:tcPr>
                   <w:tcW w:w="345" w:type="dxa"/>
-                  <w:tcMar/>
                   <w:vAlign w:val="center"/>
                 </w:tcPr>
                 <w:p/>
@@ -1035,20 +945,14 @@
                 <w:tcPr>
                   <w:tcW w:w="3360" w:type="dxa"/>
                   <w:gridSpan w:val="2"/>
-                  <w:tcMar/>
                   <w:vAlign w:val="center"/>
                 </w:tcPr>
                 <w:p>
                   <w:pPr>
-                    <w:pStyle w:val="Normal"/>
                     <w:spacing w:before="0" w:after="0"/>
                   </w:pPr>
                   <w:r>
                     <w:rPr>
-                      <w:rFonts w:ascii="Times New Roman" w:hAnsi="Times New Roman" w:eastAsia="Times New Roman" w:cs="Times New Roman"/>
-                      <w:noProof w:val="0"/>
-                      <w:sz w:val="24"/>
-                      <w:szCs w:val="24"/>
                       <w:lang w:val="es-ES"/>
                     </w:rPr>
                     <w:t>El cliente publicador genera nueva información y solicita enviar un mensaje al intermediario.</w:t>
@@ -1072,22 +976,18 @@
         <w:tc>
           <w:tcPr>
             <w:tcW w:w="4980" w:type="dxa"/>
-            <w:tcMar/>
             <w:vAlign w:val="center"/>
           </w:tcPr>
           <w:p>
             <w:pPr>
-              <w:pStyle w:val="Normal"/>
               <w:spacing w:before="0" w:after="0"/>
               <w:jc w:val="center"/>
             </w:pPr>
             <w:r>
               <w:rPr>
-                <w:rFonts w:ascii="Aptos Narrow" w:hAnsi="Aptos Narrow" w:eastAsia="Aptos Narrow" w:cs="Aptos Narrow"/>
-                <w:noProof w:val="0"/>
+                <w:rFonts w:ascii="Aptos Narrow" w:eastAsia="Aptos Narrow" w:hAnsi="Aptos Narrow" w:cs="Aptos Narrow"/>
                 <w:sz w:val="22"/>
                 <w:szCs w:val="22"/>
-                <w:lang w:val="es"/>
               </w:rPr>
               <w:t>El sistema recibe la solicitud de publicación.</w:t>
             </w:r>
@@ -1102,7 +1002,6 @@
         <w:tc>
           <w:tcPr>
             <w:tcW w:w="1350" w:type="dxa"/>
-            <w:tcMar/>
             <w:vAlign w:val="center"/>
           </w:tcPr>
           <w:p>
@@ -1125,7 +1024,6 @@
         <w:tc>
           <w:tcPr>
             <w:tcW w:w="3570" w:type="dxa"/>
-            <w:tcMar/>
           </w:tcPr>
           <w:p>
             <w:pPr>
@@ -1142,22 +1040,18 @@
         <w:tc>
           <w:tcPr>
             <w:tcW w:w="4980" w:type="dxa"/>
-            <w:tcMar/>
             <w:vAlign w:val="center"/>
           </w:tcPr>
           <w:p>
             <w:pPr>
-              <w:pStyle w:val="Normal"/>
               <w:spacing w:before="0" w:after="0"/>
               <w:jc w:val="center"/>
             </w:pPr>
             <w:r>
               <w:rPr>
-                <w:rFonts w:ascii="Aptos Narrow" w:hAnsi="Aptos Narrow" w:eastAsia="Aptos Narrow" w:cs="Aptos Narrow"/>
-                <w:noProof w:val="0"/>
+                <w:rFonts w:ascii="Aptos Narrow" w:eastAsia="Aptos Narrow" w:hAnsi="Aptos Narrow" w:cs="Aptos Narrow"/>
                 <w:sz w:val="22"/>
                 <w:szCs w:val="22"/>
-                <w:lang w:val="es"/>
               </w:rPr>
               <w:t>El sistema valida que el publicador esté conectado al intermediario de mensajería.</w:t>
             </w:r>
@@ -1172,7 +1066,6 @@
         <w:tc>
           <w:tcPr>
             <w:tcW w:w="1350" w:type="dxa"/>
-            <w:tcMar/>
             <w:vAlign w:val="center"/>
           </w:tcPr>
           <w:p>
@@ -1195,7 +1088,6 @@
         <w:tc>
           <w:tcPr>
             <w:tcW w:w="3570" w:type="dxa"/>
-            <w:tcMar/>
           </w:tcPr>
           <w:p>
             <w:pPr>
@@ -1212,22 +1104,18 @@
         <w:tc>
           <w:tcPr>
             <w:tcW w:w="4980" w:type="dxa"/>
-            <w:tcMar/>
             <w:vAlign w:val="center"/>
           </w:tcPr>
           <w:p>
             <w:pPr>
-              <w:pStyle w:val="Normal"/>
               <w:spacing w:before="0" w:after="0"/>
               <w:jc w:val="center"/>
             </w:pPr>
             <w:r>
               <w:rPr>
-                <w:rFonts w:ascii="Aptos Narrow" w:hAnsi="Aptos Narrow" w:eastAsia="Aptos Narrow" w:cs="Aptos Narrow"/>
-                <w:noProof w:val="0"/>
+                <w:rFonts w:ascii="Aptos Narrow" w:eastAsia="Aptos Narrow" w:hAnsi="Aptos Narrow" w:cs="Aptos Narrow"/>
                 <w:sz w:val="22"/>
                 <w:szCs w:val="22"/>
-                <w:lang w:val="es"/>
               </w:rPr>
               <w:t>El sistema establece la comunicación con el intermediario.</w:t>
             </w:r>
@@ -1242,7 +1130,6 @@
         <w:tc>
           <w:tcPr>
             <w:tcW w:w="1350" w:type="dxa"/>
-            <w:tcMar/>
             <w:vAlign w:val="center"/>
           </w:tcPr>
           <w:p>
@@ -1265,7 +1152,6 @@
         <w:tc>
           <w:tcPr>
             <w:tcW w:w="3570" w:type="dxa"/>
-            <w:tcMar/>
           </w:tcPr>
           <w:p>
             <w:pPr>
@@ -1282,22 +1168,18 @@
         <w:tc>
           <w:tcPr>
             <w:tcW w:w="4980" w:type="dxa"/>
-            <w:tcMar/>
             <w:vAlign w:val="center"/>
           </w:tcPr>
           <w:p>
             <w:pPr>
-              <w:pStyle w:val="Normal"/>
               <w:spacing w:before="0" w:after="0"/>
               <w:jc w:val="center"/>
             </w:pPr>
             <w:r>
               <w:rPr>
-                <w:rFonts w:ascii="Aptos Narrow" w:hAnsi="Aptos Narrow" w:eastAsia="Aptos Narrow" w:cs="Aptos Narrow"/>
-                <w:noProof w:val="0"/>
+                <w:rFonts w:ascii="Aptos Narrow" w:eastAsia="Aptos Narrow" w:hAnsi="Aptos Narrow" w:cs="Aptos Narrow"/>
                 <w:sz w:val="22"/>
                 <w:szCs w:val="22"/>
-                <w:lang w:val="es"/>
               </w:rPr>
               <w:t>El sistema envía el mensaje al intermediario de mensajería.</w:t>
             </w:r>
@@ -1312,7 +1194,6 @@
         <w:tc>
           <w:tcPr>
             <w:tcW w:w="1350" w:type="dxa"/>
-            <w:tcMar/>
             <w:vAlign w:val="center"/>
           </w:tcPr>
           <w:p>
@@ -1335,7 +1216,6 @@
         <w:tc>
           <w:tcPr>
             <w:tcW w:w="3570" w:type="dxa"/>
-            <w:tcMar/>
           </w:tcPr>
           <w:p>
             <w:pPr>
@@ -1352,22 +1232,18 @@
         <w:tc>
           <w:tcPr>
             <w:tcW w:w="4980" w:type="dxa"/>
-            <w:tcMar/>
             <w:vAlign w:val="center"/>
           </w:tcPr>
           <w:p>
             <w:pPr>
-              <w:pStyle w:val="Normal"/>
               <w:spacing w:before="0" w:after="0"/>
               <w:jc w:val="center"/>
             </w:pPr>
             <w:r>
               <w:rPr>
-                <w:rFonts w:ascii="Aptos Narrow" w:hAnsi="Aptos Narrow" w:eastAsia="Aptos Narrow" w:cs="Aptos Narrow"/>
-                <w:noProof w:val="0"/>
+                <w:rFonts w:ascii="Aptos Narrow" w:eastAsia="Aptos Narrow" w:hAnsi="Aptos Narrow" w:cs="Aptos Narrow"/>
                 <w:sz w:val="22"/>
                 <w:szCs w:val="22"/>
-                <w:lang w:val="es"/>
               </w:rPr>
               <w:t>El sistema espera la confirmación de entrega del intermediario.</w:t>
             </w:r>
@@ -1382,7 +1258,6 @@
         <w:tc>
           <w:tcPr>
             <w:tcW w:w="1350" w:type="dxa"/>
-            <w:tcMar/>
             <w:vAlign w:val="center"/>
           </w:tcPr>
           <w:p>
@@ -1405,7 +1280,6 @@
         <w:tc>
           <w:tcPr>
             <w:tcW w:w="3570" w:type="dxa"/>
-            <w:tcMar/>
           </w:tcPr>
           <w:p>
             <w:pPr>
@@ -1422,22 +1296,18 @@
         <w:tc>
           <w:tcPr>
             <w:tcW w:w="4980" w:type="dxa"/>
-            <w:tcMar/>
             <w:vAlign w:val="center"/>
           </w:tcPr>
           <w:p>
             <w:pPr>
-              <w:pStyle w:val="Normal"/>
               <w:spacing w:before="0" w:after="0"/>
               <w:jc w:val="center"/>
             </w:pPr>
             <w:r>
               <w:rPr>
-                <w:rFonts w:ascii="Aptos Narrow" w:hAnsi="Aptos Narrow" w:eastAsia="Aptos Narrow" w:cs="Aptos Narrow"/>
-                <w:noProof w:val="0"/>
+                <w:rFonts w:ascii="Aptos Narrow" w:eastAsia="Aptos Narrow" w:hAnsi="Aptos Narrow" w:cs="Aptos Narrow"/>
                 <w:sz w:val="22"/>
                 <w:szCs w:val="22"/>
-                <w:lang w:val="es"/>
               </w:rPr>
               <w:t>El sistema confirma que el mensaje fue entregado exitosamente.</w:t>
             </w:r>
@@ -1452,7 +1322,6 @@
         <w:tc>
           <w:tcPr>
             <w:tcW w:w="1350" w:type="dxa"/>
-            <w:tcMar/>
             <w:vAlign w:val="center"/>
           </w:tcPr>
           <w:p>
@@ -1475,7 +1344,6 @@
         <w:tc>
           <w:tcPr>
             <w:tcW w:w="3570" w:type="dxa"/>
-            <w:tcMar/>
           </w:tcPr>
           <w:p>
             <w:pPr>
@@ -1492,22 +1360,18 @@
         <w:tc>
           <w:tcPr>
             <w:tcW w:w="4980" w:type="dxa"/>
-            <w:tcMar/>
             <w:vAlign w:val="center"/>
           </w:tcPr>
           <w:p>
             <w:pPr>
-              <w:pStyle w:val="Normal"/>
               <w:spacing w:before="0" w:after="0"/>
               <w:jc w:val="center"/>
             </w:pPr>
             <w:r>
               <w:rPr>
-                <w:rFonts w:ascii="Aptos Narrow" w:hAnsi="Aptos Narrow" w:eastAsia="Aptos Narrow" w:cs="Aptos Narrow"/>
-                <w:noProof w:val="0"/>
+                <w:rFonts w:ascii="Aptos Narrow" w:eastAsia="Aptos Narrow" w:hAnsi="Aptos Narrow" w:cs="Aptos Narrow"/>
                 <w:sz w:val="22"/>
                 <w:szCs w:val="22"/>
-                <w:lang w:val="es"/>
               </w:rPr>
               <w:t>El sistema continúa con el proceso siguiente.</w:t>
             </w:r>
@@ -1523,12 +1387,12 @@
         <w:tblW w:w="9468" w:type="dxa"/>
         <w:tblInd w:w="-108" w:type="dxa"/>
         <w:tblBorders>
-          <w:top w:val="single" w:color="000000" w:sz="6" w:space="0"/>
-          <w:left w:val="single" w:color="000000" w:sz="6" w:space="0"/>
-          <w:bottom w:val="single" w:color="000000" w:sz="6" w:space="0"/>
-          <w:right w:val="single" w:color="000000" w:sz="6" w:space="0"/>
-          <w:insideH w:val="single" w:color="000000" w:sz="6" w:space="0"/>
-          <w:insideV w:val="single" w:color="000000" w:sz="6" w:space="0"/>
+          <w:top w:val="single" w:sz="6" w:space="0" w:color="000000"/>
+          <w:left w:val="single" w:sz="6" w:space="0" w:color="000000"/>
+          <w:bottom w:val="single" w:sz="6" w:space="0" w:color="000000"/>
+          <w:right w:val="single" w:sz="6" w:space="0" w:color="000000"/>
+          <w:insideH w:val="single" w:sz="6" w:space="0" w:color="000000"/>
+          <w:insideV w:val="single" w:sz="6" w:space="0" w:color="000000"/>
         </w:tblBorders>
         <w:tblLayout w:type="fixed"/>
         <w:tblLook w:val="0000" w:firstRow="0" w:lastRow="0" w:firstColumn="0" w:lastColumn="0" w:noHBand="0" w:noVBand="0"/>
@@ -1552,29 +1416,28 @@
               <w:bottom w:val="nil"/>
             </w:tcBorders>
             <w:shd w:val="clear" w:color="auto" w:fill="D9D9D9" w:themeFill="background1" w:themeFillShade="D9"/>
-            <w:tcMar/>
           </w:tcPr>
           <w:p>
             <w:pPr>
               <w:pBdr>
-                <w:top w:val="nil" w:color="FF000000" w:sz="0" w:space="0"/>
-                <w:left w:val="nil" w:color="FF000000" w:sz="0" w:space="0"/>
-                <w:bottom w:val="nil" w:color="FF000000" w:sz="0" w:space="0"/>
-                <w:right w:val="nil" w:color="FF000000" w:sz="0" w:space="0"/>
-                <w:between w:val="nil" w:color="FF000000" w:sz="0" w:space="0"/>
+                <w:top w:val="nil"/>
+                <w:left w:val="nil"/>
+                <w:bottom w:val="nil"/>
+                <w:right w:val="nil"/>
+                <w:between w:val="nil"/>
               </w:pBdr>
               <w:spacing w:before="0" w:after="0"/>
               <w:rPr>
-                <w:b w:val="1"/>
-                <w:bCs w:val="1"/>
+                <w:b/>
+                <w:bCs/>
                 <w:sz w:val="22"/>
                 <w:szCs w:val="22"/>
               </w:rPr>
             </w:pPr>
             <w:r>
               <w:rPr>
-                <w:i w:val="1"/>
-                <w:iCs w:val="1"/>
+                <w:i/>
+                <w:iCs/>
                 <w:sz w:val="22"/>
                 <w:szCs w:val="22"/>
               </w:rPr>
@@ -1596,7 +1459,6 @@
               <w:bottom w:val="nil"/>
             </w:tcBorders>
             <w:shd w:val="clear" w:color="auto" w:fill="D9D9D9" w:themeFill="background1" w:themeFillShade="D9"/>
-            <w:tcMar/>
           </w:tcPr>
           <w:p>
             <w:pPr>
@@ -1622,7 +1484,6 @@
               <w:bottom w:val="nil"/>
             </w:tcBorders>
             <w:shd w:val="clear" w:color="auto" w:fill="D9D9D9" w:themeFill="background1" w:themeFillShade="D9"/>
-            <w:tcMar/>
           </w:tcPr>
           <w:p>
             <w:pPr>
@@ -1645,7 +1506,6 @@
           <w:tcPr>
             <w:tcW w:w="5310" w:type="dxa"/>
             <w:shd w:val="clear" w:color="auto" w:fill="D9D9D9" w:themeFill="background1" w:themeFillShade="D9"/>
-            <w:tcMar/>
           </w:tcPr>
           <w:p>
             <w:pPr>
@@ -1673,7 +1533,6 @@
         <w:tc>
           <w:tcPr>
             <w:tcW w:w="918" w:type="dxa"/>
-            <w:tcMar/>
           </w:tcPr>
           <w:p>
             <w:pPr>
@@ -1682,7 +1541,7 @@
             </w:pPr>
             <w:r>
               <w:rPr>
-                <w:rFonts w:ascii="Aptos Narrow" w:hAnsi="Aptos Narrow" w:eastAsia="Aptos Narrow" w:cs="Aptos Narrow"/>
+                <w:rFonts w:ascii="Aptos Narrow" w:eastAsia="Aptos Narrow" w:hAnsi="Aptos Narrow" w:cs="Aptos Narrow"/>
                 <w:color w:val="000000" w:themeColor="text1"/>
                 <w:sz w:val="22"/>
                 <w:szCs w:val="22"/>
@@ -1694,27 +1553,22 @@
         <w:tc>
           <w:tcPr>
             <w:tcW w:w="3240" w:type="dxa"/>
-            <w:tcMar/>
           </w:tcPr>
           <w:p/>
         </w:tc>
         <w:tc>
           <w:tcPr>
             <w:tcW w:w="5310" w:type="dxa"/>
-            <w:tcMar/>
-          </w:tcPr>
-          <w:p>
-            <w:pPr>
-              <w:pStyle w:val="Normal"/>
+          </w:tcPr>
+          <w:p>
+            <w:pPr>
               <w:spacing w:before="0" w:after="0"/>
             </w:pPr>
             <w:r>
               <w:rPr>
-                <w:rFonts w:ascii="Aptos Narrow" w:hAnsi="Aptos Narrow" w:eastAsia="Aptos Narrow" w:cs="Aptos Narrow"/>
-                <w:noProof w:val="0"/>
+                <w:rFonts w:ascii="Aptos Narrow" w:eastAsia="Aptos Narrow" w:hAnsi="Aptos Narrow" w:cs="Aptos Narrow"/>
                 <w:sz w:val="22"/>
                 <w:szCs w:val="22"/>
-                <w:lang w:val="es"/>
               </w:rPr>
               <w:t>Si el intermediario no se encuentra disponible</w:t>
             </w:r>
@@ -1729,7 +1583,6 @@
         <w:tc>
           <w:tcPr>
             <w:tcW w:w="918" w:type="dxa"/>
-            <w:tcMar/>
           </w:tcPr>
           <w:p>
             <w:pPr>
@@ -1738,7 +1591,7 @@
             </w:pPr>
             <w:r>
               <w:rPr>
-                <w:rFonts w:ascii="Aptos Narrow" w:hAnsi="Aptos Narrow" w:eastAsia="Aptos Narrow" w:cs="Aptos Narrow"/>
+                <w:rFonts w:ascii="Aptos Narrow" w:eastAsia="Aptos Narrow" w:hAnsi="Aptos Narrow" w:cs="Aptos Narrow"/>
                 <w:color w:val="000000" w:themeColor="text1"/>
                 <w:sz w:val="22"/>
                 <w:szCs w:val="22"/>
@@ -1750,27 +1603,22 @@
         <w:tc>
           <w:tcPr>
             <w:tcW w:w="3240" w:type="dxa"/>
-            <w:tcMar/>
           </w:tcPr>
           <w:p/>
         </w:tc>
         <w:tc>
           <w:tcPr>
             <w:tcW w:w="5310" w:type="dxa"/>
-            <w:tcMar/>
-          </w:tcPr>
-          <w:p>
-            <w:pPr>
-              <w:pStyle w:val="Normal"/>
+          </w:tcPr>
+          <w:p>
+            <w:pPr>
               <w:spacing w:before="0" w:after="0"/>
             </w:pPr>
             <w:r>
               <w:rPr>
-                <w:rFonts w:ascii="Aptos Narrow" w:hAnsi="Aptos Narrow" w:eastAsia="Aptos Narrow" w:cs="Aptos Narrow"/>
-                <w:noProof w:val="0"/>
+                <w:rFonts w:ascii="Aptos Narrow" w:eastAsia="Aptos Narrow" w:hAnsi="Aptos Narrow" w:cs="Aptos Narrow"/>
                 <w:sz w:val="22"/>
                 <w:szCs w:val="22"/>
-                <w:lang w:val="es"/>
               </w:rPr>
               <w:t>El sistema no puede establecer la comunicación.</w:t>
             </w:r>
@@ -1785,7 +1633,6 @@
         <w:tc>
           <w:tcPr>
             <w:tcW w:w="918" w:type="dxa"/>
-            <w:tcMar/>
           </w:tcPr>
           <w:p>
             <w:pPr>
@@ -1794,7 +1641,7 @@
             </w:pPr>
             <w:r>
               <w:rPr>
-                <w:rFonts w:ascii="Aptos Narrow" w:hAnsi="Aptos Narrow" w:eastAsia="Aptos Narrow" w:cs="Aptos Narrow"/>
+                <w:rFonts w:ascii="Aptos Narrow" w:eastAsia="Aptos Narrow" w:hAnsi="Aptos Narrow" w:cs="Aptos Narrow"/>
                 <w:color w:val="000000" w:themeColor="text1"/>
                 <w:sz w:val="22"/>
                 <w:szCs w:val="22"/>
@@ -1806,27 +1653,22 @@
         <w:tc>
           <w:tcPr>
             <w:tcW w:w="3240" w:type="dxa"/>
-            <w:tcMar/>
           </w:tcPr>
           <w:p/>
         </w:tc>
         <w:tc>
           <w:tcPr>
             <w:tcW w:w="5310" w:type="dxa"/>
-            <w:tcMar/>
-          </w:tcPr>
-          <w:p>
-            <w:pPr>
-              <w:pStyle w:val="Normal"/>
+          </w:tcPr>
+          <w:p>
+            <w:pPr>
               <w:spacing w:before="0" w:after="0"/>
             </w:pPr>
             <w:r>
               <w:rPr>
-                <w:rFonts w:ascii="Aptos Narrow" w:hAnsi="Aptos Narrow" w:eastAsia="Aptos Narrow" w:cs="Aptos Narrow"/>
-                <w:noProof w:val="0"/>
+                <w:rFonts w:ascii="Aptos Narrow" w:eastAsia="Aptos Narrow" w:hAnsi="Aptos Narrow" w:cs="Aptos Narrow"/>
                 <w:sz w:val="22"/>
                 <w:szCs w:val="22"/>
-                <w:lang w:val="es"/>
               </w:rPr>
               <w:t>El sistema registra el error y detiene el proceso.</w:t>
             </w:r>
@@ -1842,12 +1684,12 @@
         <w:tblW w:w="9468" w:type="dxa"/>
         <w:tblInd w:w="-108" w:type="dxa"/>
         <w:tblBorders>
-          <w:top w:val="single" w:color="000000" w:sz="6" w:space="0"/>
-          <w:left w:val="single" w:color="000000" w:sz="6" w:space="0"/>
-          <w:bottom w:val="single" w:color="000000" w:sz="6" w:space="0"/>
-          <w:right w:val="single" w:color="000000" w:sz="6" w:space="0"/>
-          <w:insideH w:val="single" w:color="000000" w:sz="6" w:space="0"/>
-          <w:insideV w:val="single" w:color="000000" w:sz="6" w:space="0"/>
+          <w:top w:val="single" w:sz="6" w:space="0" w:color="000000"/>
+          <w:left w:val="single" w:sz="6" w:space="0" w:color="000000"/>
+          <w:bottom w:val="single" w:sz="6" w:space="0" w:color="000000"/>
+          <w:right w:val="single" w:sz="6" w:space="0" w:color="000000"/>
+          <w:insideH w:val="single" w:sz="6" w:space="0" w:color="000000"/>
+          <w:insideV w:val="single" w:sz="6" w:space="0" w:color="000000"/>
         </w:tblBorders>
         <w:tblLayout w:type="fixed"/>
         <w:tblLook w:val="0000" w:firstRow="0" w:lastRow="0" w:firstColumn="0" w:lastColumn="0" w:noHBand="0" w:noVBand="0"/>
@@ -1871,22 +1713,21 @@
               <w:bottom w:val="nil"/>
             </w:tcBorders>
             <w:shd w:val="clear" w:color="auto" w:fill="D9D9D9" w:themeFill="background1" w:themeFillShade="D9"/>
-            <w:tcMar/>
           </w:tcPr>
           <w:p>
             <w:pPr>
               <w:spacing w:before="0" w:after="0"/>
               <w:rPr>
-                <w:b w:val="1"/>
-                <w:bCs w:val="1"/>
+                <w:b/>
+                <w:bCs/>
                 <w:sz w:val="22"/>
                 <w:szCs w:val="22"/>
               </w:rPr>
             </w:pPr>
             <w:r>
               <w:rPr>
-                <w:i w:val="1"/>
-                <w:iCs w:val="1"/>
+                <w:i/>
+                <w:iCs/>
                 <w:sz w:val="22"/>
                 <w:szCs w:val="22"/>
               </w:rPr>
@@ -1908,7 +1749,6 @@
               <w:bottom w:val="nil"/>
             </w:tcBorders>
             <w:shd w:val="clear" w:color="auto" w:fill="D9D9D9" w:themeFill="background1" w:themeFillShade="D9"/>
-            <w:tcMar/>
           </w:tcPr>
           <w:p>
             <w:pPr>
@@ -1934,7 +1774,6 @@
               <w:bottom w:val="nil"/>
             </w:tcBorders>
             <w:shd w:val="clear" w:color="auto" w:fill="D9D9D9" w:themeFill="background1" w:themeFillShade="D9"/>
-            <w:tcMar/>
           </w:tcPr>
           <w:p>
             <w:pPr>
@@ -1957,7 +1796,6 @@
           <w:tcPr>
             <w:tcW w:w="5310" w:type="dxa"/>
             <w:shd w:val="clear" w:color="auto" w:fill="D9D9D9" w:themeFill="background1" w:themeFillShade="D9"/>
-            <w:tcMar/>
           </w:tcPr>
           <w:p>
             <w:pPr>
@@ -1985,7 +1823,6 @@
         <w:tc>
           <w:tcPr>
             <w:tcW w:w="918" w:type="dxa"/>
-            <w:tcMar/>
           </w:tcPr>
           <w:p>
             <w:pPr>
@@ -1994,7 +1831,7 @@
             </w:pPr>
             <w:r>
               <w:rPr>
-                <w:rFonts w:ascii="Aptos Narrow" w:hAnsi="Aptos Narrow" w:eastAsia="Aptos Narrow" w:cs="Aptos Narrow"/>
+                <w:rFonts w:ascii="Aptos Narrow" w:eastAsia="Aptos Narrow" w:hAnsi="Aptos Narrow" w:cs="Aptos Narrow"/>
                 <w:color w:val="000000" w:themeColor="text1"/>
                 <w:sz w:val="22"/>
                 <w:szCs w:val="22"/>
@@ -2006,27 +1843,22 @@
         <w:tc>
           <w:tcPr>
             <w:tcW w:w="3240" w:type="dxa"/>
-            <w:tcMar/>
           </w:tcPr>
           <w:p/>
         </w:tc>
         <w:tc>
           <w:tcPr>
             <w:tcW w:w="5310" w:type="dxa"/>
-            <w:tcMar/>
-          </w:tcPr>
-          <w:p>
-            <w:pPr>
-              <w:pStyle w:val="Normal"/>
+          </w:tcPr>
+          <w:p>
+            <w:pPr>
               <w:spacing w:before="0" w:after="0"/>
             </w:pPr>
             <w:r>
               <w:rPr>
-                <w:rFonts w:ascii="Aptos Narrow" w:hAnsi="Aptos Narrow" w:eastAsia="Aptos Narrow" w:cs="Aptos Narrow"/>
-                <w:noProof w:val="0"/>
+                <w:rFonts w:ascii="Aptos Narrow" w:eastAsia="Aptos Narrow" w:hAnsi="Aptos Narrow" w:cs="Aptos Narrow"/>
                 <w:sz w:val="22"/>
                 <w:szCs w:val="22"/>
-                <w:lang w:val="es"/>
               </w:rPr>
               <w:t>Si el intermediario no confirma la entrega del mensaje</w:t>
             </w:r>
@@ -2041,7 +1873,6 @@
         <w:tc>
           <w:tcPr>
             <w:tcW w:w="918" w:type="dxa"/>
-            <w:tcMar/>
           </w:tcPr>
           <w:p>
             <w:pPr>
@@ -2050,7 +1881,7 @@
             </w:pPr>
             <w:r>
               <w:rPr>
-                <w:rFonts w:ascii="Aptos Narrow" w:hAnsi="Aptos Narrow" w:eastAsia="Aptos Narrow" w:cs="Aptos Narrow"/>
+                <w:rFonts w:ascii="Aptos Narrow" w:eastAsia="Aptos Narrow" w:hAnsi="Aptos Narrow" w:cs="Aptos Narrow"/>
                 <w:color w:val="000000" w:themeColor="text1"/>
                 <w:sz w:val="22"/>
                 <w:szCs w:val="22"/>
@@ -2062,27 +1893,22 @@
         <w:tc>
           <w:tcPr>
             <w:tcW w:w="3240" w:type="dxa"/>
-            <w:tcMar/>
           </w:tcPr>
           <w:p/>
         </w:tc>
         <w:tc>
           <w:tcPr>
             <w:tcW w:w="5310" w:type="dxa"/>
-            <w:tcMar/>
-          </w:tcPr>
-          <w:p>
-            <w:pPr>
-              <w:pStyle w:val="Normal"/>
+          </w:tcPr>
+          <w:p>
+            <w:pPr>
               <w:spacing w:before="0" w:after="0"/>
             </w:pPr>
             <w:r>
               <w:rPr>
-                <w:rFonts w:ascii="Aptos Narrow" w:hAnsi="Aptos Narrow" w:eastAsia="Aptos Narrow" w:cs="Aptos Narrow"/>
-                <w:noProof w:val="0"/>
+                <w:rFonts w:ascii="Aptos Narrow" w:eastAsia="Aptos Narrow" w:hAnsi="Aptos Narrow" w:cs="Aptos Narrow"/>
                 <w:sz w:val="22"/>
                 <w:szCs w:val="22"/>
-                <w:lang w:val="es"/>
               </w:rPr>
               <w:t>El sistema registra el fallo de entrega.</w:t>
             </w:r>
@@ -2097,7 +1923,6 @@
         <w:tc>
           <w:tcPr>
             <w:tcW w:w="918" w:type="dxa"/>
-            <w:tcMar/>
           </w:tcPr>
           <w:p>
             <w:pPr>
@@ -2106,7 +1931,7 @@
             </w:pPr>
             <w:r>
               <w:rPr>
-                <w:rFonts w:ascii="Aptos Narrow" w:hAnsi="Aptos Narrow" w:eastAsia="Aptos Narrow" w:cs="Aptos Narrow"/>
+                <w:rFonts w:ascii="Aptos Narrow" w:eastAsia="Aptos Narrow" w:hAnsi="Aptos Narrow" w:cs="Aptos Narrow"/>
                 <w:color w:val="000000" w:themeColor="text1"/>
                 <w:sz w:val="22"/>
                 <w:szCs w:val="22"/>
@@ -2118,27 +1943,22 @@
         <w:tc>
           <w:tcPr>
             <w:tcW w:w="3240" w:type="dxa"/>
-            <w:tcMar/>
           </w:tcPr>
           <w:p/>
         </w:tc>
         <w:tc>
           <w:tcPr>
             <w:tcW w:w="5310" w:type="dxa"/>
-            <w:tcMar/>
-          </w:tcPr>
-          <w:p>
-            <w:pPr>
-              <w:pStyle w:val="Normal"/>
+          </w:tcPr>
+          <w:p>
+            <w:pPr>
               <w:spacing w:before="0" w:after="0"/>
             </w:pPr>
             <w:r>
               <w:rPr>
-                <w:rFonts w:ascii="Aptos Narrow" w:hAnsi="Aptos Narrow" w:eastAsia="Aptos Narrow" w:cs="Aptos Narrow"/>
-                <w:noProof w:val="0"/>
+                <w:rFonts w:ascii="Aptos Narrow" w:eastAsia="Aptos Narrow" w:hAnsi="Aptos Narrow" w:cs="Aptos Narrow"/>
                 <w:sz w:val="22"/>
                 <w:szCs w:val="22"/>
-                <w:lang w:val="es"/>
               </w:rPr>
               <w:t>El sistema no continúa con el proceso hasta recibir confirmación.</w:t>
             </w:r>
@@ -2153,12 +1973,12 @@
         <w:tblW w:w="9468" w:type="dxa"/>
         <w:tblInd w:w="-108" w:type="dxa"/>
         <w:tblBorders>
-          <w:top w:val="single" w:color="000000" w:themeColor="text1" w:sz="6" w:space="0"/>
-          <w:left w:val="single" w:color="000000" w:themeColor="text1" w:sz="6" w:space="0"/>
-          <w:bottom w:val="single" w:color="000000" w:themeColor="text1" w:sz="6" w:space="0"/>
-          <w:right w:val="single" w:color="000000" w:themeColor="text1" w:sz="6" w:space="0"/>
-          <w:insideH w:val="single" w:color="000000" w:themeColor="text1" w:sz="6" w:space="0"/>
-          <w:insideV w:val="single" w:color="000000" w:themeColor="text1" w:sz="6" w:space="0"/>
+          <w:top w:val="single" w:sz="6" w:space="0" w:color="000000" w:themeColor="text1"/>
+          <w:left w:val="single" w:sz="6" w:space="0" w:color="000000" w:themeColor="text1"/>
+          <w:bottom w:val="single" w:sz="6" w:space="0" w:color="000000" w:themeColor="text1"/>
+          <w:right w:val="single" w:sz="6" w:space="0" w:color="000000" w:themeColor="text1"/>
+          <w:insideH w:val="single" w:sz="6" w:space="0" w:color="000000" w:themeColor="text1"/>
+          <w:insideV w:val="single" w:sz="6" w:space="0" w:color="000000" w:themeColor="text1"/>
         </w:tblBorders>
         <w:tblLayout w:type="fixed"/>
         <w:tblLook w:val="0000" w:firstRow="0" w:lastRow="0" w:firstColumn="0" w:lastColumn="0" w:noHBand="0" w:noVBand="0"/>
@@ -2182,22 +2002,21 @@
               <w:bottom w:val="nil"/>
             </w:tcBorders>
             <w:shd w:val="clear" w:color="auto" w:fill="D9D9D9" w:themeFill="background1" w:themeFillShade="D9"/>
-            <w:tcMar/>
           </w:tcPr>
           <w:p>
             <w:pPr>
               <w:spacing w:before="0" w:after="0"/>
               <w:rPr>
-                <w:b w:val="1"/>
-                <w:bCs w:val="1"/>
+                <w:b/>
+                <w:bCs/>
                 <w:sz w:val="22"/>
                 <w:szCs w:val="22"/>
               </w:rPr>
             </w:pPr>
             <w:r>
               <w:rPr>
-                <w:b w:val="1"/>
-                <w:bCs w:val="1"/>
+                <w:b/>
+                <w:bCs/>
                 <w:sz w:val="22"/>
                 <w:szCs w:val="22"/>
               </w:rPr>
@@ -2219,7 +2038,6 @@
               <w:bottom w:val="nil"/>
             </w:tcBorders>
             <w:shd w:val="clear" w:color="auto" w:fill="D9D9D9" w:themeFill="background1" w:themeFillShade="D9"/>
-            <w:tcMar/>
           </w:tcPr>
           <w:p>
             <w:pPr>
@@ -2245,7 +2063,6 @@
               <w:bottom w:val="nil"/>
             </w:tcBorders>
             <w:shd w:val="clear" w:color="auto" w:fill="D9D9D9" w:themeFill="background1" w:themeFillShade="D9"/>
-            <w:tcMar/>
           </w:tcPr>
           <w:p>
             <w:pPr>
@@ -2268,7 +2085,6 @@
           <w:tcPr>
             <w:tcW w:w="5310" w:type="dxa"/>
             <w:shd w:val="clear" w:color="auto" w:fill="D9D9D9" w:themeFill="background1" w:themeFillShade="D9"/>
-            <w:tcMar/>
           </w:tcPr>
           <w:p>
             <w:pPr>
@@ -2296,7 +2112,6 @@
         <w:tc>
           <w:tcPr>
             <w:tcW w:w="918" w:type="dxa"/>
-            <w:tcMar/>
           </w:tcPr>
           <w:p>
             <w:pPr>
@@ -2305,7 +2120,7 @@
             </w:pPr>
             <w:r>
               <w:rPr>
-                <w:rFonts w:ascii="Aptos Narrow" w:hAnsi="Aptos Narrow" w:eastAsia="Aptos Narrow" w:cs="Aptos Narrow"/>
+                <w:rFonts w:ascii="Aptos Narrow" w:eastAsia="Aptos Narrow" w:hAnsi="Aptos Narrow" w:cs="Aptos Narrow"/>
                 <w:color w:val="000000" w:themeColor="text1"/>
                 <w:sz w:val="22"/>
                 <w:szCs w:val="22"/>
@@ -2317,24 +2132,20 @@
         <w:tc>
           <w:tcPr>
             <w:tcW w:w="3240" w:type="dxa"/>
-            <w:tcMar/>
           </w:tcPr>
           <w:p/>
         </w:tc>
         <w:tc>
           <w:tcPr>
             <w:tcW w:w="5310" w:type="dxa"/>
-            <w:tcMar/>
-          </w:tcPr>
-          <w:p>
-            <w:pPr>
-              <w:pStyle w:val="Normal"/>
+          </w:tcPr>
+          <w:p>
+            <w:pPr>
               <w:spacing w:before="0" w:after="0" w:line="259" w:lineRule="auto"/>
             </w:pPr>
             <w:r>
               <w:rPr>
-                <w:rFonts w:ascii="Aptos Narrow" w:hAnsi="Aptos Narrow" w:eastAsia="Aptos Narrow" w:cs="Aptos Narrow"/>
-                <w:noProof w:val="0"/>
+                <w:rFonts w:ascii="Aptos Narrow" w:eastAsia="Aptos Narrow" w:hAnsi="Aptos Narrow" w:cs="Aptos Narrow"/>
                 <w:sz w:val="22"/>
                 <w:szCs w:val="22"/>
                 <w:lang w:val="es-ES"/>
@@ -2352,7 +2163,6 @@
         <w:tc>
           <w:tcPr>
             <w:tcW w:w="918" w:type="dxa"/>
-            <w:tcMar/>
           </w:tcPr>
           <w:p>
             <w:pPr>
@@ -2361,7 +2171,7 @@
             </w:pPr>
             <w:r>
               <w:rPr>
-                <w:rFonts w:ascii="Aptos Narrow" w:hAnsi="Aptos Narrow" w:eastAsia="Aptos Narrow" w:cs="Aptos Narrow"/>
+                <w:rFonts w:ascii="Aptos Narrow" w:eastAsia="Aptos Narrow" w:hAnsi="Aptos Narrow" w:cs="Aptos Narrow"/>
                 <w:color w:val="000000" w:themeColor="text1"/>
                 <w:sz w:val="22"/>
                 <w:szCs w:val="22"/>
@@ -2373,27 +2183,22 @@
         <w:tc>
           <w:tcPr>
             <w:tcW w:w="3240" w:type="dxa"/>
-            <w:tcMar/>
           </w:tcPr>
           <w:p/>
         </w:tc>
         <w:tc>
           <w:tcPr>
             <w:tcW w:w="5310" w:type="dxa"/>
-            <w:tcMar/>
-          </w:tcPr>
-          <w:p>
-            <w:pPr>
-              <w:pStyle w:val="Normal"/>
+          </w:tcPr>
+          <w:p>
+            <w:pPr>
               <w:spacing w:before="0" w:after="0"/>
             </w:pPr>
             <w:r>
               <w:rPr>
-                <w:rFonts w:ascii="Aptos Narrow" w:hAnsi="Aptos Narrow" w:eastAsia="Aptos Narrow" w:cs="Aptos Narrow"/>
-                <w:noProof w:val="0"/>
+                <w:rFonts w:ascii="Aptos Narrow" w:eastAsia="Aptos Narrow" w:hAnsi="Aptos Narrow" w:cs="Aptos Narrow"/>
                 <w:sz w:val="22"/>
                 <w:szCs w:val="22"/>
-                <w:lang w:val="es"/>
               </w:rPr>
               <w:t>El sistema rechaza el envío del mensaje.</w:t>
             </w:r>
@@ -2408,15 +2213,14 @@
         <w:tc>
           <w:tcPr>
             <w:tcW w:w="918" w:type="dxa"/>
-            <w:tcMar/>
           </w:tcPr>
           <w:p>
             <w:pPr>
               <w:spacing w:before="0" w:after="0"/>
               <w:jc w:val="right"/>
               <w:rPr>
-                <w:rFonts w:ascii="Aptos Narrow" w:hAnsi="Aptos Narrow" w:eastAsia="Aptos Narrow" w:cs="Aptos Narrow"/>
-                <w:color w:val="000000" w:themeColor="text1" w:themeTint="FF" w:themeShade="FF"/>
+                <w:rFonts w:ascii="Aptos Narrow" w:eastAsia="Aptos Narrow" w:hAnsi="Aptos Narrow" w:cs="Aptos Narrow"/>
+                <w:color w:val="000000" w:themeColor="text1"/>
                 <w:sz w:val="22"/>
                 <w:szCs w:val="22"/>
               </w:rPr>
@@ -2426,21 +2230,19 @@
         <w:tc>
           <w:tcPr>
             <w:tcW w:w="3240" w:type="dxa"/>
-            <w:tcMar/>
           </w:tcPr>
           <w:p/>
         </w:tc>
         <w:tc>
           <w:tcPr>
             <w:tcW w:w="5310" w:type="dxa"/>
-            <w:tcMar/>
           </w:tcPr>
           <w:p>
             <w:pPr>
               <w:spacing w:before="0" w:after="0"/>
               <w:rPr>
-                <w:rFonts w:ascii="Aptos Narrow" w:hAnsi="Aptos Narrow" w:eastAsia="Aptos Narrow" w:cs="Aptos Narrow"/>
-                <w:color w:val="000000" w:themeColor="text1" w:themeTint="FF" w:themeShade="FF"/>
+                <w:rFonts w:ascii="Aptos Narrow" w:eastAsia="Aptos Narrow" w:hAnsi="Aptos Narrow" w:cs="Aptos Narrow"/>
+                <w:color w:val="000000" w:themeColor="text1"/>
                 <w:sz w:val="22"/>
                 <w:szCs w:val="22"/>
               </w:rPr>
@@ -2456,15 +2258,14 @@
         <w:tc>
           <w:tcPr>
             <w:tcW w:w="918" w:type="dxa"/>
-            <w:tcMar/>
           </w:tcPr>
           <w:p>
             <w:pPr>
               <w:spacing w:before="0" w:after="0"/>
               <w:jc w:val="right"/>
               <w:rPr>
-                <w:rFonts w:ascii="Aptos Narrow" w:hAnsi="Aptos Narrow" w:eastAsia="Aptos Narrow" w:cs="Aptos Narrow"/>
-                <w:color w:val="000000" w:themeColor="text1" w:themeTint="FF" w:themeShade="FF"/>
+                <w:rFonts w:ascii="Aptos Narrow" w:eastAsia="Aptos Narrow" w:hAnsi="Aptos Narrow" w:cs="Aptos Narrow"/>
+                <w:color w:val="000000" w:themeColor="text1"/>
                 <w:sz w:val="22"/>
                 <w:szCs w:val="22"/>
               </w:rPr>
@@ -2474,21 +2275,19 @@
         <w:tc>
           <w:tcPr>
             <w:tcW w:w="3240" w:type="dxa"/>
-            <w:tcMar/>
           </w:tcPr>
           <w:p/>
         </w:tc>
         <w:tc>
           <w:tcPr>
             <w:tcW w:w="5310" w:type="dxa"/>
-            <w:tcMar/>
           </w:tcPr>
           <w:p>
             <w:pPr>
               <w:spacing w:before="0" w:after="0"/>
               <w:rPr>
-                <w:rFonts w:ascii="Aptos Narrow" w:hAnsi="Aptos Narrow" w:eastAsia="Aptos Narrow" w:cs="Aptos Narrow"/>
-                <w:color w:val="000000" w:themeColor="text1" w:themeTint="FF" w:themeShade="FF"/>
+                <w:rFonts w:ascii="Aptos Narrow" w:eastAsia="Aptos Narrow" w:hAnsi="Aptos Narrow" w:cs="Aptos Narrow"/>
+                <w:color w:val="000000" w:themeColor="text1"/>
                 <w:sz w:val="22"/>
                 <w:szCs w:val="22"/>
               </w:rPr>
@@ -2497,11 +2296,7 @@
         </w:tc>
       </w:tr>
     </w:tbl>
-    <w:p>
-      <w:pPr>
-        <w:pStyle w:val="Normal"/>
-      </w:pPr>
-    </w:p>
+    <w:p/>
     <w:p/>
     <w:tbl>
       <w:tblPr>
@@ -2509,12 +2304,12 @@
         <w:tblW w:w="9468" w:type="dxa"/>
         <w:tblInd w:w="-108" w:type="dxa"/>
         <w:tblBorders>
-          <w:top w:val="single" w:color="000000" w:sz="6" w:space="0"/>
-          <w:left w:val="single" w:color="000000" w:sz="6" w:space="0"/>
-          <w:bottom w:val="single" w:color="000000" w:sz="6" w:space="0"/>
-          <w:right w:val="single" w:color="000000" w:sz="6" w:space="0"/>
-          <w:insideH w:val="single" w:color="000000" w:sz="6" w:space="0"/>
-          <w:insideV w:val="single" w:color="000000" w:sz="6" w:space="0"/>
+          <w:top w:val="single" w:sz="6" w:space="0" w:color="000000"/>
+          <w:left w:val="single" w:sz="6" w:space="0" w:color="000000"/>
+          <w:bottom w:val="single" w:sz="6" w:space="0" w:color="000000"/>
+          <w:right w:val="single" w:sz="6" w:space="0" w:color="000000"/>
+          <w:insideH w:val="single" w:sz="6" w:space="0" w:color="000000"/>
+          <w:insideV w:val="single" w:sz="6" w:space="0" w:color="000000"/>
         </w:tblBorders>
         <w:tblLayout w:type="fixed"/>
         <w:tblLook w:val="0000" w:firstRow="0" w:lastRow="0" w:firstColumn="0" w:lastColumn="0" w:noHBand="0" w:noVBand="0"/>
@@ -2527,7 +2322,6 @@
           <w:tcPr>
             <w:tcW w:w="9468" w:type="dxa"/>
             <w:shd w:val="clear" w:color="auto" w:fill="D9D9D9" w:themeFill="background1" w:themeFillShade="D9"/>
-            <w:tcMar/>
           </w:tcPr>
           <w:p>
             <w:pPr>
@@ -2562,24 +2356,21 @@
         <w:tc>
           <w:tcPr>
             <w:tcW w:w="9468" w:type="dxa"/>
-            <w:tcMar/>
-          </w:tcPr>
-          <w:p>
-            <w:pPr>
-              <w:pStyle w:val="ListParagraph"/>
+          </w:tcPr>
+          <w:p>
+            <w:pPr>
+              <w:pStyle w:val="Prrafodelista"/>
               <w:numPr>
                 <w:ilvl w:val="0"/>
-                <w:numId w:val="5"/>
+                <w:numId w:val="6"/>
               </w:numPr>
               <w:spacing w:before="0" w:after="0"/>
               <w:rPr>
-                <w:noProof w:val="0"/>
                 <w:lang w:val="es-ES"/>
               </w:rPr>
             </w:pPr>
             <w:r>
               <w:rPr>
-                <w:noProof w:val="0"/>
                 <w:lang w:val="es-ES"/>
               </w:rPr>
               <w:t>El mensaje fue enviado exitosamente al intermediario de mensajería.</w:t>
@@ -2587,64 +2378,40 @@
           </w:p>
           <w:p>
             <w:pPr>
-              <w:pStyle w:val="ListParagraph"/>
+              <w:pStyle w:val="Prrafodelista"/>
               <w:numPr>
                 <w:ilvl w:val="0"/>
-                <w:numId w:val="5"/>
+                <w:numId w:val="6"/>
               </w:numPr>
-              <w:spacing w:before="0" w:beforeAutospacing="off" w:after="0" w:afterAutospacing="off"/>
-              <w:rPr>
-                <w:noProof w:val="0"/>
-                <w:lang w:val="es"/>
-              </w:rPr>
-            </w:pPr>
-            <w:r>
-              <w:rPr>
-                <w:noProof w:val="0"/>
-                <w:lang w:val="es"/>
-              </w:rPr>
+              <w:spacing w:before="0" w:after="0"/>
+            </w:pPr>
+            <w:r>
               <w:t>El intermediario confirmó la recepción del mensaje.</w:t>
             </w:r>
           </w:p>
           <w:p>
             <w:pPr>
-              <w:pStyle w:val="ListParagraph"/>
+              <w:pStyle w:val="Prrafodelista"/>
               <w:numPr>
                 <w:ilvl w:val="0"/>
-                <w:numId w:val="5"/>
+                <w:numId w:val="6"/>
               </w:numPr>
-              <w:spacing w:before="0" w:beforeAutospacing="off" w:after="0" w:afterAutospacing="off"/>
-              <w:rPr>
-                <w:noProof w:val="0"/>
-                <w:lang w:val="es"/>
-              </w:rPr>
-            </w:pPr>
-            <w:r>
-              <w:rPr>
-                <w:noProof w:val="0"/>
-                <w:lang w:val="es"/>
-              </w:rPr>
+              <w:spacing w:before="0" w:after="0"/>
+            </w:pPr>
+            <w:r>
               <w:t>El sistema continúa con el proceso siguiente tras la confirmación.</w:t>
             </w:r>
           </w:p>
           <w:p>
             <w:pPr>
-              <w:pStyle w:val="ListParagraph"/>
+              <w:pStyle w:val="Prrafodelista"/>
               <w:numPr>
                 <w:ilvl w:val="0"/>
-                <w:numId w:val="5"/>
+                <w:numId w:val="6"/>
               </w:numPr>
-              <w:spacing w:before="0" w:beforeAutospacing="off" w:after="0" w:afterAutospacing="off"/>
-              <w:rPr>
-                <w:noProof w:val="0"/>
-                <w:lang w:val="es"/>
-              </w:rPr>
-            </w:pPr>
-            <w:r>
-              <w:rPr>
-                <w:noProof w:val="0"/>
-                <w:lang w:val="es"/>
-              </w:rPr>
+              <w:spacing w:before="0" w:after="0"/>
+            </w:pPr>
+            <w:r>
               <w:t>La operación queda registrada en el sistema.</w:t>
             </w:r>
           </w:p>
@@ -2658,12 +2425,12 @@
         <w:tblW w:w="9468" w:type="dxa"/>
         <w:tblInd w:w="-108" w:type="dxa"/>
         <w:tblBorders>
-          <w:top w:val="single" w:color="000000" w:sz="6" w:space="0"/>
-          <w:left w:val="single" w:color="000000" w:sz="6" w:space="0"/>
-          <w:bottom w:val="single" w:color="000000" w:sz="6" w:space="0"/>
-          <w:right w:val="single" w:color="000000" w:sz="6" w:space="0"/>
-          <w:insideH w:val="single" w:color="000000" w:sz="6" w:space="0"/>
-          <w:insideV w:val="single" w:color="000000" w:sz="6" w:space="0"/>
+          <w:top w:val="single" w:sz="6" w:space="0" w:color="000000"/>
+          <w:left w:val="single" w:sz="6" w:space="0" w:color="000000"/>
+          <w:bottom w:val="single" w:sz="6" w:space="0" w:color="000000"/>
+          <w:right w:val="single" w:sz="6" w:space="0" w:color="000000"/>
+          <w:insideH w:val="single" w:sz="6" w:space="0" w:color="000000"/>
+          <w:insideV w:val="single" w:sz="6" w:space="0" w:color="000000"/>
         </w:tblBorders>
         <w:tblLayout w:type="fixed"/>
         <w:tblLook w:val="0000" w:firstRow="0" w:lastRow="0" w:firstColumn="0" w:lastColumn="0" w:noHBand="0" w:noVBand="0"/>
@@ -2676,7 +2443,6 @@
           <w:tcPr>
             <w:tcW w:w="9468" w:type="dxa"/>
             <w:shd w:val="clear" w:color="auto" w:fill="D9D9D9" w:themeFill="background1" w:themeFillShade="D9"/>
-            <w:tcMar/>
           </w:tcPr>
           <w:p>
             <w:pPr>
@@ -2711,68 +2477,43 @@
         <w:tc>
           <w:tcPr>
             <w:tcW w:w="9468" w:type="dxa"/>
-            <w:tcMar/>
-          </w:tcPr>
-          <w:p>
-            <w:pPr>
-              <w:pStyle w:val="ListParagraph"/>
+          </w:tcPr>
+          <w:p>
+            <w:pPr>
+              <w:pStyle w:val="Prrafodelista"/>
               <w:numPr>
                 <w:ilvl w:val="0"/>
-                <w:numId w:val="6"/>
+                <w:numId w:val="7"/>
               </w:numPr>
               <w:spacing w:before="0" w:after="0"/>
-              <w:rPr>
-                <w:noProof w:val="0"/>
-                <w:lang w:val="es"/>
-              </w:rPr>
-            </w:pPr>
-            <w:r>
-              <w:rPr>
-                <w:noProof w:val="0"/>
-                <w:lang w:val="es"/>
-              </w:rPr>
+            </w:pPr>
+            <w:r>
               <w:t>Validación de conexión al intermediario (caso de uso incluido)</w:t>
             </w:r>
           </w:p>
           <w:p>
             <w:pPr>
-              <w:pStyle w:val="ListParagraph"/>
+              <w:pStyle w:val="Prrafodelista"/>
               <w:numPr>
                 <w:ilvl w:val="0"/>
-                <w:numId w:val="6"/>
+                <w:numId w:val="7"/>
               </w:numPr>
-              <w:spacing w:before="0" w:beforeAutospacing="off" w:after="0" w:afterAutospacing="off"/>
-              <w:rPr>
-                <w:noProof w:val="0"/>
-                <w:lang w:val="es"/>
-              </w:rPr>
-            </w:pPr>
-            <w:r>
-              <w:rPr>
-                <w:noProof w:val="0"/>
-                <w:lang w:val="es"/>
-              </w:rPr>
+              <w:spacing w:before="0" w:after="0"/>
+            </w:pPr>
+            <w:r>
               <w:t>Confirmación de entrega del mensaje (caso de uso incluido)</w:t>
             </w:r>
           </w:p>
           <w:p>
             <w:pPr>
-              <w:pStyle w:val="ListParagraph"/>
+              <w:pStyle w:val="Prrafodelista"/>
               <w:numPr>
                 <w:ilvl w:val="0"/>
-                <w:numId w:val="6"/>
+                <w:numId w:val="7"/>
               </w:numPr>
-              <w:spacing w:before="0" w:beforeAutospacing="off" w:after="0" w:afterAutospacing="off"/>
-              <w:rPr>
-                <w:noProof w:val="0"/>
-                <w:lang w:val="es"/>
-              </w:rPr>
-            </w:pPr>
-            <w:r>
-              <w:rPr>
-                <w:noProof w:val="0"/>
-                <w:lang w:val="es"/>
-              </w:rPr>
+              <w:spacing w:before="0" w:after="0"/>
+            </w:pPr>
+            <w:r>
               <w:t>Registro de operaciones de publicación (caso de uso incluido)</w:t>
             </w:r>
           </w:p>
@@ -2786,12 +2527,12 @@
         <w:tblW w:w="9468" w:type="dxa"/>
         <w:tblInd w:w="-108" w:type="dxa"/>
         <w:tblBorders>
-          <w:top w:val="single" w:color="000000" w:sz="6" w:space="0"/>
-          <w:left w:val="single" w:color="000000" w:sz="6" w:space="0"/>
-          <w:bottom w:val="single" w:color="000000" w:sz="6" w:space="0"/>
-          <w:right w:val="single" w:color="000000" w:sz="6" w:space="0"/>
-          <w:insideH w:val="single" w:color="000000" w:sz="6" w:space="0"/>
-          <w:insideV w:val="single" w:color="000000" w:sz="6" w:space="0"/>
+          <w:top w:val="single" w:sz="6" w:space="0" w:color="000000"/>
+          <w:left w:val="single" w:sz="6" w:space="0" w:color="000000"/>
+          <w:bottom w:val="single" w:sz="6" w:space="0" w:color="000000"/>
+          <w:right w:val="single" w:sz="6" w:space="0" w:color="000000"/>
+          <w:insideH w:val="single" w:sz="6" w:space="0" w:color="000000"/>
+          <w:insideV w:val="single" w:sz="6" w:space="0" w:color="000000"/>
         </w:tblBorders>
         <w:tblLayout w:type="fixed"/>
         <w:tblLook w:val="0000" w:firstRow="0" w:lastRow="0" w:firstColumn="0" w:lastColumn="0" w:noHBand="0" w:noVBand="0"/>
@@ -2804,7 +2545,6 @@
           <w:tcPr>
             <w:tcW w:w="9468" w:type="dxa"/>
             <w:shd w:val="clear" w:color="auto" w:fill="D9D9D9" w:themeFill="background1" w:themeFillShade="D9"/>
-            <w:tcMar/>
           </w:tcPr>
           <w:p>
             <w:pPr>
@@ -2839,97 +2579,63 @@
         <w:tc>
           <w:tcPr>
             <w:tcW w:w="9468" w:type="dxa"/>
-            <w:tcMar/>
-          </w:tcPr>
-          <w:p>
-            <w:pPr>
-              <w:pStyle w:val="ListParagraph"/>
+          </w:tcPr>
+          <w:p>
+            <w:pPr>
+              <w:pStyle w:val="Prrafodelista"/>
               <w:numPr>
                 <w:ilvl w:val="0"/>
-                <w:numId w:val="7"/>
+                <w:numId w:val="8"/>
               </w:numPr>
               <w:spacing w:before="0" w:after="0"/>
-              <w:rPr>
-                <w:noProof w:val="0"/>
-                <w:lang w:val="es"/>
-              </w:rPr>
-            </w:pPr>
-            <w:r>
-              <w:rPr>
-                <w:noProof w:val="0"/>
-                <w:lang w:val="es"/>
-              </w:rPr>
+            </w:pPr>
+            <w:r>
               <w:t>La comunicación con el intermediario debe ser confiable y segura.</w:t>
             </w:r>
           </w:p>
           <w:p>
             <w:pPr>
-              <w:pStyle w:val="ListParagraph"/>
+              <w:pStyle w:val="Prrafodelista"/>
               <w:numPr>
                 <w:ilvl w:val="0"/>
-                <w:numId w:val="7"/>
+                <w:numId w:val="8"/>
               </w:numPr>
-              <w:spacing w:before="0" w:beforeAutospacing="off" w:after="0" w:afterAutospacing="off"/>
-              <w:rPr>
-                <w:noProof w:val="0"/>
-                <w:lang w:val="es"/>
-              </w:rPr>
-            </w:pPr>
-            <w:r>
-              <w:rPr>
-                <w:noProof w:val="0"/>
-                <w:lang w:val="es"/>
-              </w:rPr>
+              <w:spacing w:before="0" w:after="0"/>
+            </w:pPr>
+            <w:r>
               <w:t>El sistema debe garantizar la entrega del mensaje antes de continuar (mensajería síncrona).</w:t>
             </w:r>
           </w:p>
           <w:p>
             <w:pPr>
-              <w:pStyle w:val="ListParagraph"/>
+              <w:pStyle w:val="Prrafodelista"/>
               <w:numPr>
                 <w:ilvl w:val="0"/>
-                <w:numId w:val="7"/>
+                <w:numId w:val="8"/>
               </w:numPr>
-              <w:spacing w:before="0" w:beforeAutospacing="off" w:after="0" w:afterAutospacing="off"/>
-              <w:rPr>
-                <w:noProof w:val="0"/>
-                <w:lang w:val="es"/>
-              </w:rPr>
-            </w:pPr>
-            <w:r>
-              <w:rPr>
-                <w:noProof w:val="0"/>
-                <w:lang w:val="es"/>
-              </w:rPr>
+              <w:spacing w:before="0" w:after="0"/>
+            </w:pPr>
+            <w:r>
               <w:t>El intermediario debe estar disponible y accesible en el momento del envío.</w:t>
             </w:r>
           </w:p>
           <w:p>
             <w:pPr>
-              <w:pStyle w:val="ListParagraph"/>
+              <w:pStyle w:val="Prrafodelista"/>
               <w:numPr>
                 <w:ilvl w:val="0"/>
-                <w:numId w:val="7"/>
+                <w:numId w:val="8"/>
               </w:numPr>
-              <w:spacing w:before="0" w:beforeAutospacing="off" w:after="0" w:afterAutospacing="off"/>
-              <w:rPr>
-                <w:noProof w:val="0"/>
-                <w:lang w:val="es"/>
-              </w:rPr>
-            </w:pPr>
-            <w:r>
-              <w:rPr>
-                <w:noProof w:val="0"/>
-                <w:lang w:val="es"/>
-              </w:rPr>
+              <w:spacing w:before="0" w:after="0"/>
+            </w:pPr>
+            <w:r>
               <w:t>El sistema debe soportar múltiples publicadores concurrentes.</w:t>
             </w:r>
           </w:p>
           <w:p>
             <w:pPr>
-              <w:pStyle w:val="ListParagraph"/>
+              <w:pStyle w:val="Prrafodelista"/>
               <w:spacing w:before="0" w:after="0"/>
-              <w:ind w:left="720"/>
             </w:pPr>
           </w:p>
         </w:tc>
@@ -2942,12 +2648,12 @@
         <w:tblW w:w="9468" w:type="dxa"/>
         <w:tblInd w:w="-108" w:type="dxa"/>
         <w:tblBorders>
-          <w:top w:val="single" w:color="000000" w:sz="6" w:space="0"/>
-          <w:left w:val="single" w:color="000000" w:sz="6" w:space="0"/>
-          <w:bottom w:val="single" w:color="000000" w:sz="6" w:space="0"/>
-          <w:right w:val="single" w:color="000000" w:sz="6" w:space="0"/>
-          <w:insideH w:val="single" w:color="000000" w:sz="6" w:space="0"/>
-          <w:insideV w:val="single" w:color="000000" w:sz="6" w:space="0"/>
+          <w:top w:val="single" w:sz="6" w:space="0" w:color="000000"/>
+          <w:left w:val="single" w:sz="6" w:space="0" w:color="000000"/>
+          <w:bottom w:val="single" w:sz="6" w:space="0" w:color="000000"/>
+          <w:right w:val="single" w:sz="6" w:space="0" w:color="000000"/>
+          <w:insideH w:val="single" w:sz="6" w:space="0" w:color="000000"/>
+          <w:insideV w:val="single" w:sz="6" w:space="0" w:color="000000"/>
         </w:tblBorders>
         <w:tblLayout w:type="fixed"/>
         <w:tblLook w:val="0000" w:firstRow="0" w:lastRow="0" w:firstColumn="0" w:lastColumn="0" w:noHBand="0" w:noVBand="0"/>
@@ -2960,7 +2666,6 @@
           <w:tcPr>
             <w:tcW w:w="9468" w:type="dxa"/>
             <w:shd w:val="clear" w:color="auto" w:fill="D9D9D9" w:themeFill="background1" w:themeFillShade="D9"/>
-            <w:tcMar/>
           </w:tcPr>
           <w:p>
             <w:pPr>
@@ -2986,6 +2691,7 @@
                 <w:sz w:val="22"/>
                 <w:szCs w:val="22"/>
               </w:rPr>
+              <w:lastRenderedPageBreak/>
               <w:t>Reglas de negocio</w:t>
             </w:r>
           </w:p>
@@ -2995,88 +2701,55 @@
         <w:tc>
           <w:tcPr>
             <w:tcW w:w="9468" w:type="dxa"/>
-            <w:tcMar/>
-          </w:tcPr>
-          <w:p>
-            <w:pPr>
-              <w:pStyle w:val="ListParagraph"/>
+          </w:tcPr>
+          <w:p>
+            <w:pPr>
+              <w:pStyle w:val="Prrafodelista"/>
               <w:numPr>
                 <w:ilvl w:val="0"/>
-                <w:numId w:val="8"/>
+                <w:numId w:val="9"/>
               </w:numPr>
-              <w:rPr>
-                <w:noProof w:val="0"/>
-                <w:lang w:val="es"/>
-              </w:rPr>
-            </w:pPr>
-            <w:r>
-              <w:rPr>
-                <w:noProof w:val="0"/>
-                <w:lang w:val="es"/>
-              </w:rPr>
+            </w:pPr>
+            <w:r>
               <w:t>No se debe continuar el proceso si el mensaje no ha sido confirmado como entregado.</w:t>
             </w:r>
           </w:p>
           <w:p>
             <w:pPr>
-              <w:pStyle w:val="ListParagraph"/>
+              <w:pStyle w:val="Prrafodelista"/>
               <w:numPr>
                 <w:ilvl w:val="0"/>
-                <w:numId w:val="8"/>
+                <w:numId w:val="9"/>
               </w:numPr>
-              <w:spacing w:before="0" w:beforeAutospacing="off" w:after="0" w:afterAutospacing="off"/>
-              <w:rPr>
-                <w:noProof w:val="0"/>
-                <w:lang w:val="es"/>
-              </w:rPr>
-            </w:pPr>
-            <w:r>
-              <w:rPr>
-                <w:noProof w:val="0"/>
-                <w:lang w:val="es"/>
-              </w:rPr>
+              <w:spacing w:before="0" w:after="0"/>
+            </w:pPr>
+            <w:r>
               <w:t>Solo publicadores autorizados y conectados pueden enviar mensajes al intermediario.</w:t>
             </w:r>
           </w:p>
           <w:p>
             <w:pPr>
-              <w:pStyle w:val="ListParagraph"/>
+              <w:pStyle w:val="Prrafodelista"/>
               <w:numPr>
                 <w:ilvl w:val="0"/>
-                <w:numId w:val="8"/>
+                <w:numId w:val="9"/>
               </w:numPr>
-              <w:spacing w:before="0" w:beforeAutospacing="off" w:after="0" w:afterAutospacing="off"/>
-              <w:rPr>
-                <w:noProof w:val="0"/>
-                <w:lang w:val="es"/>
-              </w:rPr>
-            </w:pPr>
-            <w:r>
-              <w:rPr>
-                <w:noProof w:val="0"/>
-                <w:lang w:val="es"/>
-              </w:rPr>
+              <w:spacing w:before="0" w:after="0"/>
+            </w:pPr>
+            <w:r>
               <w:t>Cada mensaje enviado debe contener la información completa requerida para su distribución.</w:t>
             </w:r>
           </w:p>
           <w:p>
             <w:pPr>
-              <w:pStyle w:val="ListParagraph"/>
+              <w:pStyle w:val="Prrafodelista"/>
               <w:numPr>
                 <w:ilvl w:val="0"/>
-                <w:numId w:val="8"/>
+                <w:numId w:val="9"/>
               </w:numPr>
-              <w:spacing w:before="0" w:beforeAutospacing="off" w:after="0" w:afterAutospacing="off"/>
-              <w:rPr>
-                <w:noProof w:val="0"/>
-                <w:lang w:val="es"/>
-              </w:rPr>
-            </w:pPr>
-            <w:r>
-              <w:rPr>
-                <w:noProof w:val="0"/>
-                <w:lang w:val="es"/>
-              </w:rPr>
+              <w:spacing w:before="0" w:after="0"/>
+            </w:pPr>
+            <w:r>
               <w:t>La estructura del mensaje debe ser consistente para todos los consumidores del intermediario.</w:t>
             </w:r>
           </w:p>
@@ -3093,7 +2766,7 @@
           <w:between w:val="nil"/>
         </w:pBdr>
         <w:rPr>
-          <w:rFonts w:ascii="Arial" w:hAnsi="Arial" w:eastAsia="Arial" w:cs="Arial"/>
+          <w:rFonts w:ascii="Arial" w:eastAsia="Arial" w:hAnsi="Arial" w:cs="Arial"/>
           <w:sz w:val="22"/>
           <w:szCs w:val="22"/>
         </w:rPr>
@@ -3109,7 +2782,7 @@
           <w:between w:val="nil"/>
         </w:pBdr>
         <w:rPr>
-          <w:rFonts w:ascii="Arial" w:hAnsi="Arial" w:eastAsia="Arial" w:cs="Arial"/>
+          <w:rFonts w:ascii="Arial" w:eastAsia="Arial" w:hAnsi="Arial" w:cs="Arial"/>
           <w:sz w:val="22"/>
           <w:szCs w:val="22"/>
         </w:rPr>
@@ -3118,12 +2791,12 @@
     <w:p/>
     <w:p>
       <w:pPr>
-        <w:pStyle w:val="Heading1"/>
+        <w:pStyle w:val="Ttulo1"/>
         <w:rPr>
           <w:color w:val="auto"/>
         </w:rPr>
       </w:pPr>
-      <w:bookmarkStart w:name="_9qgeerv2zm6v" w:id="2"/>
+      <w:bookmarkStart w:id="2" w:name="_9qgeerv2zm6v"/>
       <w:bookmarkEnd w:id="2"/>
       <w:r>
         <w:rPr>
@@ -3134,16 +2807,16 @@
     </w:p>
     <w:p/>
     <w:sectPr>
+      <w:headerReference w:type="default" r:id="rId7"/>
       <w:footerReference w:type="even" r:id="rId8"/>
       <w:footerReference w:type="default" r:id="rId9"/>
-      <w:footerReference w:type="first" r:id="rId10"/>
-      <w:pgSz w:w="12240" w:h="20160" w:orient="portrait"/>
+      <w:headerReference w:type="first" r:id="rId10"/>
+      <w:footerReference w:type="first" r:id="rId11"/>
+      <w:pgSz w:w="12240" w:h="20160"/>
       <w:pgMar w:top="900" w:right="1440" w:bottom="450" w:left="1440" w:header="720" w:footer="720" w:gutter="0"/>
       <w:pgNumType w:start="1"/>
       <w:cols w:space="720"/>
       <w:titlePg/>
-      <w:headerReference w:type="default" r:id="R40c6066ba8704970"/>
-      <w:headerReference w:type="first" r:id="R4122b742520744b1"/>
     </w:sectPr>
   </w:body>
 </w:document>
@@ -3175,10 +2848,10 @@
 </file>
 
 <file path=word/footer1.xml><?xml version="1.0" encoding="utf-8"?>
-<w:ftr xmlns:wpc="http://schemas.microsoft.com/office/word/2010/wordprocessingCanvas" xmlns:cx="http://schemas.microsoft.com/office/drawing/2014/chartex" xmlns:cx1="http://schemas.microsoft.com/office/drawing/2015/9/8/chartex" xmlns:cx2="http://schemas.microsoft.com/office/drawing/2015/10/21/chartex" xmlns:cx3="http://schemas.microsoft.com/office/drawing/2016/5/9/chartex" xmlns:cx4="http://schemas.microsoft.com/office/drawing/2016/5/10/chartex" xmlns:cx5="http://schemas.microsoft.com/office/drawing/2016/5/11/chartex" xmlns:cx6="http://schemas.microsoft.com/office/drawing/2016/5/12/chartex" xmlns:cx7="http://schemas.microsoft.com/office/drawing/2016/5/13/chartex" xmlns:cx8="http://schemas.microsoft.com/office/drawing/2016/5/14/chartex" xmlns:mc="http://schemas.openxmlformats.org/markup-compatibility/2006" xmlns:aink="http://schemas.microsoft.com/office/drawing/2016/ink" xmlns:am3d="http://schemas.microsoft.com/office/drawing/2017/model3d" xmlns:o="urn:schemas-microsoft-com:office:office" xmlns:oel="http://schemas.microsoft.com/office/2019/extlst" xmlns:r="http://schemas.openxmlformats.org/officeDocument/2006/relationships" xmlns:m="http://schemas.openxmlformats.org/officeDocument/2006/math" xmlns:v="urn:schemas-microsoft-com:vml" xmlns:wp14="http://schemas.microsoft.com/office/word/2010/wordprocessingDrawing" xmlns:wp="http://schemas.openxmlformats.org/drawingml/2006/wordprocessingDrawing" xmlns:w10="urn:schemas-microsoft-com:office:word" xmlns:w="http://schemas.openxmlformats.org/wordprocessingml/2006/main" xmlns:w14="http://schemas.microsoft.com/office/word/2010/wordml" xmlns:w15="http://schemas.microsoft.com/office/word/2012/wordml" xmlns:w16cex="http://schemas.microsoft.com/office/word/2018/wordml/cex" xmlns:w16cid="http://schemas.microsoft.com/office/word/2016/wordml/cid" xmlns:w16="http://schemas.microsoft.com/office/word/2018/wordml" xmlns:w16du="http://schemas.microsoft.com/office/word/2023/wordml/word16du" xmlns:w16sdtdh="http://schemas.microsoft.com/office/word/2020/wordml/sdtdatahash" xmlns:w16sdtfl="http://schemas.microsoft.com/office/word/2024/wordml/sdtformatlock" xmlns:w16se="http://schemas.microsoft.com/office/word/2015/wordml/symex" xmlns:wpg="http://schemas.microsoft.com/office/word/2010/wordprocessingGroup" xmlns:wpi="http://schemas.microsoft.com/office/word/2010/wordprocessingInk" xmlns:wne="http://schemas.microsoft.com/office/word/2006/wordml" xmlns:wps="http://schemas.microsoft.com/office/word/2010/wordprocessingShape" xmlns:a="http://schemas.openxmlformats.org/drawingml/2006/main" xmlns:aclsh="http://schemas.microsoft.com/office/drawing/2020/classificationShape" mc:Ignorable="w14 w15 w16se w16cid w16 w16cex w16sdtdh w16sdtfl w16du wp14">
+<w:ftr xmlns:wpc="http://schemas.microsoft.com/office/word/2010/wordprocessingCanvas" xmlns:cx="http://schemas.microsoft.com/office/drawing/2014/chartex" xmlns:cx1="http://schemas.microsoft.com/office/drawing/2015/9/8/chartex" xmlns:cx2="http://schemas.microsoft.com/office/drawing/2015/10/21/chartex" xmlns:cx3="http://schemas.microsoft.com/office/drawing/2016/5/9/chartex" xmlns:cx4="http://schemas.microsoft.com/office/drawing/2016/5/10/chartex" xmlns:cx5="http://schemas.microsoft.com/office/drawing/2016/5/11/chartex" xmlns:cx6="http://schemas.microsoft.com/office/drawing/2016/5/12/chartex" xmlns:cx7="http://schemas.microsoft.com/office/drawing/2016/5/13/chartex" xmlns:cx8="http://schemas.microsoft.com/office/drawing/2016/5/14/chartex" xmlns:mc="http://schemas.openxmlformats.org/markup-compatibility/2006" xmlns:aink="http://schemas.microsoft.com/office/drawing/2016/ink" xmlns:am3d="http://schemas.microsoft.com/office/drawing/2017/model3d" xmlns:o="urn:schemas-microsoft-com:office:office" xmlns:oel="http://schemas.microsoft.com/office/2019/extlst" xmlns:r="http://schemas.openxmlformats.org/officeDocument/2006/relationships" xmlns:m="http://schemas.openxmlformats.org/officeDocument/2006/math" xmlns:v="urn:schemas-microsoft-com:vml" xmlns:wp14="http://schemas.microsoft.com/office/word/2010/wordprocessingDrawing" xmlns:wp="http://schemas.openxmlformats.org/drawingml/2006/wordprocessingDrawing" xmlns:w10="urn:schemas-microsoft-com:office:word" xmlns:w="http://schemas.openxmlformats.org/wordprocessingml/2006/main" xmlns:w14="http://schemas.microsoft.com/office/word/2010/wordml" xmlns:w15="http://schemas.microsoft.com/office/word/2012/wordml" xmlns:w16cex="http://schemas.microsoft.com/office/word/2018/wordml/cex" xmlns:w16cid="http://schemas.microsoft.com/office/word/2016/wordml/cid" xmlns:w16="http://schemas.microsoft.com/office/word/2018/wordml" xmlns:w16du="http://schemas.microsoft.com/office/word/2023/wordml/word16du" xmlns:w16sdtdh="http://schemas.microsoft.com/office/word/2020/wordml/sdtdatahash" xmlns:w16sdtfl="http://schemas.microsoft.com/office/word/2024/wordml/sdtformatlock" xmlns:w16se="http://schemas.microsoft.com/office/word/2015/wordml/symex" xmlns:wpg="http://schemas.microsoft.com/office/word/2010/wordprocessingGroup" xmlns:wpi="http://schemas.microsoft.com/office/word/2010/wordprocessingInk" xmlns:wne="http://schemas.microsoft.com/office/word/2006/wordml" xmlns:wps="http://schemas.microsoft.com/office/word/2010/wordprocessingShape" mc:Ignorable="w14 w15 w16se w16cid w16 w16cex w16sdtdh w16sdtfl w16du wp14">
   <w:p>
     <w:pPr>
-      <w:pStyle w:val="Footer"/>
+      <w:pStyle w:val="Piedepgina"/>
     </w:pPr>
     <w:r>
       <w:rPr>
@@ -3229,7 +2902,7 @@
                           <w:pPr>
                             <w:spacing w:after="0"/>
                             <w:rPr>
-                              <w:rFonts w:ascii="Aptos" w:hAnsi="Aptos" w:eastAsia="Aptos" w:cs="Aptos"/>
+                              <w:rFonts w:ascii="Aptos" w:eastAsia="Aptos" w:hAnsi="Aptos" w:cs="Aptos"/>
                               <w:noProof/>
                               <w:color w:val="000000"/>
                               <w:sz w:val="20"/>
@@ -3238,7 +2911,7 @@
                           </w:pPr>
                           <w:r>
                             <w:rPr>
-                              <w:rFonts w:ascii="Aptos" w:hAnsi="Aptos" w:eastAsia="Aptos" w:cs="Aptos"/>
+                              <w:rFonts w:ascii="Aptos" w:eastAsia="Aptos" w:hAnsi="Aptos" w:cs="Aptos"/>
                               <w:noProof/>
                               <w:color w:val="000000"/>
                               <w:sz w:val="20"/>
@@ -3261,7 +2934,7 @@
             </wp:anchor>
           </w:drawing>
         </mc:Choice>
-        <mc:Fallback>
+        <mc:Fallback xmlns:aclsh="http://schemas.microsoft.com/office/drawing/2020/classificationShape" xmlns:a="http://schemas.openxmlformats.org/drawingml/2006/main">
           <w:pict>
             <v:shapetype id="_x0000_t202" coordsize="21600,21600" o:spt="202" path="m,l,21600r21600,l21600,xe" w14:anchorId="3B249E87">
               <v:stroke joinstyle="miter"/>
@@ -3306,7 +2979,7 @@
 </file>
 
 <file path=word/footer2.xml><?xml version="1.0" encoding="utf-8"?>
-<w:ftr xmlns:wpc="http://schemas.microsoft.com/office/word/2010/wordprocessingCanvas" xmlns:cx="http://schemas.microsoft.com/office/drawing/2014/chartex" xmlns:cx1="http://schemas.microsoft.com/office/drawing/2015/9/8/chartex" xmlns:cx2="http://schemas.microsoft.com/office/drawing/2015/10/21/chartex" xmlns:cx3="http://schemas.microsoft.com/office/drawing/2016/5/9/chartex" xmlns:cx4="http://schemas.microsoft.com/office/drawing/2016/5/10/chartex" xmlns:cx5="http://schemas.microsoft.com/office/drawing/2016/5/11/chartex" xmlns:cx6="http://schemas.microsoft.com/office/drawing/2016/5/12/chartex" xmlns:cx7="http://schemas.microsoft.com/office/drawing/2016/5/13/chartex" xmlns:cx8="http://schemas.microsoft.com/office/drawing/2016/5/14/chartex" xmlns:mc="http://schemas.openxmlformats.org/markup-compatibility/2006" xmlns:aink="http://schemas.microsoft.com/office/drawing/2016/ink" xmlns:am3d="http://schemas.microsoft.com/office/drawing/2017/model3d" xmlns:o="urn:schemas-microsoft-com:office:office" xmlns:oel="http://schemas.microsoft.com/office/2019/extlst" xmlns:r="http://schemas.openxmlformats.org/officeDocument/2006/relationships" xmlns:m="http://schemas.openxmlformats.org/officeDocument/2006/math" xmlns:v="urn:schemas-microsoft-com:vml" xmlns:wp14="http://schemas.microsoft.com/office/word/2010/wordprocessingDrawing" xmlns:wp="http://schemas.openxmlformats.org/drawingml/2006/wordprocessingDrawing" xmlns:w10="urn:schemas-microsoft-com:office:word" xmlns:w="http://schemas.openxmlformats.org/wordprocessingml/2006/main" xmlns:w14="http://schemas.microsoft.com/office/word/2010/wordml" xmlns:w15="http://schemas.microsoft.com/office/word/2012/wordml" xmlns:w16cex="http://schemas.microsoft.com/office/word/2018/wordml/cex" xmlns:w16cid="http://schemas.microsoft.com/office/word/2016/wordml/cid" xmlns:w16="http://schemas.microsoft.com/office/word/2018/wordml" xmlns:w16du="http://schemas.microsoft.com/office/word/2023/wordml/word16du" xmlns:w16sdtdh="http://schemas.microsoft.com/office/word/2020/wordml/sdtdatahash" xmlns:w16sdtfl="http://schemas.microsoft.com/office/word/2024/wordml/sdtformatlock" xmlns:w16se="http://schemas.microsoft.com/office/word/2015/wordml/symex" xmlns:wpg="http://schemas.microsoft.com/office/word/2010/wordprocessingGroup" xmlns:wpi="http://schemas.microsoft.com/office/word/2010/wordprocessingInk" xmlns:wne="http://schemas.microsoft.com/office/word/2006/wordml" xmlns:wps="http://schemas.microsoft.com/office/word/2010/wordprocessingShape" xmlns:a="http://schemas.openxmlformats.org/drawingml/2006/main" xmlns:aclsh="http://schemas.microsoft.com/office/drawing/2020/classificationShape" mc:Ignorable="w14 w15 w16se w16cid w16 w16cex w16sdtdh w16sdtfl w16du wp14">
+<w:ftr xmlns:wpc="http://schemas.microsoft.com/office/word/2010/wordprocessingCanvas" xmlns:cx="http://schemas.microsoft.com/office/drawing/2014/chartex" xmlns:cx1="http://schemas.microsoft.com/office/drawing/2015/9/8/chartex" xmlns:cx2="http://schemas.microsoft.com/office/drawing/2015/10/21/chartex" xmlns:cx3="http://schemas.microsoft.com/office/drawing/2016/5/9/chartex" xmlns:cx4="http://schemas.microsoft.com/office/drawing/2016/5/10/chartex" xmlns:cx5="http://schemas.microsoft.com/office/drawing/2016/5/11/chartex" xmlns:cx6="http://schemas.microsoft.com/office/drawing/2016/5/12/chartex" xmlns:cx7="http://schemas.microsoft.com/office/drawing/2016/5/13/chartex" xmlns:cx8="http://schemas.microsoft.com/office/drawing/2016/5/14/chartex" xmlns:mc="http://schemas.openxmlformats.org/markup-compatibility/2006" xmlns:aink="http://schemas.microsoft.com/office/drawing/2016/ink" xmlns:am3d="http://schemas.microsoft.com/office/drawing/2017/model3d" xmlns:o="urn:schemas-microsoft-com:office:office" xmlns:oel="http://schemas.microsoft.com/office/2019/extlst" xmlns:r="http://schemas.openxmlformats.org/officeDocument/2006/relationships" xmlns:m="http://schemas.openxmlformats.org/officeDocument/2006/math" xmlns:v="urn:schemas-microsoft-com:vml" xmlns:wp14="http://schemas.microsoft.com/office/word/2010/wordprocessingDrawing" xmlns:wp="http://schemas.openxmlformats.org/drawingml/2006/wordprocessingDrawing" xmlns:w10="urn:schemas-microsoft-com:office:word" xmlns:w="http://schemas.openxmlformats.org/wordprocessingml/2006/main" xmlns:w14="http://schemas.microsoft.com/office/word/2010/wordml" xmlns:w15="http://schemas.microsoft.com/office/word/2012/wordml" xmlns:w16cex="http://schemas.microsoft.com/office/word/2018/wordml/cex" xmlns:w16cid="http://schemas.microsoft.com/office/word/2016/wordml/cid" xmlns:w16="http://schemas.microsoft.com/office/word/2018/wordml" xmlns:w16du="http://schemas.microsoft.com/office/word/2023/wordml/word16du" xmlns:w16sdtdh="http://schemas.microsoft.com/office/word/2020/wordml/sdtdatahash" xmlns:w16sdtfl="http://schemas.microsoft.com/office/word/2024/wordml/sdtformatlock" xmlns:w16se="http://schemas.microsoft.com/office/word/2015/wordml/symex" xmlns:wpg="http://schemas.microsoft.com/office/word/2010/wordprocessingGroup" xmlns:wpi="http://schemas.microsoft.com/office/word/2010/wordprocessingInk" xmlns:wne="http://schemas.microsoft.com/office/word/2006/wordml" xmlns:wps="http://schemas.microsoft.com/office/word/2010/wordprocessingShape" mc:Ignorable="w14 w15 w16se w16cid w16 w16cex w16sdtdh w16sdtfl w16du wp14">
   <w:p>
     <w:pPr>
       <w:pBdr>
@@ -3374,7 +3047,7 @@
                           <w:pPr>
                             <w:spacing w:after="0"/>
                             <w:rPr>
-                              <w:rFonts w:ascii="Aptos" w:hAnsi="Aptos" w:eastAsia="Aptos" w:cs="Aptos"/>
+                              <w:rFonts w:ascii="Aptos" w:eastAsia="Aptos" w:hAnsi="Aptos" w:cs="Aptos"/>
                               <w:noProof/>
                               <w:color w:val="000000"/>
                               <w:sz w:val="20"/>
@@ -3383,7 +3056,7 @@
                           </w:pPr>
                           <w:r>
                             <w:rPr>
-                              <w:rFonts w:ascii="Aptos" w:hAnsi="Aptos" w:eastAsia="Aptos" w:cs="Aptos"/>
+                              <w:rFonts w:ascii="Aptos" w:eastAsia="Aptos" w:hAnsi="Aptos" w:cs="Aptos"/>
                               <w:noProof/>
                               <w:color w:val="000000"/>
                               <w:sz w:val="20"/>
@@ -3406,7 +3079,7 @@
             </wp:anchor>
           </w:drawing>
         </mc:Choice>
-        <mc:Fallback>
+        <mc:Fallback xmlns:aclsh="http://schemas.microsoft.com/office/drawing/2020/classificationShape" xmlns:a="http://schemas.openxmlformats.org/drawingml/2006/main">
           <w:pict>
             <v:shapetype id="_x0000_t202" coordsize="21600,21600" o:spt="202" path="m,l,21600r21600,l21600,xe" w14:anchorId="4CBEB5AC">
               <v:stroke joinstyle="miter"/>
@@ -3571,10 +3244,10 @@
 </file>
 
 <file path=word/footer3.xml><?xml version="1.0" encoding="utf-8"?>
-<w:ftr xmlns:wpc="http://schemas.microsoft.com/office/word/2010/wordprocessingCanvas" xmlns:cx="http://schemas.microsoft.com/office/drawing/2014/chartex" xmlns:cx1="http://schemas.microsoft.com/office/drawing/2015/9/8/chartex" xmlns:cx2="http://schemas.microsoft.com/office/drawing/2015/10/21/chartex" xmlns:cx3="http://schemas.microsoft.com/office/drawing/2016/5/9/chartex" xmlns:cx4="http://schemas.microsoft.com/office/drawing/2016/5/10/chartex" xmlns:cx5="http://schemas.microsoft.com/office/drawing/2016/5/11/chartex" xmlns:cx6="http://schemas.microsoft.com/office/drawing/2016/5/12/chartex" xmlns:cx7="http://schemas.microsoft.com/office/drawing/2016/5/13/chartex" xmlns:cx8="http://schemas.microsoft.com/office/drawing/2016/5/14/chartex" xmlns:mc="http://schemas.openxmlformats.org/markup-compatibility/2006" xmlns:aink="http://schemas.microsoft.com/office/drawing/2016/ink" xmlns:am3d="http://schemas.microsoft.com/office/drawing/2017/model3d" xmlns:o="urn:schemas-microsoft-com:office:office" xmlns:oel="http://schemas.microsoft.com/office/2019/extlst" xmlns:r="http://schemas.openxmlformats.org/officeDocument/2006/relationships" xmlns:m="http://schemas.openxmlformats.org/officeDocument/2006/math" xmlns:v="urn:schemas-microsoft-com:vml" xmlns:wp14="http://schemas.microsoft.com/office/word/2010/wordprocessingDrawing" xmlns:wp="http://schemas.openxmlformats.org/drawingml/2006/wordprocessingDrawing" xmlns:w10="urn:schemas-microsoft-com:office:word" xmlns:w="http://schemas.openxmlformats.org/wordprocessingml/2006/main" xmlns:w14="http://schemas.microsoft.com/office/word/2010/wordml" xmlns:w15="http://schemas.microsoft.com/office/word/2012/wordml" xmlns:w16cex="http://schemas.microsoft.com/office/word/2018/wordml/cex" xmlns:w16cid="http://schemas.microsoft.com/office/word/2016/wordml/cid" xmlns:w16="http://schemas.microsoft.com/office/word/2018/wordml" xmlns:w16du="http://schemas.microsoft.com/office/word/2023/wordml/word16du" xmlns:w16sdtdh="http://schemas.microsoft.com/office/word/2020/wordml/sdtdatahash" xmlns:w16sdtfl="http://schemas.microsoft.com/office/word/2024/wordml/sdtformatlock" xmlns:w16se="http://schemas.microsoft.com/office/word/2015/wordml/symex" xmlns:wpg="http://schemas.microsoft.com/office/word/2010/wordprocessingGroup" xmlns:wpi="http://schemas.microsoft.com/office/word/2010/wordprocessingInk" xmlns:wne="http://schemas.microsoft.com/office/word/2006/wordml" xmlns:wps="http://schemas.microsoft.com/office/word/2010/wordprocessingShape" xmlns:a="http://schemas.openxmlformats.org/drawingml/2006/main" xmlns:aclsh="http://schemas.microsoft.com/office/drawing/2020/classificationShape" mc:Ignorable="w14 w15 w16se w16cid w16 w16cex w16sdtdh w16sdtfl w16du wp14">
+<w:ftr xmlns:wpc="http://schemas.microsoft.com/office/word/2010/wordprocessingCanvas" xmlns:cx="http://schemas.microsoft.com/office/drawing/2014/chartex" xmlns:cx1="http://schemas.microsoft.com/office/drawing/2015/9/8/chartex" xmlns:cx2="http://schemas.microsoft.com/office/drawing/2015/10/21/chartex" xmlns:cx3="http://schemas.microsoft.com/office/drawing/2016/5/9/chartex" xmlns:cx4="http://schemas.microsoft.com/office/drawing/2016/5/10/chartex" xmlns:cx5="http://schemas.microsoft.com/office/drawing/2016/5/11/chartex" xmlns:cx6="http://schemas.microsoft.com/office/drawing/2016/5/12/chartex" xmlns:cx7="http://schemas.microsoft.com/office/drawing/2016/5/13/chartex" xmlns:cx8="http://schemas.microsoft.com/office/drawing/2016/5/14/chartex" xmlns:mc="http://schemas.openxmlformats.org/markup-compatibility/2006" xmlns:aink="http://schemas.microsoft.com/office/drawing/2016/ink" xmlns:am3d="http://schemas.microsoft.com/office/drawing/2017/model3d" xmlns:o="urn:schemas-microsoft-com:office:office" xmlns:oel="http://schemas.microsoft.com/office/2019/extlst" xmlns:r="http://schemas.openxmlformats.org/officeDocument/2006/relationships" xmlns:m="http://schemas.openxmlformats.org/officeDocument/2006/math" xmlns:v="urn:schemas-microsoft-com:vml" xmlns:wp14="http://schemas.microsoft.com/office/word/2010/wordprocessingDrawing" xmlns:wp="http://schemas.openxmlformats.org/drawingml/2006/wordprocessingDrawing" xmlns:w10="urn:schemas-microsoft-com:office:word" xmlns:w="http://schemas.openxmlformats.org/wordprocessingml/2006/main" xmlns:w14="http://schemas.microsoft.com/office/word/2010/wordml" xmlns:w15="http://schemas.microsoft.com/office/word/2012/wordml" xmlns:w16cex="http://schemas.microsoft.com/office/word/2018/wordml/cex" xmlns:w16cid="http://schemas.microsoft.com/office/word/2016/wordml/cid" xmlns:w16="http://schemas.microsoft.com/office/word/2018/wordml" xmlns:w16du="http://schemas.microsoft.com/office/word/2023/wordml/word16du" xmlns:w16sdtdh="http://schemas.microsoft.com/office/word/2020/wordml/sdtdatahash" xmlns:w16sdtfl="http://schemas.microsoft.com/office/word/2024/wordml/sdtformatlock" xmlns:w16se="http://schemas.microsoft.com/office/word/2015/wordml/symex" xmlns:wpg="http://schemas.microsoft.com/office/word/2010/wordprocessingGroup" xmlns:wpi="http://schemas.microsoft.com/office/word/2010/wordprocessingInk" xmlns:wne="http://schemas.microsoft.com/office/word/2006/wordml" xmlns:wps="http://schemas.microsoft.com/office/word/2010/wordprocessingShape" mc:Ignorable="w14 w15 w16se w16cid w16 w16cex w16sdtdh w16sdtfl w16du wp14">
   <w:p>
     <w:pPr>
-      <w:pStyle w:val="Footer"/>
+      <w:pStyle w:val="Piedepgina"/>
     </w:pPr>
     <w:r>
       <w:rPr>
@@ -3625,7 +3298,7 @@
                           <w:pPr>
                             <w:spacing w:after="0"/>
                             <w:rPr>
-                              <w:rFonts w:ascii="Aptos" w:hAnsi="Aptos" w:eastAsia="Aptos" w:cs="Aptos"/>
+                              <w:rFonts w:ascii="Aptos" w:eastAsia="Aptos" w:hAnsi="Aptos" w:cs="Aptos"/>
                               <w:noProof/>
                               <w:color w:val="000000"/>
                               <w:sz w:val="20"/>
@@ -3634,7 +3307,7 @@
                           </w:pPr>
                           <w:r>
                             <w:rPr>
-                              <w:rFonts w:ascii="Aptos" w:hAnsi="Aptos" w:eastAsia="Aptos" w:cs="Aptos"/>
+                              <w:rFonts w:ascii="Aptos" w:eastAsia="Aptos" w:hAnsi="Aptos" w:cs="Aptos"/>
                               <w:noProof/>
                               <w:color w:val="000000"/>
                               <w:sz w:val="20"/>
@@ -3657,7 +3330,7 @@
             </wp:anchor>
           </w:drawing>
         </mc:Choice>
-        <mc:Fallback>
+        <mc:Fallback xmlns:aclsh="http://schemas.microsoft.com/office/drawing/2020/classificationShape" xmlns:a="http://schemas.openxmlformats.org/drawingml/2006/main">
           <w:pict>
             <v:shapetype id="_x0000_t202" coordsize="21600,21600" o:spt="202" path="m,l,21600r21600,l21600,xe" w14:anchorId="5CBDF615">
               <v:stroke joinstyle="miter"/>
@@ -3726,12 +3399,10 @@
 </w:footnotes>
 </file>
 
-<file path=word/header2.xml><?xml version="1.0" encoding="utf-8"?>
-<w:hdr xmlns:w14="http://schemas.microsoft.com/office/word/2010/wordml" xmlns:w="http://schemas.openxmlformats.org/wordprocessingml/2006/main">
+<file path=word/header1.xml><?xml version="1.0" encoding="utf-8"?>
+<w:hdr xmlns:wpc="http://schemas.microsoft.com/office/word/2010/wordprocessingCanvas" xmlns:cx="http://schemas.microsoft.com/office/drawing/2014/chartex" xmlns:cx1="http://schemas.microsoft.com/office/drawing/2015/9/8/chartex" xmlns:cx2="http://schemas.microsoft.com/office/drawing/2015/10/21/chartex" xmlns:cx3="http://schemas.microsoft.com/office/drawing/2016/5/9/chartex" xmlns:cx4="http://schemas.microsoft.com/office/drawing/2016/5/10/chartex" xmlns:cx5="http://schemas.microsoft.com/office/drawing/2016/5/11/chartex" xmlns:cx6="http://schemas.microsoft.com/office/drawing/2016/5/12/chartex" xmlns:cx7="http://schemas.microsoft.com/office/drawing/2016/5/13/chartex" xmlns:cx8="http://schemas.microsoft.com/office/drawing/2016/5/14/chartex" xmlns:mc="http://schemas.openxmlformats.org/markup-compatibility/2006" xmlns:aink="http://schemas.microsoft.com/office/drawing/2016/ink" xmlns:am3d="http://schemas.microsoft.com/office/drawing/2017/model3d" xmlns:o="urn:schemas-microsoft-com:office:office" xmlns:oel="http://schemas.microsoft.com/office/2019/extlst" xmlns:r="http://schemas.openxmlformats.org/officeDocument/2006/relationships" xmlns:m="http://schemas.openxmlformats.org/officeDocument/2006/math" xmlns:v="urn:schemas-microsoft-com:vml" xmlns:wp14="http://schemas.microsoft.com/office/word/2010/wordprocessingDrawing" xmlns:wp="http://schemas.openxmlformats.org/drawingml/2006/wordprocessingDrawing" xmlns:w10="urn:schemas-microsoft-com:office:word" xmlns:w="http://schemas.openxmlformats.org/wordprocessingml/2006/main" xmlns:w14="http://schemas.microsoft.com/office/word/2010/wordml" xmlns:w15="http://schemas.microsoft.com/office/word/2012/wordml" xmlns:w16cex="http://schemas.microsoft.com/office/word/2018/wordml/cex" xmlns:w16cid="http://schemas.microsoft.com/office/word/2016/wordml/cid" xmlns:w16="http://schemas.microsoft.com/office/word/2018/wordml" xmlns:w16du="http://schemas.microsoft.com/office/word/2023/wordml/word16du" xmlns:w16sdtdh="http://schemas.microsoft.com/office/word/2020/wordml/sdtdatahash" xmlns:w16sdtfl="http://schemas.microsoft.com/office/word/2024/wordml/sdtformatlock" xmlns:w16se="http://schemas.microsoft.com/office/word/2015/wordml/symex" xmlns:wpg="http://schemas.microsoft.com/office/word/2010/wordprocessingGroup" xmlns:wpi="http://schemas.microsoft.com/office/word/2010/wordprocessingInk" xmlns:wne="http://schemas.microsoft.com/office/word/2006/wordml" xmlns:wps="http://schemas.microsoft.com/office/word/2010/wordprocessingShape" mc:Ignorable="w14 w15 w16se w16cid w16 w16cex w16sdtdh w16sdtfl w16du wp14">
   <w:tbl>
     <w:tblPr>
-      <w:tblStyle w:val="TableNormal"/>
-      <w:bidiVisual w:val="0"/>
       <w:tblW w:w="0" w:type="auto"/>
       <w:tblLook w:val="06A0" w:firstRow="1" w:lastRow="0" w:firstColumn="1" w:lastColumn="0" w:noHBand="1" w:noVBand="1"/>
     </w:tblPr>
@@ -3747,26 +3418,21 @@
       <w:tc>
         <w:tcPr>
           <w:tcW w:w="3120" w:type="dxa"/>
-          <w:tcMar/>
         </w:tcPr>
         <w:p>
           <w:pPr>
-            <w:pStyle w:val="Header"/>
-            <w:bidi w:val="0"/>
+            <w:pStyle w:val="Encabezado"/>
             <w:ind w:left="-115"/>
-            <w:jc w:val="left"/>
           </w:pPr>
         </w:p>
       </w:tc>
       <w:tc>
         <w:tcPr>
           <w:tcW w:w="3120" w:type="dxa"/>
-          <w:tcMar/>
         </w:tcPr>
         <w:p>
           <w:pPr>
-            <w:pStyle w:val="Header"/>
-            <w:bidi w:val="0"/>
+            <w:pStyle w:val="Encabezado"/>
             <w:jc w:val="center"/>
           </w:pPr>
         </w:p>
@@ -3774,12 +3440,10 @@
       <w:tc>
         <w:tcPr>
           <w:tcW w:w="3120" w:type="dxa"/>
-          <w:tcMar/>
         </w:tcPr>
         <w:p>
           <w:pPr>
-            <w:pStyle w:val="Header"/>
-            <w:bidi w:val="0"/>
+            <w:pStyle w:val="Encabezado"/>
             <w:ind w:right="-115"/>
             <w:jc w:val="right"/>
           </w:pPr>
@@ -3789,19 +3453,16 @@
   </w:tbl>
   <w:p>
     <w:pPr>
-      <w:pStyle w:val="Header"/>
-      <w:bidi w:val="0"/>
+      <w:pStyle w:val="Encabezado"/>
     </w:pPr>
   </w:p>
 </w:hdr>
 </file>
 
-<file path=word/header3.xml><?xml version="1.0" encoding="utf-8"?>
-<w:hdr xmlns:w14="http://schemas.microsoft.com/office/word/2010/wordml" xmlns:wp="http://schemas.openxmlformats.org/drawingml/2006/wordprocessingDrawing" xmlns:wp14="http://schemas.microsoft.com/office/word/2010/wordprocessingDrawing" xmlns:a="http://schemas.openxmlformats.org/drawingml/2006/main" xmlns:pic="http://schemas.openxmlformats.org/drawingml/2006/picture" xmlns:r="http://schemas.openxmlformats.org/officeDocument/2006/relationships" xmlns:a14="http://schemas.microsoft.com/office/drawing/2010/main" xmlns:w="http://schemas.openxmlformats.org/wordprocessingml/2006/main">
+<file path=word/header2.xml><?xml version="1.0" encoding="utf-8"?>
+<w:hdr xmlns:wpc="http://schemas.microsoft.com/office/word/2010/wordprocessingCanvas" xmlns:cx="http://schemas.microsoft.com/office/drawing/2014/chartex" xmlns:cx1="http://schemas.microsoft.com/office/drawing/2015/9/8/chartex" xmlns:cx2="http://schemas.microsoft.com/office/drawing/2015/10/21/chartex" xmlns:cx3="http://schemas.microsoft.com/office/drawing/2016/5/9/chartex" xmlns:cx4="http://schemas.microsoft.com/office/drawing/2016/5/10/chartex" xmlns:cx5="http://schemas.microsoft.com/office/drawing/2016/5/11/chartex" xmlns:cx6="http://schemas.microsoft.com/office/drawing/2016/5/12/chartex" xmlns:cx7="http://schemas.microsoft.com/office/drawing/2016/5/13/chartex" xmlns:cx8="http://schemas.microsoft.com/office/drawing/2016/5/14/chartex" xmlns:mc="http://schemas.openxmlformats.org/markup-compatibility/2006" xmlns:aink="http://schemas.microsoft.com/office/drawing/2016/ink" xmlns:am3d="http://schemas.microsoft.com/office/drawing/2017/model3d" xmlns:o="urn:schemas-microsoft-com:office:office" xmlns:oel="http://schemas.microsoft.com/office/2019/extlst" xmlns:r="http://schemas.openxmlformats.org/officeDocument/2006/relationships" xmlns:m="http://schemas.openxmlformats.org/officeDocument/2006/math" xmlns:v="urn:schemas-microsoft-com:vml" xmlns:wp14="http://schemas.microsoft.com/office/word/2010/wordprocessingDrawing" xmlns:wp="http://schemas.openxmlformats.org/drawingml/2006/wordprocessingDrawing" xmlns:w10="urn:schemas-microsoft-com:office:word" xmlns:w="http://schemas.openxmlformats.org/wordprocessingml/2006/main" xmlns:w14="http://schemas.microsoft.com/office/word/2010/wordml" xmlns:w15="http://schemas.microsoft.com/office/word/2012/wordml" xmlns:w16cex="http://schemas.microsoft.com/office/word/2018/wordml/cex" xmlns:w16cid="http://schemas.microsoft.com/office/word/2016/wordml/cid" xmlns:w16="http://schemas.microsoft.com/office/word/2018/wordml" xmlns:w16du="http://schemas.microsoft.com/office/word/2023/wordml/word16du" xmlns:w16sdtdh="http://schemas.microsoft.com/office/word/2020/wordml/sdtdatahash" xmlns:w16sdtfl="http://schemas.microsoft.com/office/word/2024/wordml/sdtformatlock" xmlns:w16se="http://schemas.microsoft.com/office/word/2015/wordml/symex" xmlns:wpg="http://schemas.microsoft.com/office/word/2010/wordprocessingGroup" xmlns:wpi="http://schemas.microsoft.com/office/word/2010/wordprocessingInk" xmlns:wne="http://schemas.microsoft.com/office/word/2006/wordml" xmlns:wps="http://schemas.microsoft.com/office/word/2010/wordprocessingShape" mc:Ignorable="w14 w15 w16se w16cid w16 w16cex w16sdtdh w16sdtfl w16du wp14">
   <w:tbl>
     <w:tblPr>
-      <w:tblStyle w:val="TableNormal"/>
-      <w:bidiVisual w:val="0"/>
       <w:tblW w:w="0" w:type="auto"/>
       <w:tblLook w:val="06A0" w:firstRow="1" w:lastRow="0" w:firstColumn="1" w:lastColumn="0" w:noHBand="1" w:noVBand="1"/>
     </w:tblPr>
@@ -3817,51 +3478,51 @@
       <w:tc>
         <w:tcPr>
           <w:tcW w:w="3120" w:type="dxa"/>
-          <w:tcMar/>
         </w:tcPr>
         <w:p>
           <w:pPr>
-            <w:pStyle w:val="Header"/>
-            <w:bidi w:val="0"/>
+            <w:pStyle w:val="Encabezado"/>
             <w:ind w:left="-115"/>
-            <w:jc w:val="left"/>
           </w:pPr>
           <w:r>
+            <w:rPr>
+              <w:noProof/>
+            </w:rPr>
             <w:drawing>
-              <wp:inline wp14:editId="3DCF8852" wp14:anchorId="17380588">
+              <wp:inline distT="0" distB="0" distL="0" distR="0" wp14:anchorId="17380588" wp14:editId="3DCF8852">
                 <wp:extent cx="657232" cy="504829"/>
                 <wp:effectExtent l="0" t="0" r="0" b="0"/>
                 <wp:docPr id="1198520151" name="drawing"/>
                 <wp:cNvGraphicFramePr>
-                  <a:graphicFrameLocks noChangeAspect="1"/>
+                  <a:graphicFrameLocks xmlns:a="http://schemas.openxmlformats.org/drawingml/2006/main" noChangeAspect="1"/>
                 </wp:cNvGraphicFramePr>
-                <a:graphic>
-                  <a:graphicData xmlns:a="http://schemas.openxmlformats.org/drawingml/2006/main" uri="http://schemas.openxmlformats.org/drawingml/2006/picture">
+                <a:graphic xmlns:a="http://schemas.openxmlformats.org/drawingml/2006/main">
+                  <a:graphicData uri="http://schemas.openxmlformats.org/drawingml/2006/picture">
                     <pic:pic xmlns:pic="http://schemas.openxmlformats.org/drawingml/2006/picture">
-                      <pic:nvPicPr xmlns:pic="http://schemas.openxmlformats.org/drawingml/2006/picture">
-                        <pic:cNvPr xmlns:pic="http://schemas.openxmlformats.org/drawingml/2006/picture" id="556283880" name=""/>
-                        <pic:cNvPicPr xmlns:pic="http://schemas.openxmlformats.org/drawingml/2006/picture"/>
+                      <pic:nvPicPr>
+                        <pic:cNvPr id="556283880" name=""/>
+                        <pic:cNvPicPr/>
                       </pic:nvPicPr>
-                      <pic:blipFill xmlns:pic="http://schemas.openxmlformats.org/drawingml/2006/picture">
-                        <a:blip xmlns:r="http://schemas.openxmlformats.org/officeDocument/2006/relationships" xmlns:a="http://schemas.openxmlformats.org/drawingml/2006/main" r:embed="rId626761599">
-                          <a:extLst xmlns:a="http://schemas.openxmlformats.org/drawingml/2006/main">
-                            <a:ext xmlns:a="http://schemas.openxmlformats.org/drawingml/2006/main" uri="{28A0092B-C50C-407E-A947-70E740481C1C}">
+                      <pic:blipFill>
+                        <a:blip r:embed="rId1">
+                          <a:extLst>
+                            <a:ext uri="{28A0092B-C50C-407E-A947-70E740481C1C}">
                               <a14:useLocalDpi xmlns:a14="http://schemas.microsoft.com/office/drawing/2010/main"/>
                             </a:ext>
                           </a:extLst>
                         </a:blip>
-                        <a:srcRect xmlns:a="http://schemas.openxmlformats.org/drawingml/2006/main" l="12886" t="11340" r="11340" b="15979"/>
-                        <a:stretch xmlns:a="http://schemas.openxmlformats.org/drawingml/2006/main">
-                          <a:fillRect xmlns:a="http://schemas.openxmlformats.org/drawingml/2006/main"/>
+                        <a:srcRect l="12886" t="11340" r="11340" b="15979"/>
+                        <a:stretch>
+                          <a:fillRect/>
                         </a:stretch>
                       </pic:blipFill>
-                      <pic:spPr xmlns:pic="http://schemas.openxmlformats.org/drawingml/2006/picture">
-                        <a:xfrm xmlns:a="http://schemas.openxmlformats.org/drawingml/2006/main" rot="0">
-                          <a:off xmlns:a="http://schemas.openxmlformats.org/drawingml/2006/main" x="0" y="0"/>
-                          <a:ext xmlns:a="http://schemas.openxmlformats.org/drawingml/2006/main" cx="657232" cy="504829"/>
+                      <pic:spPr>
+                        <a:xfrm>
+                          <a:off x="0" y="0"/>
+                          <a:ext cx="657232" cy="504829"/>
                         </a:xfrm>
-                        <a:prstGeom xmlns:a="http://schemas.openxmlformats.org/drawingml/2006/main" prst="rect">
-                          <a:avLst xmlns:a="http://schemas.openxmlformats.org/drawingml/2006/main"/>
+                        <a:prstGeom prst="rect">
+                          <a:avLst/>
                         </a:prstGeom>
                       </pic:spPr>
                     </pic:pic>
@@ -3875,12 +3536,10 @@
       <w:tc>
         <w:tcPr>
           <w:tcW w:w="3120" w:type="dxa"/>
-          <w:tcMar/>
         </w:tcPr>
         <w:p>
           <w:pPr>
-            <w:pStyle w:val="Header"/>
-            <w:bidi w:val="0"/>
+            <w:pStyle w:val="Encabezado"/>
             <w:jc w:val="center"/>
           </w:pPr>
         </w:p>
@@ -3888,12 +3547,10 @@
       <w:tc>
         <w:tcPr>
           <w:tcW w:w="3120" w:type="dxa"/>
-          <w:tcMar/>
         </w:tcPr>
         <w:p>
           <w:pPr>
-            <w:pStyle w:val="Header"/>
-            <w:bidi w:val="0"/>
+            <w:pStyle w:val="Encabezado"/>
             <w:ind w:right="-115"/>
             <w:jc w:val="right"/>
           </w:pPr>
@@ -3903,8 +3560,7 @@
   </w:tbl>
   <w:p>
     <w:pPr>
-      <w:pStyle w:val="Header"/>
-      <w:bidi w:val="0"/>
+      <w:pStyle w:val="Encabezado"/>
     </w:pPr>
   </w:p>
 </w:hdr>
@@ -3912,118 +3568,6 @@
 
 <file path=word/numbering.xml><?xml version="1.0" encoding="utf-8"?>
 <w:numbering xmlns:wpc="http://schemas.microsoft.com/office/word/2010/wordprocessingCanvas" xmlns:cx="http://schemas.microsoft.com/office/drawing/2014/chartex" xmlns:cx1="http://schemas.microsoft.com/office/drawing/2015/9/8/chartex" xmlns:cx2="http://schemas.microsoft.com/office/drawing/2015/10/21/chartex" xmlns:cx3="http://schemas.microsoft.com/office/drawing/2016/5/9/chartex" xmlns:cx4="http://schemas.microsoft.com/office/drawing/2016/5/10/chartex" xmlns:cx5="http://schemas.microsoft.com/office/drawing/2016/5/11/chartex" xmlns:cx6="http://schemas.microsoft.com/office/drawing/2016/5/12/chartex" xmlns:cx7="http://schemas.microsoft.com/office/drawing/2016/5/13/chartex" xmlns:cx8="http://schemas.microsoft.com/office/drawing/2016/5/14/chartex" xmlns:mc="http://schemas.openxmlformats.org/markup-compatibility/2006" xmlns:aink="http://schemas.microsoft.com/office/drawing/2016/ink" xmlns:am3d="http://schemas.microsoft.com/office/drawing/2017/model3d" xmlns:o="urn:schemas-microsoft-com:office:office" xmlns:oel="http://schemas.microsoft.com/office/2019/extlst" xmlns:r="http://schemas.openxmlformats.org/officeDocument/2006/relationships" xmlns:m="http://schemas.openxmlformats.org/officeDocument/2006/math" xmlns:v="urn:schemas-microsoft-com:vml" xmlns:wp14="http://schemas.microsoft.com/office/word/2010/wordprocessingDrawing" xmlns:wp="http://schemas.openxmlformats.org/drawingml/2006/wordprocessingDrawing" xmlns:w10="urn:schemas-microsoft-com:office:word" xmlns:w="http://schemas.openxmlformats.org/wordprocessingml/2006/main" xmlns:w14="http://schemas.microsoft.com/office/word/2010/wordml" xmlns:w15="http://schemas.microsoft.com/office/word/2012/wordml" xmlns:w16cex="http://schemas.microsoft.com/office/word/2018/wordml/cex" xmlns:w16cid="http://schemas.microsoft.com/office/word/2016/wordml/cid" xmlns:w16="http://schemas.microsoft.com/office/word/2018/wordml" xmlns:w16du="http://schemas.microsoft.com/office/word/2023/wordml/word16du" xmlns:w16sdtdh="http://schemas.microsoft.com/office/word/2020/wordml/sdtdatahash" xmlns:w16sdtfl="http://schemas.microsoft.com/office/word/2024/wordml/sdtformatlock" xmlns:w16se="http://schemas.microsoft.com/office/word/2015/wordml/symex" xmlns:wpg="http://schemas.microsoft.com/office/word/2010/wordprocessingGroup" xmlns:wpi="http://schemas.microsoft.com/office/word/2010/wordprocessingInk" xmlns:wne="http://schemas.microsoft.com/office/word/2006/wordml" xmlns:wps="http://schemas.microsoft.com/office/word/2010/wordprocessingShape" mc:Ignorable="w14 w15 w16se w16cid w16 w16cex w16sdtdh w16sdtfl w16du wp14">
-  <w:abstractNum xmlns:w="http://schemas.openxmlformats.org/wordprocessingml/2006/main" w:abstractNumId="12">
-    <w:nsid w:val="4b96e600"/>
-    <w:multiLevelType xmlns:w="http://schemas.openxmlformats.org/wordprocessingml/2006/main" w:val="hybridMultilevel"/>
-    <w:lvl xmlns:w="http://schemas.openxmlformats.org/wordprocessingml/2006/main" w:ilvl="0">
-      <w:start w:val="1"/>
-      <w:numFmt w:val="bullet"/>
-      <w:lvlText w:val=""/>
-      <w:lvlJc w:val="left"/>
-      <w:pPr>
-        <w:ind w:left="720" w:hanging="360"/>
-      </w:pPr>
-      <w:rPr>
-        <w:rFonts w:hint="default" w:ascii="Symbol" w:hAnsi="Symbol"/>
-      </w:rPr>
-    </w:lvl>
-    <w:lvl xmlns:w="http://schemas.openxmlformats.org/wordprocessingml/2006/main" w:ilvl="1">
-      <w:start w:val="1"/>
-      <w:numFmt w:val="bullet"/>
-      <w:lvlText w:val="o"/>
-      <w:lvlJc w:val="left"/>
-      <w:pPr>
-        <w:ind w:left="1440" w:hanging="360"/>
-      </w:pPr>
-      <w:rPr>
-        <w:rFonts w:hint="default" w:ascii="Courier New" w:hAnsi="Courier New"/>
-      </w:rPr>
-    </w:lvl>
-    <w:lvl xmlns:w="http://schemas.openxmlformats.org/wordprocessingml/2006/main" w:ilvl="2">
-      <w:start w:val="1"/>
-      <w:numFmt w:val="bullet"/>
-      <w:lvlText w:val=""/>
-      <w:lvlJc w:val="left"/>
-      <w:pPr>
-        <w:ind w:left="2160" w:hanging="360"/>
-      </w:pPr>
-      <w:rPr>
-        <w:rFonts w:hint="default" w:ascii="Wingdings" w:hAnsi="Wingdings"/>
-      </w:rPr>
-    </w:lvl>
-    <w:lvl xmlns:w="http://schemas.openxmlformats.org/wordprocessingml/2006/main" w:ilvl="3">
-      <w:start w:val="1"/>
-      <w:numFmt w:val="bullet"/>
-      <w:lvlText w:val=""/>
-      <w:lvlJc w:val="left"/>
-      <w:pPr>
-        <w:ind w:left="2880" w:hanging="360"/>
-      </w:pPr>
-      <w:rPr>
-        <w:rFonts w:hint="default" w:ascii="Symbol" w:hAnsi="Symbol"/>
-      </w:rPr>
-    </w:lvl>
-    <w:lvl xmlns:w="http://schemas.openxmlformats.org/wordprocessingml/2006/main" w:ilvl="4">
-      <w:start w:val="1"/>
-      <w:numFmt w:val="bullet"/>
-      <w:lvlText w:val="o"/>
-      <w:lvlJc w:val="left"/>
-      <w:pPr>
-        <w:ind w:left="3600" w:hanging="360"/>
-      </w:pPr>
-      <w:rPr>
-        <w:rFonts w:hint="default" w:ascii="Courier New" w:hAnsi="Courier New"/>
-      </w:rPr>
-    </w:lvl>
-    <w:lvl xmlns:w="http://schemas.openxmlformats.org/wordprocessingml/2006/main" w:ilvl="5">
-      <w:start w:val="1"/>
-      <w:numFmt w:val="bullet"/>
-      <w:lvlText w:val=""/>
-      <w:lvlJc w:val="left"/>
-      <w:pPr>
-        <w:ind w:left="4320" w:hanging="360"/>
-      </w:pPr>
-      <w:rPr>
-        <w:rFonts w:hint="default" w:ascii="Wingdings" w:hAnsi="Wingdings"/>
-      </w:rPr>
-    </w:lvl>
-    <w:lvl xmlns:w="http://schemas.openxmlformats.org/wordprocessingml/2006/main" w:ilvl="6">
-      <w:start w:val="1"/>
-      <w:numFmt w:val="bullet"/>
-      <w:lvlText w:val=""/>
-      <w:lvlJc w:val="left"/>
-      <w:pPr>
-        <w:ind w:left="5040" w:hanging="360"/>
-      </w:pPr>
-      <w:rPr>
-        <w:rFonts w:hint="default" w:ascii="Symbol" w:hAnsi="Symbol"/>
-      </w:rPr>
-    </w:lvl>
-    <w:lvl xmlns:w="http://schemas.openxmlformats.org/wordprocessingml/2006/main" w:ilvl="7">
-      <w:start w:val="1"/>
-      <w:numFmt w:val="bullet"/>
-      <w:lvlText w:val="o"/>
-      <w:lvlJc w:val="left"/>
-      <w:pPr>
-        <w:ind w:left="5760" w:hanging="360"/>
-      </w:pPr>
-      <w:rPr>
-        <w:rFonts w:hint="default" w:ascii="Courier New" w:hAnsi="Courier New"/>
-      </w:rPr>
-    </w:lvl>
-    <w:lvl xmlns:w="http://schemas.openxmlformats.org/wordprocessingml/2006/main" w:ilvl="8">
-      <w:start w:val="1"/>
-      <w:numFmt w:val="bullet"/>
-      <w:lvlText w:val=""/>
-      <w:lvlJc w:val="left"/>
-      <w:pPr>
-        <w:ind w:left="6480" w:hanging="360"/>
-      </w:pPr>
-      <w:rPr>
-        <w:rFonts w:hint="default" w:ascii="Wingdings" w:hAnsi="Wingdings"/>
-      </w:rPr>
-    </w:lvl>
-  </w:abstractNum>
   <w:abstractNum w:abstractNumId="0" w15:restartNumberingAfterBreak="0">
     <w:nsid w:val="07992828"/>
     <w:multiLevelType w:val="multilevel"/>
@@ -4037,7 +3581,7 @@
         <w:ind w:left="360" w:hanging="360"/>
       </w:pPr>
       <w:rPr>
-        <w:rFonts w:ascii="Noto Sans Symbols" w:hAnsi="Noto Sans Symbols" w:eastAsia="Noto Sans Symbols" w:cs="Noto Sans Symbols"/>
+        <w:rFonts w:ascii="Noto Sans Symbols" w:eastAsia="Noto Sans Symbols" w:hAnsi="Noto Sans Symbols" w:cs="Noto Sans Symbols"/>
         <w:sz w:val="16"/>
         <w:szCs w:val="16"/>
         <w:vertAlign w:val="baseline"/>
@@ -4052,7 +3596,7 @@
         <w:ind w:left="720" w:hanging="360"/>
       </w:pPr>
       <w:rPr>
-        <w:rFonts w:ascii="Courier New" w:hAnsi="Courier New" w:eastAsia="Courier New" w:cs="Courier New"/>
+        <w:rFonts w:ascii="Courier New" w:eastAsia="Courier New" w:hAnsi="Courier New" w:cs="Courier New"/>
         <w:vertAlign w:val="baseline"/>
       </w:rPr>
     </w:lvl>
@@ -4065,7 +3609,7 @@
         <w:ind w:left="1080" w:hanging="360"/>
       </w:pPr>
       <w:rPr>
-        <w:rFonts w:ascii="Noto Sans Symbols" w:hAnsi="Noto Sans Symbols" w:eastAsia="Noto Sans Symbols" w:cs="Noto Sans Symbols"/>
+        <w:rFonts w:ascii="Noto Sans Symbols" w:eastAsia="Noto Sans Symbols" w:hAnsi="Noto Sans Symbols" w:cs="Noto Sans Symbols"/>
         <w:vertAlign w:val="baseline"/>
       </w:rPr>
     </w:lvl>
@@ -4078,7 +3622,7 @@
         <w:ind w:left="1440" w:hanging="360"/>
       </w:pPr>
       <w:rPr>
-        <w:rFonts w:ascii="Noto Sans Symbols" w:hAnsi="Noto Sans Symbols" w:eastAsia="Noto Sans Symbols" w:cs="Noto Sans Symbols"/>
+        <w:rFonts w:ascii="Noto Sans Symbols" w:eastAsia="Noto Sans Symbols" w:hAnsi="Noto Sans Symbols" w:cs="Noto Sans Symbols"/>
         <w:vertAlign w:val="baseline"/>
       </w:rPr>
     </w:lvl>
@@ -4091,7 +3635,7 @@
         <w:ind w:left="1800" w:hanging="360"/>
       </w:pPr>
       <w:rPr>
-        <w:rFonts w:ascii="Courier New" w:hAnsi="Courier New" w:eastAsia="Courier New" w:cs="Courier New"/>
+        <w:rFonts w:ascii="Courier New" w:eastAsia="Courier New" w:hAnsi="Courier New" w:cs="Courier New"/>
         <w:vertAlign w:val="baseline"/>
       </w:rPr>
     </w:lvl>
@@ -4104,7 +3648,7 @@
         <w:ind w:left="2160" w:hanging="360"/>
       </w:pPr>
       <w:rPr>
-        <w:rFonts w:ascii="Noto Sans Symbols" w:hAnsi="Noto Sans Symbols" w:eastAsia="Noto Sans Symbols" w:cs="Noto Sans Symbols"/>
+        <w:rFonts w:ascii="Noto Sans Symbols" w:eastAsia="Noto Sans Symbols" w:hAnsi="Noto Sans Symbols" w:cs="Noto Sans Symbols"/>
         <w:vertAlign w:val="baseline"/>
       </w:rPr>
     </w:lvl>
@@ -4117,7 +3661,7 @@
         <w:ind w:left="2520" w:hanging="360"/>
       </w:pPr>
       <w:rPr>
-        <w:rFonts w:ascii="Noto Sans Symbols" w:hAnsi="Noto Sans Symbols" w:eastAsia="Noto Sans Symbols" w:cs="Noto Sans Symbols"/>
+        <w:rFonts w:ascii="Noto Sans Symbols" w:eastAsia="Noto Sans Symbols" w:hAnsi="Noto Sans Symbols" w:cs="Noto Sans Symbols"/>
         <w:vertAlign w:val="baseline"/>
       </w:rPr>
     </w:lvl>
@@ -4130,7 +3674,7 @@
         <w:ind w:left="2880" w:hanging="360"/>
       </w:pPr>
       <w:rPr>
-        <w:rFonts w:ascii="Courier New" w:hAnsi="Courier New" w:eastAsia="Courier New" w:cs="Courier New"/>
+        <w:rFonts w:ascii="Courier New" w:eastAsia="Courier New" w:hAnsi="Courier New" w:cs="Courier New"/>
         <w:vertAlign w:val="baseline"/>
       </w:rPr>
     </w:lvl>
@@ -4143,7 +3687,7 @@
         <w:ind w:left="3240" w:hanging="360"/>
       </w:pPr>
       <w:rPr>
-        <w:rFonts w:ascii="Noto Sans Symbols" w:hAnsi="Noto Sans Symbols" w:eastAsia="Noto Sans Symbols" w:cs="Noto Sans Symbols"/>
+        <w:rFonts w:ascii="Noto Sans Symbols" w:eastAsia="Noto Sans Symbols" w:hAnsi="Noto Sans Symbols" w:cs="Noto Sans Symbols"/>
         <w:vertAlign w:val="baseline"/>
       </w:rPr>
     </w:lvl>
@@ -4428,7 +3972,7 @@
         <w:ind w:left="720" w:hanging="360"/>
       </w:pPr>
       <w:rPr>
-        <w:rFonts w:hint="default" w:ascii="Symbol" w:hAnsi="Symbol"/>
+        <w:rFonts w:ascii="Symbol" w:hAnsi="Symbol" w:hint="default"/>
       </w:rPr>
     </w:lvl>
     <w:lvl w:ilvl="1" w:tplc="2C16D7AE">
@@ -4440,7 +3984,7 @@
         <w:ind w:left="1440" w:hanging="360"/>
       </w:pPr>
       <w:rPr>
-        <w:rFonts w:hint="default" w:ascii="Courier New" w:hAnsi="Courier New"/>
+        <w:rFonts w:ascii="Courier New" w:hAnsi="Courier New" w:hint="default"/>
       </w:rPr>
     </w:lvl>
     <w:lvl w:ilvl="2" w:tplc="B3E251A2">
@@ -4452,7 +3996,7 @@
         <w:ind w:left="2160" w:hanging="360"/>
       </w:pPr>
       <w:rPr>
-        <w:rFonts w:hint="default" w:ascii="Wingdings" w:hAnsi="Wingdings"/>
+        <w:rFonts w:ascii="Wingdings" w:hAnsi="Wingdings" w:hint="default"/>
       </w:rPr>
     </w:lvl>
     <w:lvl w:ilvl="3" w:tplc="405C987C">
@@ -4464,7 +4008,7 @@
         <w:ind w:left="2880" w:hanging="360"/>
       </w:pPr>
       <w:rPr>
-        <w:rFonts w:hint="default" w:ascii="Symbol" w:hAnsi="Symbol"/>
+        <w:rFonts w:ascii="Symbol" w:hAnsi="Symbol" w:hint="default"/>
       </w:rPr>
     </w:lvl>
     <w:lvl w:ilvl="4" w:tplc="616262B4">
@@ -4476,7 +4020,7 @@
         <w:ind w:left="3600" w:hanging="360"/>
       </w:pPr>
       <w:rPr>
-        <w:rFonts w:hint="default" w:ascii="Courier New" w:hAnsi="Courier New"/>
+        <w:rFonts w:ascii="Courier New" w:hAnsi="Courier New" w:hint="default"/>
       </w:rPr>
     </w:lvl>
     <w:lvl w:ilvl="5" w:tplc="1D50D8D2">
@@ -4488,7 +4032,7 @@
         <w:ind w:left="4320" w:hanging="360"/>
       </w:pPr>
       <w:rPr>
-        <w:rFonts w:hint="default" w:ascii="Wingdings" w:hAnsi="Wingdings"/>
+        <w:rFonts w:ascii="Wingdings" w:hAnsi="Wingdings" w:hint="default"/>
       </w:rPr>
     </w:lvl>
     <w:lvl w:ilvl="6" w:tplc="90FA4ABC">
@@ -4500,7 +4044,7 @@
         <w:ind w:left="5040" w:hanging="360"/>
       </w:pPr>
       <w:rPr>
-        <w:rFonts w:hint="default" w:ascii="Symbol" w:hAnsi="Symbol"/>
+        <w:rFonts w:ascii="Symbol" w:hAnsi="Symbol" w:hint="default"/>
       </w:rPr>
     </w:lvl>
     <w:lvl w:ilvl="7" w:tplc="6978BF72">
@@ -4512,7 +4056,7 @@
         <w:ind w:left="5760" w:hanging="360"/>
       </w:pPr>
       <w:rPr>
-        <w:rFonts w:hint="default" w:ascii="Courier New" w:hAnsi="Courier New"/>
+        <w:rFonts w:ascii="Courier New" w:hAnsi="Courier New" w:hint="default"/>
       </w:rPr>
     </w:lvl>
     <w:lvl w:ilvl="8" w:tplc="242AE784">
@@ -4524,7 +4068,7 @@
         <w:ind w:left="6480" w:hanging="360"/>
       </w:pPr>
       <w:rPr>
-        <w:rFonts w:hint="default" w:ascii="Wingdings" w:hAnsi="Wingdings"/>
+        <w:rFonts w:ascii="Wingdings" w:hAnsi="Wingdings" w:hint="default"/>
       </w:rPr>
     </w:lvl>
   </w:abstractNum>
@@ -4541,7 +4085,7 @@
         <w:ind w:left="360" w:hanging="360"/>
       </w:pPr>
       <w:rPr>
-        <w:rFonts w:ascii="Noto Sans Symbols" w:hAnsi="Noto Sans Symbols" w:eastAsia="Noto Sans Symbols" w:cs="Noto Sans Symbols"/>
+        <w:rFonts w:ascii="Noto Sans Symbols" w:eastAsia="Noto Sans Symbols" w:hAnsi="Noto Sans Symbols" w:cs="Noto Sans Symbols"/>
         <w:color w:val="FF0000"/>
         <w:vertAlign w:val="baseline"/>
       </w:rPr>
@@ -4555,7 +4099,7 @@
         <w:ind w:left="720" w:hanging="360"/>
       </w:pPr>
       <w:rPr>
-        <w:rFonts w:ascii="Courier New" w:hAnsi="Courier New" w:eastAsia="Courier New" w:cs="Courier New"/>
+        <w:rFonts w:ascii="Courier New" w:eastAsia="Courier New" w:hAnsi="Courier New" w:cs="Courier New"/>
         <w:vertAlign w:val="baseline"/>
       </w:rPr>
     </w:lvl>
@@ -4568,7 +4112,7 @@
         <w:ind w:left="1080" w:hanging="360"/>
       </w:pPr>
       <w:rPr>
-        <w:rFonts w:ascii="Noto Sans Symbols" w:hAnsi="Noto Sans Symbols" w:eastAsia="Noto Sans Symbols" w:cs="Noto Sans Symbols"/>
+        <w:rFonts w:ascii="Noto Sans Symbols" w:eastAsia="Noto Sans Symbols" w:hAnsi="Noto Sans Symbols" w:cs="Noto Sans Symbols"/>
         <w:vertAlign w:val="baseline"/>
       </w:rPr>
     </w:lvl>
@@ -4581,7 +4125,7 @@
         <w:ind w:left="1440" w:hanging="360"/>
       </w:pPr>
       <w:rPr>
-        <w:rFonts w:ascii="Noto Sans Symbols" w:hAnsi="Noto Sans Symbols" w:eastAsia="Noto Sans Symbols" w:cs="Noto Sans Symbols"/>
+        <w:rFonts w:ascii="Noto Sans Symbols" w:eastAsia="Noto Sans Symbols" w:hAnsi="Noto Sans Symbols" w:cs="Noto Sans Symbols"/>
         <w:vertAlign w:val="baseline"/>
       </w:rPr>
     </w:lvl>
@@ -4594,7 +4138,7 @@
         <w:ind w:left="1800" w:hanging="360"/>
       </w:pPr>
       <w:rPr>
-        <w:rFonts w:ascii="Courier New" w:hAnsi="Courier New" w:eastAsia="Courier New" w:cs="Courier New"/>
+        <w:rFonts w:ascii="Courier New" w:eastAsia="Courier New" w:hAnsi="Courier New" w:cs="Courier New"/>
         <w:vertAlign w:val="baseline"/>
       </w:rPr>
     </w:lvl>
@@ -4607,7 +4151,7 @@
         <w:ind w:left="2160" w:hanging="360"/>
       </w:pPr>
       <w:rPr>
-        <w:rFonts w:ascii="Noto Sans Symbols" w:hAnsi="Noto Sans Symbols" w:eastAsia="Noto Sans Symbols" w:cs="Noto Sans Symbols"/>
+        <w:rFonts w:ascii="Noto Sans Symbols" w:eastAsia="Noto Sans Symbols" w:hAnsi="Noto Sans Symbols" w:cs="Noto Sans Symbols"/>
         <w:vertAlign w:val="baseline"/>
       </w:rPr>
     </w:lvl>
@@ -4620,7 +4164,7 @@
         <w:ind w:left="2520" w:hanging="360"/>
       </w:pPr>
       <w:rPr>
-        <w:rFonts w:ascii="Noto Sans Symbols" w:hAnsi="Noto Sans Symbols" w:eastAsia="Noto Sans Symbols" w:cs="Noto Sans Symbols"/>
+        <w:rFonts w:ascii="Noto Sans Symbols" w:eastAsia="Noto Sans Symbols" w:hAnsi="Noto Sans Symbols" w:cs="Noto Sans Symbols"/>
         <w:vertAlign w:val="baseline"/>
       </w:rPr>
     </w:lvl>
@@ -4633,7 +4177,7 @@
         <w:ind w:left="2880" w:hanging="360"/>
       </w:pPr>
       <w:rPr>
-        <w:rFonts w:ascii="Courier New" w:hAnsi="Courier New" w:eastAsia="Courier New" w:cs="Courier New"/>
+        <w:rFonts w:ascii="Courier New" w:eastAsia="Courier New" w:hAnsi="Courier New" w:cs="Courier New"/>
         <w:vertAlign w:val="baseline"/>
       </w:rPr>
     </w:lvl>
@@ -4646,7 +4190,7 @@
         <w:ind w:left="3240" w:hanging="360"/>
       </w:pPr>
       <w:rPr>
-        <w:rFonts w:ascii="Noto Sans Symbols" w:hAnsi="Noto Sans Symbols" w:eastAsia="Noto Sans Symbols" w:cs="Noto Sans Symbols"/>
+        <w:rFonts w:ascii="Noto Sans Symbols" w:eastAsia="Noto Sans Symbols" w:hAnsi="Noto Sans Symbols" w:cs="Noto Sans Symbols"/>
         <w:vertAlign w:val="baseline"/>
       </w:rPr>
     </w:lvl>
@@ -4664,7 +4208,7 @@
         <w:ind w:left="360" w:hanging="360"/>
       </w:pPr>
       <w:rPr>
-        <w:rFonts w:ascii="Noto Sans Symbols" w:hAnsi="Noto Sans Symbols" w:eastAsia="Noto Sans Symbols" w:cs="Noto Sans Symbols"/>
+        <w:rFonts w:ascii="Noto Sans Symbols" w:eastAsia="Noto Sans Symbols" w:hAnsi="Noto Sans Symbols" w:cs="Noto Sans Symbols"/>
         <w:sz w:val="16"/>
         <w:szCs w:val="16"/>
         <w:vertAlign w:val="baseline"/>
@@ -4679,7 +4223,7 @@
         <w:ind w:left="720" w:hanging="360"/>
       </w:pPr>
       <w:rPr>
-        <w:rFonts w:ascii="Courier New" w:hAnsi="Courier New" w:eastAsia="Courier New" w:cs="Courier New"/>
+        <w:rFonts w:ascii="Courier New" w:eastAsia="Courier New" w:hAnsi="Courier New" w:cs="Courier New"/>
         <w:vertAlign w:val="baseline"/>
       </w:rPr>
     </w:lvl>
@@ -4692,7 +4236,7 @@
         <w:ind w:left="1080" w:hanging="360"/>
       </w:pPr>
       <w:rPr>
-        <w:rFonts w:ascii="Noto Sans Symbols" w:hAnsi="Noto Sans Symbols" w:eastAsia="Noto Sans Symbols" w:cs="Noto Sans Symbols"/>
+        <w:rFonts w:ascii="Noto Sans Symbols" w:eastAsia="Noto Sans Symbols" w:hAnsi="Noto Sans Symbols" w:cs="Noto Sans Symbols"/>
         <w:vertAlign w:val="baseline"/>
       </w:rPr>
     </w:lvl>
@@ -4705,7 +4249,7 @@
         <w:ind w:left="1440" w:hanging="360"/>
       </w:pPr>
       <w:rPr>
-        <w:rFonts w:ascii="Noto Sans Symbols" w:hAnsi="Noto Sans Symbols" w:eastAsia="Noto Sans Symbols" w:cs="Noto Sans Symbols"/>
+        <w:rFonts w:ascii="Noto Sans Symbols" w:eastAsia="Noto Sans Symbols" w:hAnsi="Noto Sans Symbols" w:cs="Noto Sans Symbols"/>
         <w:vertAlign w:val="baseline"/>
       </w:rPr>
     </w:lvl>
@@ -4718,7 +4262,7 @@
         <w:ind w:left="1800" w:hanging="360"/>
       </w:pPr>
       <w:rPr>
-        <w:rFonts w:ascii="Courier New" w:hAnsi="Courier New" w:eastAsia="Courier New" w:cs="Courier New"/>
+        <w:rFonts w:ascii="Courier New" w:eastAsia="Courier New" w:hAnsi="Courier New" w:cs="Courier New"/>
         <w:vertAlign w:val="baseline"/>
       </w:rPr>
     </w:lvl>
@@ -4731,7 +4275,7 @@
         <w:ind w:left="2160" w:hanging="360"/>
       </w:pPr>
       <w:rPr>
-        <w:rFonts w:ascii="Noto Sans Symbols" w:hAnsi="Noto Sans Symbols" w:eastAsia="Noto Sans Symbols" w:cs="Noto Sans Symbols"/>
+        <w:rFonts w:ascii="Noto Sans Symbols" w:eastAsia="Noto Sans Symbols" w:hAnsi="Noto Sans Symbols" w:cs="Noto Sans Symbols"/>
         <w:vertAlign w:val="baseline"/>
       </w:rPr>
     </w:lvl>
@@ -4744,7 +4288,7 @@
         <w:ind w:left="2520" w:hanging="360"/>
       </w:pPr>
       <w:rPr>
-        <w:rFonts w:ascii="Noto Sans Symbols" w:hAnsi="Noto Sans Symbols" w:eastAsia="Noto Sans Symbols" w:cs="Noto Sans Symbols"/>
+        <w:rFonts w:ascii="Noto Sans Symbols" w:eastAsia="Noto Sans Symbols" w:hAnsi="Noto Sans Symbols" w:cs="Noto Sans Symbols"/>
         <w:vertAlign w:val="baseline"/>
       </w:rPr>
     </w:lvl>
@@ -4757,7 +4301,7 @@
         <w:ind w:left="2880" w:hanging="360"/>
       </w:pPr>
       <w:rPr>
-        <w:rFonts w:ascii="Courier New" w:hAnsi="Courier New" w:eastAsia="Courier New" w:cs="Courier New"/>
+        <w:rFonts w:ascii="Courier New" w:eastAsia="Courier New" w:hAnsi="Courier New" w:cs="Courier New"/>
         <w:vertAlign w:val="baseline"/>
       </w:rPr>
     </w:lvl>
@@ -4770,7 +4314,7 @@
         <w:ind w:left="3240" w:hanging="360"/>
       </w:pPr>
       <w:rPr>
-        <w:rFonts w:ascii="Noto Sans Symbols" w:hAnsi="Noto Sans Symbols" w:eastAsia="Noto Sans Symbols" w:cs="Noto Sans Symbols"/>
+        <w:rFonts w:ascii="Noto Sans Symbols" w:eastAsia="Noto Sans Symbols" w:hAnsi="Noto Sans Symbols" w:cs="Noto Sans Symbols"/>
         <w:vertAlign w:val="baseline"/>
       </w:rPr>
     </w:lvl>
@@ -4788,7 +4332,7 @@
         <w:ind w:left="720" w:hanging="360"/>
       </w:pPr>
       <w:rPr>
-        <w:rFonts w:hint="default" w:ascii="Symbol" w:hAnsi="Symbol"/>
+        <w:rFonts w:ascii="Symbol" w:hAnsi="Symbol" w:hint="default"/>
       </w:rPr>
     </w:lvl>
     <w:lvl w:ilvl="1" w:tplc="418C28A4">
@@ -4800,7 +4344,7 @@
         <w:ind w:left="1440" w:hanging="360"/>
       </w:pPr>
       <w:rPr>
-        <w:rFonts w:hint="default" w:ascii="Courier New" w:hAnsi="Courier New"/>
+        <w:rFonts w:ascii="Courier New" w:hAnsi="Courier New" w:hint="default"/>
       </w:rPr>
     </w:lvl>
     <w:lvl w:ilvl="2" w:tplc="A378C08E">
@@ -4812,7 +4356,7 @@
         <w:ind w:left="2160" w:hanging="360"/>
       </w:pPr>
       <w:rPr>
-        <w:rFonts w:hint="default" w:ascii="Wingdings" w:hAnsi="Wingdings"/>
+        <w:rFonts w:ascii="Wingdings" w:hAnsi="Wingdings" w:hint="default"/>
       </w:rPr>
     </w:lvl>
     <w:lvl w:ilvl="3" w:tplc="7C50AB62">
@@ -4824,7 +4368,7 @@
         <w:ind w:left="2880" w:hanging="360"/>
       </w:pPr>
       <w:rPr>
-        <w:rFonts w:hint="default" w:ascii="Symbol" w:hAnsi="Symbol"/>
+        <w:rFonts w:ascii="Symbol" w:hAnsi="Symbol" w:hint="default"/>
       </w:rPr>
     </w:lvl>
     <w:lvl w:ilvl="4" w:tplc="4F7E133E">
@@ -4836,7 +4380,7 @@
         <w:ind w:left="3600" w:hanging="360"/>
       </w:pPr>
       <w:rPr>
-        <w:rFonts w:hint="default" w:ascii="Courier New" w:hAnsi="Courier New"/>
+        <w:rFonts w:ascii="Courier New" w:hAnsi="Courier New" w:hint="default"/>
       </w:rPr>
     </w:lvl>
     <w:lvl w:ilvl="5" w:tplc="73A612EE">
@@ -4848,7 +4392,7 @@
         <w:ind w:left="4320" w:hanging="360"/>
       </w:pPr>
       <w:rPr>
-        <w:rFonts w:hint="default" w:ascii="Wingdings" w:hAnsi="Wingdings"/>
+        <w:rFonts w:ascii="Wingdings" w:hAnsi="Wingdings" w:hint="default"/>
       </w:rPr>
     </w:lvl>
     <w:lvl w:ilvl="6" w:tplc="B582C93E">
@@ -4860,7 +4404,7 @@
         <w:ind w:left="5040" w:hanging="360"/>
       </w:pPr>
       <w:rPr>
-        <w:rFonts w:hint="default" w:ascii="Symbol" w:hAnsi="Symbol"/>
+        <w:rFonts w:ascii="Symbol" w:hAnsi="Symbol" w:hint="default"/>
       </w:rPr>
     </w:lvl>
     <w:lvl w:ilvl="7" w:tplc="C3BA4DF0">
@@ -4872,7 +4416,7 @@
         <w:ind w:left="5760" w:hanging="360"/>
       </w:pPr>
       <w:rPr>
-        <w:rFonts w:hint="default" w:ascii="Courier New" w:hAnsi="Courier New"/>
+        <w:rFonts w:ascii="Courier New" w:hAnsi="Courier New" w:hint="default"/>
       </w:rPr>
     </w:lvl>
     <w:lvl w:ilvl="8" w:tplc="687E2B32">
@@ -4884,7 +4428,7 @@
         <w:ind w:left="6480" w:hanging="360"/>
       </w:pPr>
       <w:rPr>
-        <w:rFonts w:hint="default" w:ascii="Wingdings" w:hAnsi="Wingdings"/>
+        <w:rFonts w:ascii="Wingdings" w:hAnsi="Wingdings" w:hint="default"/>
       </w:rPr>
     </w:lvl>
   </w:abstractNum>
@@ -4901,7 +4445,7 @@
         <w:ind w:left="360" w:hanging="360"/>
       </w:pPr>
       <w:rPr>
-        <w:rFonts w:ascii="Noto Sans Symbols" w:hAnsi="Noto Sans Symbols" w:eastAsia="Noto Sans Symbols" w:cs="Noto Sans Symbols"/>
+        <w:rFonts w:ascii="Noto Sans Symbols" w:eastAsia="Noto Sans Symbols" w:hAnsi="Noto Sans Symbols" w:cs="Noto Sans Symbols"/>
         <w:sz w:val="16"/>
         <w:szCs w:val="16"/>
         <w:vertAlign w:val="baseline"/>
@@ -4916,7 +4460,7 @@
         <w:ind w:left="720" w:hanging="360"/>
       </w:pPr>
       <w:rPr>
-        <w:rFonts w:ascii="Courier New" w:hAnsi="Courier New" w:eastAsia="Courier New" w:cs="Courier New"/>
+        <w:rFonts w:ascii="Courier New" w:eastAsia="Courier New" w:hAnsi="Courier New" w:cs="Courier New"/>
         <w:vertAlign w:val="baseline"/>
       </w:rPr>
     </w:lvl>
@@ -4929,7 +4473,7 @@
         <w:ind w:left="1080" w:hanging="360"/>
       </w:pPr>
       <w:rPr>
-        <w:rFonts w:ascii="Noto Sans Symbols" w:hAnsi="Noto Sans Symbols" w:eastAsia="Noto Sans Symbols" w:cs="Noto Sans Symbols"/>
+        <w:rFonts w:ascii="Noto Sans Symbols" w:eastAsia="Noto Sans Symbols" w:hAnsi="Noto Sans Symbols" w:cs="Noto Sans Symbols"/>
         <w:vertAlign w:val="baseline"/>
       </w:rPr>
     </w:lvl>
@@ -4942,7 +4486,7 @@
         <w:ind w:left="1440" w:hanging="360"/>
       </w:pPr>
       <w:rPr>
-        <w:rFonts w:ascii="Noto Sans Symbols" w:hAnsi="Noto Sans Symbols" w:eastAsia="Noto Sans Symbols" w:cs="Noto Sans Symbols"/>
+        <w:rFonts w:ascii="Noto Sans Symbols" w:eastAsia="Noto Sans Symbols" w:hAnsi="Noto Sans Symbols" w:cs="Noto Sans Symbols"/>
         <w:vertAlign w:val="baseline"/>
       </w:rPr>
     </w:lvl>
@@ -4955,7 +4499,7 @@
         <w:ind w:left="1800" w:hanging="360"/>
       </w:pPr>
       <w:rPr>
-        <w:rFonts w:ascii="Courier New" w:hAnsi="Courier New" w:eastAsia="Courier New" w:cs="Courier New"/>
+        <w:rFonts w:ascii="Courier New" w:eastAsia="Courier New" w:hAnsi="Courier New" w:cs="Courier New"/>
         <w:vertAlign w:val="baseline"/>
       </w:rPr>
     </w:lvl>
@@ -4968,7 +4512,7 @@
         <w:ind w:left="2160" w:hanging="360"/>
       </w:pPr>
       <w:rPr>
-        <w:rFonts w:ascii="Noto Sans Symbols" w:hAnsi="Noto Sans Symbols" w:eastAsia="Noto Sans Symbols" w:cs="Noto Sans Symbols"/>
+        <w:rFonts w:ascii="Noto Sans Symbols" w:eastAsia="Noto Sans Symbols" w:hAnsi="Noto Sans Symbols" w:cs="Noto Sans Symbols"/>
         <w:vertAlign w:val="baseline"/>
       </w:rPr>
     </w:lvl>
@@ -4981,7 +4525,7 @@
         <w:ind w:left="2520" w:hanging="360"/>
       </w:pPr>
       <w:rPr>
-        <w:rFonts w:ascii="Noto Sans Symbols" w:hAnsi="Noto Sans Symbols" w:eastAsia="Noto Sans Symbols" w:cs="Noto Sans Symbols"/>
+        <w:rFonts w:ascii="Noto Sans Symbols" w:eastAsia="Noto Sans Symbols" w:hAnsi="Noto Sans Symbols" w:cs="Noto Sans Symbols"/>
         <w:vertAlign w:val="baseline"/>
       </w:rPr>
     </w:lvl>
@@ -4994,7 +4538,7 @@
         <w:ind w:left="2880" w:hanging="360"/>
       </w:pPr>
       <w:rPr>
-        <w:rFonts w:ascii="Courier New" w:hAnsi="Courier New" w:eastAsia="Courier New" w:cs="Courier New"/>
+        <w:rFonts w:ascii="Courier New" w:eastAsia="Courier New" w:hAnsi="Courier New" w:cs="Courier New"/>
         <w:vertAlign w:val="baseline"/>
       </w:rPr>
     </w:lvl>
@@ -5007,12 +4551,125 @@
         <w:ind w:left="3240" w:hanging="360"/>
       </w:pPr>
       <w:rPr>
-        <w:rFonts w:ascii="Noto Sans Symbols" w:hAnsi="Noto Sans Symbols" w:eastAsia="Noto Sans Symbols" w:cs="Noto Sans Symbols"/>
+        <w:rFonts w:ascii="Noto Sans Symbols" w:eastAsia="Noto Sans Symbols" w:hAnsi="Noto Sans Symbols" w:cs="Noto Sans Symbols"/>
         <w:vertAlign w:val="baseline"/>
       </w:rPr>
     </w:lvl>
   </w:abstractNum>
   <w:abstractNum w:abstractNumId="9" w15:restartNumberingAfterBreak="0">
+    <w:nsid w:val="4B96E600"/>
+    <w:multiLevelType w:val="hybridMultilevel"/>
+    <w:tmpl w:val="B4EEB7BE"/>
+    <w:lvl w:ilvl="0" w:tplc="7ED892CE">
+      <w:start w:val="1"/>
+      <w:numFmt w:val="bullet"/>
+      <w:lvlText w:val=""/>
+      <w:lvlJc w:val="left"/>
+      <w:pPr>
+        <w:ind w:left="720" w:hanging="360"/>
+      </w:pPr>
+      <w:rPr>
+        <w:rFonts w:ascii="Symbol" w:hAnsi="Symbol" w:hint="default"/>
+      </w:rPr>
+    </w:lvl>
+    <w:lvl w:ilvl="1" w:tplc="77823B6E">
+      <w:start w:val="1"/>
+      <w:numFmt w:val="bullet"/>
+      <w:lvlText w:val="o"/>
+      <w:lvlJc w:val="left"/>
+      <w:pPr>
+        <w:ind w:left="1440" w:hanging="360"/>
+      </w:pPr>
+      <w:rPr>
+        <w:rFonts w:ascii="Courier New" w:hAnsi="Courier New" w:hint="default"/>
+      </w:rPr>
+    </w:lvl>
+    <w:lvl w:ilvl="2" w:tplc="4576401C">
+      <w:start w:val="1"/>
+      <w:numFmt w:val="bullet"/>
+      <w:lvlText w:val=""/>
+      <w:lvlJc w:val="left"/>
+      <w:pPr>
+        <w:ind w:left="2160" w:hanging="360"/>
+      </w:pPr>
+      <w:rPr>
+        <w:rFonts w:ascii="Wingdings" w:hAnsi="Wingdings" w:hint="default"/>
+      </w:rPr>
+    </w:lvl>
+    <w:lvl w:ilvl="3" w:tplc="D12404AE">
+      <w:start w:val="1"/>
+      <w:numFmt w:val="bullet"/>
+      <w:lvlText w:val=""/>
+      <w:lvlJc w:val="left"/>
+      <w:pPr>
+        <w:ind w:left="2880" w:hanging="360"/>
+      </w:pPr>
+      <w:rPr>
+        <w:rFonts w:ascii="Symbol" w:hAnsi="Symbol" w:hint="default"/>
+      </w:rPr>
+    </w:lvl>
+    <w:lvl w:ilvl="4" w:tplc="00E0C7FA">
+      <w:start w:val="1"/>
+      <w:numFmt w:val="bullet"/>
+      <w:lvlText w:val="o"/>
+      <w:lvlJc w:val="left"/>
+      <w:pPr>
+        <w:ind w:left="3600" w:hanging="360"/>
+      </w:pPr>
+      <w:rPr>
+        <w:rFonts w:ascii="Courier New" w:hAnsi="Courier New" w:hint="default"/>
+      </w:rPr>
+    </w:lvl>
+    <w:lvl w:ilvl="5" w:tplc="79E02AFE">
+      <w:start w:val="1"/>
+      <w:numFmt w:val="bullet"/>
+      <w:lvlText w:val=""/>
+      <w:lvlJc w:val="left"/>
+      <w:pPr>
+        <w:ind w:left="4320" w:hanging="360"/>
+      </w:pPr>
+      <w:rPr>
+        <w:rFonts w:ascii="Wingdings" w:hAnsi="Wingdings" w:hint="default"/>
+      </w:rPr>
+    </w:lvl>
+    <w:lvl w:ilvl="6" w:tplc="B42EF774">
+      <w:start w:val="1"/>
+      <w:numFmt w:val="bullet"/>
+      <w:lvlText w:val=""/>
+      <w:lvlJc w:val="left"/>
+      <w:pPr>
+        <w:ind w:left="5040" w:hanging="360"/>
+      </w:pPr>
+      <w:rPr>
+        <w:rFonts w:ascii="Symbol" w:hAnsi="Symbol" w:hint="default"/>
+      </w:rPr>
+    </w:lvl>
+    <w:lvl w:ilvl="7" w:tplc="B29CA26A">
+      <w:start w:val="1"/>
+      <w:numFmt w:val="bullet"/>
+      <w:lvlText w:val="o"/>
+      <w:lvlJc w:val="left"/>
+      <w:pPr>
+        <w:ind w:left="5760" w:hanging="360"/>
+      </w:pPr>
+      <w:rPr>
+        <w:rFonts w:ascii="Courier New" w:hAnsi="Courier New" w:hint="default"/>
+      </w:rPr>
+    </w:lvl>
+    <w:lvl w:ilvl="8" w:tplc="3ADC7968">
+      <w:start w:val="1"/>
+      <w:numFmt w:val="bullet"/>
+      <w:lvlText w:val=""/>
+      <w:lvlJc w:val="left"/>
+      <w:pPr>
+        <w:ind w:left="6480" w:hanging="360"/>
+      </w:pPr>
+      <w:rPr>
+        <w:rFonts w:ascii="Wingdings" w:hAnsi="Wingdings" w:hint="default"/>
+      </w:rPr>
+    </w:lvl>
+  </w:abstractNum>
+  <w:abstractNum w:abstractNumId="10" w15:restartNumberingAfterBreak="0">
     <w:nsid w:val="5B35422C"/>
     <w:multiLevelType w:val="multilevel"/>
     <w:tmpl w:val="FFFFFFFF"/>
@@ -5025,7 +4682,7 @@
         <w:ind w:left="360" w:hanging="360"/>
       </w:pPr>
       <w:rPr>
-        <w:rFonts w:ascii="Noto Sans Symbols" w:hAnsi="Noto Sans Symbols" w:eastAsia="Noto Sans Symbols" w:cs="Noto Sans Symbols"/>
+        <w:rFonts w:ascii="Noto Sans Symbols" w:eastAsia="Noto Sans Symbols" w:hAnsi="Noto Sans Symbols" w:cs="Noto Sans Symbols"/>
         <w:sz w:val="16"/>
         <w:szCs w:val="16"/>
         <w:vertAlign w:val="baseline"/>
@@ -5040,7 +4697,7 @@
         <w:ind w:left="720" w:hanging="360"/>
       </w:pPr>
       <w:rPr>
-        <w:rFonts w:ascii="Courier New" w:hAnsi="Courier New" w:eastAsia="Courier New" w:cs="Courier New"/>
+        <w:rFonts w:ascii="Courier New" w:eastAsia="Courier New" w:hAnsi="Courier New" w:cs="Courier New"/>
         <w:vertAlign w:val="baseline"/>
       </w:rPr>
     </w:lvl>
@@ -5053,7 +4710,7 @@
         <w:ind w:left="1080" w:hanging="360"/>
       </w:pPr>
       <w:rPr>
-        <w:rFonts w:ascii="Noto Sans Symbols" w:hAnsi="Noto Sans Symbols" w:eastAsia="Noto Sans Symbols" w:cs="Noto Sans Symbols"/>
+        <w:rFonts w:ascii="Noto Sans Symbols" w:eastAsia="Noto Sans Symbols" w:hAnsi="Noto Sans Symbols" w:cs="Noto Sans Symbols"/>
         <w:vertAlign w:val="baseline"/>
       </w:rPr>
     </w:lvl>
@@ -5066,7 +4723,7 @@
         <w:ind w:left="1440" w:hanging="360"/>
       </w:pPr>
       <w:rPr>
-        <w:rFonts w:ascii="Noto Sans Symbols" w:hAnsi="Noto Sans Symbols" w:eastAsia="Noto Sans Symbols" w:cs="Noto Sans Symbols"/>
+        <w:rFonts w:ascii="Noto Sans Symbols" w:eastAsia="Noto Sans Symbols" w:hAnsi="Noto Sans Symbols" w:cs="Noto Sans Symbols"/>
         <w:vertAlign w:val="baseline"/>
       </w:rPr>
     </w:lvl>
@@ -5079,7 +4736,7 @@
         <w:ind w:left="1800" w:hanging="360"/>
       </w:pPr>
       <w:rPr>
-        <w:rFonts w:ascii="Courier New" w:hAnsi="Courier New" w:eastAsia="Courier New" w:cs="Courier New"/>
+        <w:rFonts w:ascii="Courier New" w:eastAsia="Courier New" w:hAnsi="Courier New" w:cs="Courier New"/>
         <w:vertAlign w:val="baseline"/>
       </w:rPr>
     </w:lvl>
@@ -5092,7 +4749,7 @@
         <w:ind w:left="2160" w:hanging="360"/>
       </w:pPr>
       <w:rPr>
-        <w:rFonts w:ascii="Noto Sans Symbols" w:hAnsi="Noto Sans Symbols" w:eastAsia="Noto Sans Symbols" w:cs="Noto Sans Symbols"/>
+        <w:rFonts w:ascii="Noto Sans Symbols" w:eastAsia="Noto Sans Symbols" w:hAnsi="Noto Sans Symbols" w:cs="Noto Sans Symbols"/>
         <w:vertAlign w:val="baseline"/>
       </w:rPr>
     </w:lvl>
@@ -5105,7 +4762,7 @@
         <w:ind w:left="2520" w:hanging="360"/>
       </w:pPr>
       <w:rPr>
-        <w:rFonts w:ascii="Noto Sans Symbols" w:hAnsi="Noto Sans Symbols" w:eastAsia="Noto Sans Symbols" w:cs="Noto Sans Symbols"/>
+        <w:rFonts w:ascii="Noto Sans Symbols" w:eastAsia="Noto Sans Symbols" w:hAnsi="Noto Sans Symbols" w:cs="Noto Sans Symbols"/>
         <w:vertAlign w:val="baseline"/>
       </w:rPr>
     </w:lvl>
@@ -5118,7 +4775,7 @@
         <w:ind w:left="2880" w:hanging="360"/>
       </w:pPr>
       <w:rPr>
-        <w:rFonts w:ascii="Courier New" w:hAnsi="Courier New" w:eastAsia="Courier New" w:cs="Courier New"/>
+        <w:rFonts w:ascii="Courier New" w:eastAsia="Courier New" w:hAnsi="Courier New" w:cs="Courier New"/>
         <w:vertAlign w:val="baseline"/>
       </w:rPr>
     </w:lvl>
@@ -5131,12 +4788,12 @@
         <w:ind w:left="3240" w:hanging="360"/>
       </w:pPr>
       <w:rPr>
-        <w:rFonts w:ascii="Noto Sans Symbols" w:hAnsi="Noto Sans Symbols" w:eastAsia="Noto Sans Symbols" w:cs="Noto Sans Symbols"/>
+        <w:rFonts w:ascii="Noto Sans Symbols" w:eastAsia="Noto Sans Symbols" w:hAnsi="Noto Sans Symbols" w:cs="Noto Sans Symbols"/>
         <w:vertAlign w:val="baseline"/>
       </w:rPr>
     </w:lvl>
   </w:abstractNum>
-  <w:abstractNum w:abstractNumId="10" w15:restartNumberingAfterBreak="0">
+  <w:abstractNum w:abstractNumId="11" w15:restartNumberingAfterBreak="0">
     <w:nsid w:val="7074FC2B"/>
     <w:multiLevelType w:val="hybridMultilevel"/>
     <w:tmpl w:val="FB8A8910"/>
@@ -5149,7 +4806,7 @@
         <w:ind w:left="720" w:hanging="360"/>
       </w:pPr>
       <w:rPr>
-        <w:rFonts w:hint="default" w:ascii="Symbol" w:hAnsi="Symbol"/>
+        <w:rFonts w:ascii="Symbol" w:hAnsi="Symbol" w:hint="default"/>
       </w:rPr>
     </w:lvl>
     <w:lvl w:ilvl="1" w:tplc="1D9EB3A0">
@@ -5161,7 +4818,7 @@
         <w:ind w:left="1440" w:hanging="360"/>
       </w:pPr>
       <w:rPr>
-        <w:rFonts w:hint="default" w:ascii="Courier New" w:hAnsi="Courier New"/>
+        <w:rFonts w:ascii="Courier New" w:hAnsi="Courier New" w:hint="default"/>
       </w:rPr>
     </w:lvl>
     <w:lvl w:ilvl="2" w:tplc="AFD05974">
@@ -5173,7 +4830,7 @@
         <w:ind w:left="2160" w:hanging="360"/>
       </w:pPr>
       <w:rPr>
-        <w:rFonts w:hint="default" w:ascii="Wingdings" w:hAnsi="Wingdings"/>
+        <w:rFonts w:ascii="Wingdings" w:hAnsi="Wingdings" w:hint="default"/>
       </w:rPr>
     </w:lvl>
     <w:lvl w:ilvl="3" w:tplc="1BE09FEE">
@@ -5185,7 +4842,7 @@
         <w:ind w:left="2880" w:hanging="360"/>
       </w:pPr>
       <w:rPr>
-        <w:rFonts w:hint="default" w:ascii="Symbol" w:hAnsi="Symbol"/>
+        <w:rFonts w:ascii="Symbol" w:hAnsi="Symbol" w:hint="default"/>
       </w:rPr>
     </w:lvl>
     <w:lvl w:ilvl="4" w:tplc="D80A9586">
@@ -5197,7 +4854,7 @@
         <w:ind w:left="3600" w:hanging="360"/>
       </w:pPr>
       <w:rPr>
-        <w:rFonts w:hint="default" w:ascii="Courier New" w:hAnsi="Courier New"/>
+        <w:rFonts w:ascii="Courier New" w:hAnsi="Courier New" w:hint="default"/>
       </w:rPr>
     </w:lvl>
     <w:lvl w:ilvl="5" w:tplc="CD027E82">
@@ -5209,7 +4866,7 @@
         <w:ind w:left="4320" w:hanging="360"/>
       </w:pPr>
       <w:rPr>
-        <w:rFonts w:hint="default" w:ascii="Wingdings" w:hAnsi="Wingdings"/>
+        <w:rFonts w:ascii="Wingdings" w:hAnsi="Wingdings" w:hint="default"/>
       </w:rPr>
     </w:lvl>
     <w:lvl w:ilvl="6" w:tplc="AA10C73A">
@@ -5221,7 +4878,7 @@
         <w:ind w:left="5040" w:hanging="360"/>
       </w:pPr>
       <w:rPr>
-        <w:rFonts w:hint="default" w:ascii="Symbol" w:hAnsi="Symbol"/>
+        <w:rFonts w:ascii="Symbol" w:hAnsi="Symbol" w:hint="default"/>
       </w:rPr>
     </w:lvl>
     <w:lvl w:ilvl="7" w:tplc="9C0C09B2">
@@ -5233,7 +4890,7 @@
         <w:ind w:left="5760" w:hanging="360"/>
       </w:pPr>
       <w:rPr>
-        <w:rFonts w:hint="default" w:ascii="Courier New" w:hAnsi="Courier New"/>
+        <w:rFonts w:ascii="Courier New" w:hAnsi="Courier New" w:hint="default"/>
       </w:rPr>
     </w:lvl>
     <w:lvl w:ilvl="8" w:tplc="444C947E">
@@ -5245,11 +4902,11 @@
         <w:ind w:left="6480" w:hanging="360"/>
       </w:pPr>
       <w:rPr>
-        <w:rFonts w:hint="default" w:ascii="Wingdings" w:hAnsi="Wingdings"/>
+        <w:rFonts w:ascii="Wingdings" w:hAnsi="Wingdings" w:hint="default"/>
       </w:rPr>
     </w:lvl>
   </w:abstractNum>
-  <w:abstractNum w:abstractNumId="11" w15:restartNumberingAfterBreak="0">
+  <w:abstractNum w:abstractNumId="12" w15:restartNumberingAfterBreak="0">
     <w:nsid w:val="76FB4369"/>
     <w:multiLevelType w:val="multilevel"/>
     <w:tmpl w:val="FFFFFFFF"/>
@@ -5338,43 +4995,43 @@
       </w:pPr>
     </w:lvl>
   </w:abstractNum>
-  <w:num w:numId="13">
+  <w:num w:numId="1" w16cid:durableId="245118704">
+    <w:abstractNumId w:val="9"/>
+  </w:num>
+  <w:num w:numId="2" w16cid:durableId="1818916367">
+    <w:abstractNumId w:val="11"/>
+  </w:num>
+  <w:num w:numId="3" w16cid:durableId="234903653">
+    <w:abstractNumId w:val="4"/>
+  </w:num>
+  <w:num w:numId="4" w16cid:durableId="603811037">
+    <w:abstractNumId w:val="7"/>
+  </w:num>
+  <w:num w:numId="5" w16cid:durableId="1787384540">
+    <w:abstractNumId w:val="8"/>
+  </w:num>
+  <w:num w:numId="6" w16cid:durableId="356273195">
+    <w:abstractNumId w:val="2"/>
+  </w:num>
+  <w:num w:numId="7" w16cid:durableId="1796487185">
+    <w:abstractNumId w:val="1"/>
+  </w:num>
+  <w:num w:numId="8" w16cid:durableId="1575772169">
     <w:abstractNumId w:val="12"/>
   </w:num>
-  <w:num w:numId="1" w16cid:durableId="1818916367">
+  <w:num w:numId="9" w16cid:durableId="42682786">
+    <w:abstractNumId w:val="3"/>
+  </w:num>
+  <w:num w:numId="10" w16cid:durableId="2013025540">
+    <w:abstractNumId w:val="5"/>
+  </w:num>
+  <w:num w:numId="11" w16cid:durableId="102774233">
+    <w:abstractNumId w:val="6"/>
+  </w:num>
+  <w:num w:numId="12" w16cid:durableId="535777752">
     <w:abstractNumId w:val="10"/>
   </w:num>
-  <w:num w:numId="2" w16cid:durableId="234903653">
-    <w:abstractNumId w:val="4"/>
-  </w:num>
-  <w:num w:numId="3" w16cid:durableId="603811037">
-    <w:abstractNumId w:val="7"/>
-  </w:num>
-  <w:num w:numId="4" w16cid:durableId="1787384540">
-    <w:abstractNumId w:val="8"/>
-  </w:num>
-  <w:num w:numId="5" w16cid:durableId="356273195">
-    <w:abstractNumId w:val="2"/>
-  </w:num>
-  <w:num w:numId="6" w16cid:durableId="1796487185">
-    <w:abstractNumId w:val="1"/>
-  </w:num>
-  <w:num w:numId="7" w16cid:durableId="1575772169">
-    <w:abstractNumId w:val="11"/>
-  </w:num>
-  <w:num w:numId="8" w16cid:durableId="42682786">
-    <w:abstractNumId w:val="3"/>
-  </w:num>
-  <w:num w:numId="9" w16cid:durableId="2013025540">
-    <w:abstractNumId w:val="5"/>
-  </w:num>
-  <w:num w:numId="10" w16cid:durableId="102774233">
-    <w:abstractNumId w:val="6"/>
-  </w:num>
-  <w:num w:numId="11" w16cid:durableId="535777752">
-    <w:abstractNumId w:val="9"/>
-  </w:num>
-  <w:num w:numId="12" w16cid:durableId="657735870">
+  <w:num w:numId="13" w16cid:durableId="657735870">
     <w:abstractNumId w:val="0"/>
   </w:num>
 </w:numbering>
@@ -5385,7 +5042,7 @@
   <w:docDefaults>
     <w:rPrDefault>
       <w:rPr>
-        <w:rFonts w:ascii="Times New Roman" w:hAnsi="Times New Roman" w:eastAsia="Times New Roman" w:cs="Times New Roman"/>
+        <w:rFonts w:ascii="Times New Roman" w:eastAsia="Times New Roman" w:hAnsi="Times New Roman" w:cs="Times New Roman"/>
         <w:sz w:val="24"/>
         <w:szCs w:val="24"/>
         <w:lang w:val="es" w:eastAsia="ja-JP" w:bidi="ar-SA"/>
@@ -5400,14 +5057,14 @@
   <w:latentStyles w:defLockedState="0" w:defUIPriority="99" w:defSemiHidden="0" w:defUnhideWhenUsed="0" w:defQFormat="0" w:count="376">
     <w:lsdException w:name="Normal" w:uiPriority="0" w:qFormat="1"/>
     <w:lsdException w:name="heading 1" w:uiPriority="9" w:qFormat="1"/>
-    <w:lsdException w:name="heading 2" w:uiPriority="9" w:semiHidden="1" w:unhideWhenUsed="1" w:qFormat="1"/>
-    <w:lsdException w:name="heading 3" w:uiPriority="9" w:semiHidden="1" w:unhideWhenUsed="1" w:qFormat="1"/>
-    <w:lsdException w:name="heading 4" w:uiPriority="9" w:semiHidden="1" w:unhideWhenUsed="1" w:qFormat="1"/>
-    <w:lsdException w:name="heading 5" w:uiPriority="9" w:semiHidden="1" w:unhideWhenUsed="1" w:qFormat="1"/>
-    <w:lsdException w:name="heading 6" w:uiPriority="9" w:semiHidden="1" w:unhideWhenUsed="1" w:qFormat="1"/>
-    <w:lsdException w:name="heading 7" w:uiPriority="9" w:semiHidden="1" w:unhideWhenUsed="1" w:qFormat="1"/>
-    <w:lsdException w:name="heading 8" w:uiPriority="9" w:semiHidden="1" w:unhideWhenUsed="1" w:qFormat="1"/>
-    <w:lsdException w:name="heading 9" w:uiPriority="9" w:semiHidden="1" w:unhideWhenUsed="1" w:qFormat="1"/>
+    <w:lsdException w:name="heading 2" w:semiHidden="1" w:uiPriority="9" w:unhideWhenUsed="1" w:qFormat="1"/>
+    <w:lsdException w:name="heading 3" w:semiHidden="1" w:uiPriority="9" w:unhideWhenUsed="1" w:qFormat="1"/>
+    <w:lsdException w:name="heading 4" w:semiHidden="1" w:uiPriority="9" w:unhideWhenUsed="1" w:qFormat="1"/>
+    <w:lsdException w:name="heading 5" w:semiHidden="1" w:uiPriority="9" w:unhideWhenUsed="1" w:qFormat="1"/>
+    <w:lsdException w:name="heading 6" w:semiHidden="1" w:uiPriority="9" w:unhideWhenUsed="1" w:qFormat="1"/>
+    <w:lsdException w:name="heading 7" w:semiHidden="1" w:uiPriority="9" w:unhideWhenUsed="1" w:qFormat="1"/>
+    <w:lsdException w:name="heading 8" w:semiHidden="1" w:uiPriority="9" w:unhideWhenUsed="1" w:qFormat="1"/>
+    <w:lsdException w:name="heading 9" w:semiHidden="1" w:uiPriority="9" w:unhideWhenUsed="1" w:qFormat="1"/>
     <w:lsdException w:name="index 1" w:semiHidden="1" w:unhideWhenUsed="1"/>
     <w:lsdException w:name="index 2" w:semiHidden="1" w:unhideWhenUsed="1"/>
     <w:lsdException w:name="index 3" w:semiHidden="1" w:unhideWhenUsed="1"/>
@@ -5417,22 +5074,22 @@
     <w:lsdException w:name="index 7" w:semiHidden="1" w:unhideWhenUsed="1"/>
     <w:lsdException w:name="index 8" w:semiHidden="1" w:unhideWhenUsed="1"/>
     <w:lsdException w:name="index 9" w:semiHidden="1" w:unhideWhenUsed="1"/>
-    <w:lsdException w:name="toc 1" w:uiPriority="39" w:semiHidden="1" w:unhideWhenUsed="1"/>
-    <w:lsdException w:name="toc 2" w:uiPriority="39" w:semiHidden="1" w:unhideWhenUsed="1"/>
-    <w:lsdException w:name="toc 3" w:uiPriority="39" w:semiHidden="1" w:unhideWhenUsed="1"/>
-    <w:lsdException w:name="toc 4" w:uiPriority="39" w:semiHidden="1" w:unhideWhenUsed="1"/>
-    <w:lsdException w:name="toc 5" w:uiPriority="39" w:semiHidden="1" w:unhideWhenUsed="1"/>
-    <w:lsdException w:name="toc 6" w:uiPriority="39" w:semiHidden="1" w:unhideWhenUsed="1"/>
-    <w:lsdException w:name="toc 7" w:uiPriority="39" w:semiHidden="1" w:unhideWhenUsed="1"/>
-    <w:lsdException w:name="toc 8" w:uiPriority="39" w:semiHidden="1" w:unhideWhenUsed="1"/>
-    <w:lsdException w:name="toc 9" w:uiPriority="39" w:semiHidden="1" w:unhideWhenUsed="1"/>
+    <w:lsdException w:name="toc 1" w:semiHidden="1" w:uiPriority="39" w:unhideWhenUsed="1"/>
+    <w:lsdException w:name="toc 2" w:semiHidden="1" w:uiPriority="39" w:unhideWhenUsed="1"/>
+    <w:lsdException w:name="toc 3" w:semiHidden="1" w:uiPriority="39" w:unhideWhenUsed="1"/>
+    <w:lsdException w:name="toc 4" w:semiHidden="1" w:uiPriority="39" w:unhideWhenUsed="1"/>
+    <w:lsdException w:name="toc 5" w:semiHidden="1" w:uiPriority="39" w:unhideWhenUsed="1"/>
+    <w:lsdException w:name="toc 6" w:semiHidden="1" w:uiPriority="39" w:unhideWhenUsed="1"/>
+    <w:lsdException w:name="toc 7" w:semiHidden="1" w:uiPriority="39" w:unhideWhenUsed="1"/>
+    <w:lsdException w:name="toc 8" w:semiHidden="1" w:uiPriority="39" w:unhideWhenUsed="1"/>
+    <w:lsdException w:name="toc 9" w:semiHidden="1" w:uiPriority="39" w:unhideWhenUsed="1"/>
     <w:lsdException w:name="Normal Indent" w:semiHidden="1" w:unhideWhenUsed="1"/>
     <w:lsdException w:name="footnote text" w:semiHidden="1" w:unhideWhenUsed="1"/>
     <w:lsdException w:name="annotation text" w:semiHidden="1" w:unhideWhenUsed="1"/>
     <w:lsdException w:name="header" w:semiHidden="1" w:unhideWhenUsed="1"/>
     <w:lsdException w:name="footer" w:semiHidden="1" w:unhideWhenUsed="1"/>
     <w:lsdException w:name="index heading" w:semiHidden="1" w:unhideWhenUsed="1"/>
-    <w:lsdException w:name="caption" w:uiPriority="35" w:semiHidden="1" w:unhideWhenUsed="1" w:qFormat="1"/>
+    <w:lsdException w:name="caption" w:semiHidden="1" w:uiPriority="35" w:unhideWhenUsed="1" w:qFormat="1"/>
     <w:lsdException w:name="table of figures" w:semiHidden="1" w:unhideWhenUsed="1"/>
     <w:lsdException w:name="envelope address" w:semiHidden="1" w:unhideWhenUsed="1"/>
     <w:lsdException w:name="envelope return" w:semiHidden="1" w:unhideWhenUsed="1"/>
@@ -5463,7 +5120,7 @@
     <w:lsdException w:name="Title" w:uiPriority="10" w:qFormat="1"/>
     <w:lsdException w:name="Closing" w:semiHidden="1" w:unhideWhenUsed="1"/>
     <w:lsdException w:name="Signature" w:semiHidden="1" w:unhideWhenUsed="1"/>
-    <w:lsdException w:name="Default Paragraph Font" w:uiPriority="1" w:semiHidden="1" w:unhideWhenUsed="1"/>
+    <w:lsdException w:name="Default Paragraph Font" w:semiHidden="1" w:uiPriority="1" w:unhideWhenUsed="1"/>
     <w:lsdException w:name="Body Text" w:semiHidden="1" w:unhideWhenUsed="1"/>
     <w:lsdException w:name="Body Text Indent" w:semiHidden="1" w:unhideWhenUsed="1"/>
     <w:lsdException w:name="List Continue" w:semiHidden="1" w:unhideWhenUsed="1"/>
@@ -5663,8 +5320,8 @@
     <w:lsdException w:name="Subtle Reference" w:uiPriority="31" w:qFormat="1"/>
     <w:lsdException w:name="Intense Reference" w:uiPriority="32" w:qFormat="1"/>
     <w:lsdException w:name="Book Title" w:uiPriority="33" w:qFormat="1"/>
-    <w:lsdException w:name="Bibliography" w:uiPriority="37" w:semiHidden="1" w:unhideWhenUsed="1"/>
-    <w:lsdException w:name="TOC Heading" w:uiPriority="39" w:semiHidden="1" w:unhideWhenUsed="1" w:qFormat="1"/>
+    <w:lsdException w:name="Bibliography" w:semiHidden="1" w:uiPriority="37" w:unhideWhenUsed="1"/>
+    <w:lsdException w:name="TOC Heading" w:semiHidden="1" w:uiPriority="39" w:unhideWhenUsed="1" w:qFormat="1"/>
     <w:lsdException w:name="Plain Table 1" w:uiPriority="41"/>
     <w:lsdException w:name="Plain Table 2" w:uiPriority="42"/>
     <w:lsdException w:name="Plain Table 3" w:uiPriority="43"/>
@@ -5775,11 +5432,11 @@
     <w:lsdException w:name="Unresolved Mention" w:semiHidden="1" w:unhideWhenUsed="1"/>
     <w:lsdException w:name="Smart Link" w:semiHidden="1" w:unhideWhenUsed="1"/>
   </w:latentStyles>
-  <w:style w:type="paragraph" w:styleId="Normal" w:default="1">
+  <w:style w:type="paragraph" w:default="1" w:styleId="Normal">
     <w:name w:val="Normal"/>
     <w:qFormat/>
   </w:style>
-  <w:style w:type="paragraph" w:styleId="Heading1">
+  <w:style w:type="paragraph" w:styleId="Ttulo1">
     <w:name w:val="heading 1"/>
     <w:basedOn w:val="Normal"/>
     <w:next w:val="Normal"/>
@@ -5798,7 +5455,7 @@
       <w:szCs w:val="32"/>
     </w:rPr>
   </w:style>
-  <w:style w:type="paragraph" w:styleId="Heading2">
+  <w:style w:type="paragraph" w:styleId="Ttulo2">
     <w:name w:val="heading 2"/>
     <w:basedOn w:val="Normal"/>
     <w:next w:val="Normal"/>
@@ -5819,7 +5476,7 @@
       <w:szCs w:val="28"/>
     </w:rPr>
   </w:style>
-  <w:style w:type="paragraph" w:styleId="Heading3">
+  <w:style w:type="paragraph" w:styleId="Ttulo3">
     <w:name w:val="heading 3"/>
     <w:basedOn w:val="Normal"/>
     <w:next w:val="Normal"/>
@@ -5838,7 +5495,7 @@
       <w:smallCaps/>
     </w:rPr>
   </w:style>
-  <w:style w:type="paragraph" w:styleId="Heading4">
+  <w:style w:type="paragraph" w:styleId="Ttulo4">
     <w:name w:val="heading 4"/>
     <w:basedOn w:val="Normal"/>
     <w:next w:val="Normal"/>
@@ -5859,7 +5516,7 @@
       <w:szCs w:val="28"/>
     </w:rPr>
   </w:style>
-  <w:style w:type="paragraph" w:styleId="Heading5">
+  <w:style w:type="paragraph" w:styleId="Ttulo5">
     <w:name w:val="heading 5"/>
     <w:basedOn w:val="Normal"/>
     <w:next w:val="Normal"/>
@@ -5879,7 +5536,7 @@
       <w:u w:val="single"/>
     </w:rPr>
   </w:style>
-  <w:style w:type="paragraph" w:styleId="Heading6">
+  <w:style w:type="paragraph" w:styleId="Ttulo6">
     <w:name w:val="heading 6"/>
     <w:basedOn w:val="Normal"/>
     <w:next w:val="Normal"/>
@@ -5892,20 +5549,20 @@
       <w:outlineLvl w:val="5"/>
     </w:pPr>
     <w:rPr>
-      <w:rFonts w:ascii="Calibri" w:hAnsi="Calibri" w:eastAsia="Calibri" w:cs="Calibri"/>
+      <w:rFonts w:ascii="Calibri" w:eastAsia="Calibri" w:hAnsi="Calibri" w:cs="Calibri"/>
       <w:b/>
       <w:bCs/>
       <w:sz w:val="22"/>
       <w:szCs w:val="22"/>
     </w:rPr>
   </w:style>
-  <w:style w:type="character" w:styleId="DefaultParagraphFont" w:default="1">
+  <w:style w:type="character" w:default="1" w:styleId="Fuentedeprrafopredeter">
     <w:name w:val="Default Paragraph Font"/>
     <w:uiPriority w:val="1"/>
     <w:semiHidden/>
     <w:unhideWhenUsed/>
   </w:style>
-  <w:style w:type="table" w:styleId="TableNormal" w:default="1">
+  <w:style w:type="table" w:default="1" w:styleId="Tablanormal">
     <w:name w:val="Normal Table"/>
     <w:uiPriority w:val="99"/>
     <w:semiHidden/>
@@ -5920,13 +5577,13 @@
       </w:tblCellMar>
     </w:tblPr>
   </w:style>
-  <w:style w:type="numbering" w:styleId="NoList" w:default="1">
+  <w:style w:type="numbering" w:default="1" w:styleId="Sinlista">
     <w:name w:val="No List"/>
     <w:uiPriority w:val="99"/>
     <w:semiHidden/>
     <w:unhideWhenUsed/>
   </w:style>
-  <w:style w:type="table" w:styleId="TableNormal0" w:customStyle="1">
+  <w:style w:type="table" w:customStyle="1" w:styleId="TableNormal">
     <w:name w:val="TableNormal"/>
     <w:tblPr>
       <w:tblCellMar>
@@ -5937,7 +5594,7 @@
       </w:tblCellMar>
     </w:tblPr>
   </w:style>
-  <w:style w:type="paragraph" w:styleId="Title">
+  <w:style w:type="paragraph" w:styleId="Ttulo">
     <w:name w:val="Title"/>
     <w:basedOn w:val="Normal"/>
     <w:next w:val="Normal"/>
@@ -5948,14 +5605,14 @@
       <w:jc w:val="center"/>
     </w:pPr>
     <w:rPr>
-      <w:rFonts w:ascii="Cambria" w:hAnsi="Cambria" w:eastAsia="Cambria" w:cs="Cambria"/>
+      <w:rFonts w:ascii="Cambria" w:eastAsia="Cambria" w:hAnsi="Cambria" w:cs="Cambria"/>
       <w:b/>
       <w:bCs/>
       <w:sz w:val="32"/>
       <w:szCs w:val="32"/>
     </w:rPr>
   </w:style>
-  <w:style w:type="paragraph" w:styleId="Subtitle">
+  <w:style w:type="paragraph" w:styleId="Subttulo">
     <w:name w:val="Subtitle"/>
     <w:basedOn w:val="Normal"/>
     <w:next w:val="Normal"/>
@@ -5967,7 +5624,7 @@
       <w:spacing w:before="360" w:after="80"/>
     </w:pPr>
     <w:rPr>
-      <w:rFonts w:ascii="Georgia" w:hAnsi="Georgia" w:eastAsia="Georgia" w:cs="Georgia"/>
+      <w:rFonts w:ascii="Georgia" w:eastAsia="Georgia" w:hAnsi="Georgia" w:cs="Georgia"/>
       <w:i/>
       <w:iCs/>
       <w:color w:val="666666"/>
@@ -5975,8 +5632,8 @@
       <w:szCs w:val="48"/>
     </w:rPr>
   </w:style>
-  <w:style w:type="table" w:styleId="a" w:customStyle="1">
-    <w:basedOn w:val="TableNormal0"/>
+  <w:style w:type="table" w:customStyle="1" w:styleId="a">
+    <w:basedOn w:val="TableNormal"/>
     <w:tblPr>
       <w:tblStyleRowBandSize w:val="1"/>
       <w:tblStyleColBandSize w:val="1"/>
@@ -5988,8 +5645,8 @@
       </w:tblCellMar>
     </w:tblPr>
   </w:style>
-  <w:style w:type="table" w:styleId="a0" w:customStyle="1">
-    <w:basedOn w:val="TableNormal0"/>
+  <w:style w:type="table" w:customStyle="1" w:styleId="a0">
+    <w:basedOn w:val="TableNormal"/>
     <w:tblPr>
       <w:tblStyleRowBandSize w:val="1"/>
       <w:tblStyleColBandSize w:val="1"/>
@@ -6001,8 +5658,8 @@
       </w:tblCellMar>
     </w:tblPr>
   </w:style>
-  <w:style w:type="table" w:styleId="a1" w:customStyle="1">
-    <w:basedOn w:val="TableNormal0"/>
+  <w:style w:type="table" w:customStyle="1" w:styleId="a1">
+    <w:basedOn w:val="TableNormal"/>
     <w:tblPr>
       <w:tblStyleRowBandSize w:val="1"/>
       <w:tblStyleColBandSize w:val="1"/>
@@ -6014,8 +5671,8 @@
       </w:tblCellMar>
     </w:tblPr>
   </w:style>
-  <w:style w:type="table" w:styleId="a2" w:customStyle="1">
-    <w:basedOn w:val="TableNormal0"/>
+  <w:style w:type="table" w:customStyle="1" w:styleId="a2">
+    <w:basedOn w:val="TableNormal"/>
     <w:tblPr>
       <w:tblStyleRowBandSize w:val="1"/>
       <w:tblStyleColBandSize w:val="1"/>
@@ -6027,8 +5684,8 @@
       </w:tblCellMar>
     </w:tblPr>
   </w:style>
-  <w:style w:type="table" w:styleId="a3" w:customStyle="1">
-    <w:basedOn w:val="TableNormal0"/>
+  <w:style w:type="table" w:customStyle="1" w:styleId="a3">
+    <w:basedOn w:val="TableNormal"/>
     <w:tblPr>
       <w:tblStyleRowBandSize w:val="1"/>
       <w:tblStyleColBandSize w:val="1"/>
@@ -6040,8 +5697,8 @@
       </w:tblCellMar>
     </w:tblPr>
   </w:style>
-  <w:style w:type="table" w:styleId="a4" w:customStyle="1">
-    <w:basedOn w:val="TableNormal0"/>
+  <w:style w:type="table" w:customStyle="1" w:styleId="a4">
+    <w:basedOn w:val="TableNormal"/>
     <w:tblPr>
       <w:tblStyleRowBandSize w:val="1"/>
       <w:tblStyleColBandSize w:val="1"/>
@@ -6053,8 +5710,8 @@
       </w:tblCellMar>
     </w:tblPr>
   </w:style>
-  <w:style w:type="table" w:styleId="a5" w:customStyle="1">
-    <w:basedOn w:val="TableNormal0"/>
+  <w:style w:type="table" w:customStyle="1" w:styleId="a5">
+    <w:basedOn w:val="TableNormal"/>
     <w:tblPr>
       <w:tblStyleRowBandSize w:val="1"/>
       <w:tblStyleColBandSize w:val="1"/>
@@ -6066,8 +5723,8 @@
       </w:tblCellMar>
     </w:tblPr>
   </w:style>
-  <w:style w:type="table" w:styleId="a6" w:customStyle="1">
-    <w:basedOn w:val="TableNormal0"/>
+  <w:style w:type="table" w:customStyle="1" w:styleId="a6">
+    <w:basedOn w:val="TableNormal"/>
     <w:tblPr>
       <w:tblStyleRowBandSize w:val="1"/>
       <w:tblStyleColBandSize w:val="1"/>
@@ -6079,8 +5736,8 @@
       </w:tblCellMar>
     </w:tblPr>
   </w:style>
-  <w:style w:type="table" w:styleId="a7" w:customStyle="1">
-    <w:basedOn w:val="TableNormal0"/>
+  <w:style w:type="table" w:customStyle="1" w:styleId="a7">
+    <w:basedOn w:val="TableNormal"/>
     <w:tblPr>
       <w:tblStyleRowBandSize w:val="1"/>
       <w:tblStyleColBandSize w:val="1"/>
@@ -6092,8 +5749,8 @@
       </w:tblCellMar>
     </w:tblPr>
   </w:style>
-  <w:style w:type="table" w:styleId="a8" w:customStyle="1">
-    <w:basedOn w:val="TableNormal0"/>
+  <w:style w:type="table" w:customStyle="1" w:styleId="a8">
+    <w:basedOn w:val="TableNormal"/>
     <w:tblPr>
       <w:tblStyleRowBandSize w:val="1"/>
       <w:tblStyleColBandSize w:val="1"/>
@@ -6105,8 +5762,8 @@
       </w:tblCellMar>
     </w:tblPr>
   </w:style>
-  <w:style w:type="table" w:styleId="a9" w:customStyle="1">
-    <w:basedOn w:val="TableNormal0"/>
+  <w:style w:type="table" w:customStyle="1" w:styleId="a9">
+    <w:basedOn w:val="TableNormal"/>
     <w:tblPr>
       <w:tblStyleRowBandSize w:val="1"/>
       <w:tblStyleColBandSize w:val="1"/>
@@ -6118,8 +5775,8 @@
       </w:tblCellMar>
     </w:tblPr>
   </w:style>
-  <w:style w:type="table" w:styleId="aa" w:customStyle="1">
-    <w:basedOn w:val="TableNormal0"/>
+  <w:style w:type="table" w:customStyle="1" w:styleId="aa">
+    <w:basedOn w:val="TableNormal"/>
     <w:tblPr>
       <w:tblStyleRowBandSize w:val="1"/>
       <w:tblStyleColBandSize w:val="1"/>
@@ -6131,8 +5788,8 @@
       </w:tblCellMar>
     </w:tblPr>
   </w:style>
-  <w:style w:type="table" w:styleId="ab" w:customStyle="1">
-    <w:basedOn w:val="TableNormal0"/>
+  <w:style w:type="table" w:customStyle="1" w:styleId="ab">
+    <w:basedOn w:val="TableNormal"/>
     <w:tblPr>
       <w:tblStyleRowBandSize w:val="1"/>
       <w:tblStyleColBandSize w:val="1"/>
@@ -6144,7 +5801,7 @@
       </w:tblCellMar>
     </w:tblPr>
   </w:style>
-  <w:style w:type="paragraph" w:styleId="ListParagraph">
+  <w:style w:type="paragraph" w:styleId="Prrafodelista">
     <w:name w:val="List Paragraph"/>
     <w:basedOn w:val="Normal"/>
     <w:uiPriority w:val="34"/>
@@ -6155,9 +5812,9 @@
       <w:contextualSpacing/>
     </w:pPr>
   </w:style>
-  <w:style w:type="table" w:styleId="TableGrid">
+  <w:style w:type="table" w:styleId="Tablaconcuadrcula">
     <w:name w:val="Table Grid"/>
-    <w:basedOn w:val="TableNormal"/>
+    <w:basedOn w:val="Tablanormal"/>
     <w:uiPriority w:val="59"/>
     <w:rsid w:val="00FB4123"/>
     <w:pPr>
@@ -6165,19 +5822,19 @@
     </w:pPr>
     <w:tblPr>
       <w:tblBorders>
-        <w:top w:val="single" w:color="000000" w:themeColor="text1" w:sz="4" w:space="0"/>
-        <w:left w:val="single" w:color="000000" w:themeColor="text1" w:sz="4" w:space="0"/>
-        <w:bottom w:val="single" w:color="000000" w:themeColor="text1" w:sz="4" w:space="0"/>
-        <w:right w:val="single" w:color="000000" w:themeColor="text1" w:sz="4" w:space="0"/>
-        <w:insideH w:val="single" w:color="000000" w:themeColor="text1" w:sz="4" w:space="0"/>
-        <w:insideV w:val="single" w:color="000000" w:themeColor="text1" w:sz="4" w:space="0"/>
+        <w:top w:val="single" w:sz="4" w:space="0" w:color="000000" w:themeColor="text1"/>
+        <w:left w:val="single" w:sz="4" w:space="0" w:color="000000" w:themeColor="text1"/>
+        <w:bottom w:val="single" w:sz="4" w:space="0" w:color="000000" w:themeColor="text1"/>
+        <w:right w:val="single" w:sz="4" w:space="0" w:color="000000" w:themeColor="text1"/>
+        <w:insideH w:val="single" w:sz="4" w:space="0" w:color="000000" w:themeColor="text1"/>
+        <w:insideV w:val="single" w:sz="4" w:space="0" w:color="000000" w:themeColor="text1"/>
       </w:tblBorders>
     </w:tblPr>
   </w:style>
-  <w:style w:type="paragraph" w:styleId="Footer">
+  <w:style w:type="paragraph" w:styleId="Piedepgina">
     <w:name w:val="footer"/>
     <w:basedOn w:val="Normal"/>
-    <w:link w:val="FooterChar"/>
+    <w:link w:val="PiedepginaCar"/>
     <w:uiPriority w:val="99"/>
     <w:unhideWhenUsed/>
     <w:rsid w:val="00884888"/>
@@ -6189,25 +5846,25 @@
       <w:spacing w:before="0" w:after="0"/>
     </w:pPr>
   </w:style>
-  <w:style w:type="character" w:styleId="FooterChar" w:customStyle="1">
-    <w:name w:val="Footer Char"/>
-    <w:basedOn w:val="DefaultParagraphFont"/>
-    <w:link w:val="Footer"/>
+  <w:style w:type="character" w:customStyle="1" w:styleId="PiedepginaCar">
+    <w:name w:val="Pie de página Car"/>
+    <w:basedOn w:val="Fuentedeprrafopredeter"/>
+    <w:link w:val="Piedepgina"/>
     <w:uiPriority w:val="99"/>
     <w:rsid w:val="00884888"/>
   </w:style>
-  <w:style w:type="paragraph" w:styleId="Header">
-    <w:uiPriority w:val="99"/>
+  <w:style w:type="paragraph" w:styleId="Encabezado">
     <w:name w:val="header"/>
     <w:basedOn w:val="Normal"/>
+    <w:uiPriority w:val="99"/>
     <w:unhideWhenUsed/>
     <w:rsid w:val="1C4B2977"/>
     <w:pPr>
       <w:tabs>
-        <w:tab w:val="center" w:leader="none" w:pos="4680"/>
-        <w:tab w:val="right" w:leader="none" w:pos="9360"/>
+        <w:tab w:val="center" w:pos="4680"/>
+        <w:tab w:val="right" w:pos="9360"/>
       </w:tabs>
-      <w:spacing w:after="0" w:line="240" w:lineRule="auto"/>
+      <w:spacing w:after="0"/>
     </w:pPr>
   </w:style>
 </w:styles>

</xml_diff>